<commit_message>
Document Vivado results and fix board constraints
</commit_message>
<xml_diff>
--- a/paper/VHDL_Implementation_of_NIST_Ascon_AEAD128_on_a_Nexys_A7_FPGA.docx
+++ b/paper/VHDL_Implementation_of_NIST_Ascon_AEAD128_on_a_Nexys_A7_FPGA.docx
@@ -56,7 +56,7 @@
         <w:jc w:val="both"/>
       </w:pPr>
       <w:r>
-        <w:t>This paper describes a VHDL-2008 implementation of the standardized NIST Ascon-AEAD128 algorithm for a Nexys A7 100T FPGA. The design uses one shared 320-bit permutation datapath and completes one Ascon round per clock cycle. A 128-bit streaming interface accepts associated data and payload bytes, including empty and partial blocks. Encryption returns ciphertext and a tag. Decryption returns tentative plaintext and releases it only after tag verification. The portable test flow passed all 1,089 official known-answer vectors in both directions with GHDL. Generated Verilog was also checked with Icarus Verilog and Verilator. Vivado scripts, a TextIO testbench, constraints, and a switch-and-LED demonstration are included. Vivado implementation measurements remain pending because Vivado is not available on the Mac used for this stage of the work.</w:t>
+        <w:t>This paper describes a VHDL-2008 implementation of the standardized NIST Ascon-AEAD128 algorithm for a Nexys A7 100T FPGA. The design uses one shared 320-bit permutation datapath and completes one Ascon round per clock cycle. A 128-bit streaming interface accepts associated data and payload bytes, including empty and partial blocks. Encryption returns ciphertext and a tag. Decryption returns tentative plaintext and releases it only after tag verification. The portable test flow passed all 1,089 official known-answer vectors in both directions with GHDL and Vivado XSim. Generated Verilog was also checked with Icarus Verilog and Verilator. Vivado 2023.2 completed synthesis, placement, routing, timing analysis, and bitstream generation. Vivado used 1717 slice LUTs and 1372 slice registers, with no block RAM. The routed design met the 100 MHz constraint with 2.941 ns worst setup slack. Vivado estimated 0.137 W total on-chip power and generated the FPGA bitstream. Physical board programming and demonstration testing remain pending.</w:t>
       </w:r>
     </w:p>
     <w:p>
@@ -926,7 +926,7 @@
               <w:rPr>
                 <w:sz w:val="16"/>
               </w:rPr>
-              <w:t>GHDL TextIO bench</w:t>
+              <w:t>GHDL TextIO</w:t>
             </w:r>
           </w:p>
         </w:tc>
@@ -999,6 +999,104 @@
                 <w:sz w:val="16"/>
               </w:rPr>
               <w:t>two output text files</w:t>
+            </w:r>
+          </w:p>
+        </w:tc>
+      </w:tr>
+      <w:tr>
+        <w:tc>
+          <w:tcPr>
+            <w:tcW w:type="dxa" w:w="2952"/>
+            <w:vAlign w:val="center"/>
+            <w:tcBorders>
+              <w:top w:val="single" w:sz="5" w:color="000000"/>
+              <w:bottom w:val="single" w:sz="5" w:color="000000"/>
+              <w:left w:val="single" w:sz="5" w:color="000000"/>
+              <w:right w:val="single" w:sz="5" w:color="000000"/>
+            </w:tcBorders>
+          </w:tcPr>
+          <w:p>
+            <w:pPr>
+              <w:spacing w:after="0"/>
+              <w:jc w:val="left"/>
+            </w:pPr>
+            <w:r>
+              <w:rPr>
+                <w:sz w:val="16"/>
+              </w:rPr>
+              <w:t>Vivado XSim</w:t>
+            </w:r>
+          </w:p>
+        </w:tc>
+        <w:tc>
+          <w:tcPr>
+            <w:tcW w:type="dxa" w:w="2088"/>
+            <w:vAlign w:val="center"/>
+            <w:tcBorders>
+              <w:top w:val="single" w:sz="5" w:color="000000"/>
+              <w:bottom w:val="single" w:sz="5" w:color="000000"/>
+              <w:left w:val="single" w:sz="5" w:color="000000"/>
+              <w:right w:val="single" w:sz="5" w:color="000000"/>
+            </w:tcBorders>
+          </w:tcPr>
+          <w:p>
+            <w:pPr>
+              <w:spacing w:after="0"/>
+              <w:jc w:val="center"/>
+            </w:pPr>
+            <w:r>
+              <w:rPr>
+                <w:sz w:val="16"/>
+              </w:rPr>
+              <w:t>1,089 × 2</w:t>
+            </w:r>
+          </w:p>
+        </w:tc>
+        <w:tc>
+          <w:tcPr>
+            <w:tcW w:type="dxa" w:w="1800"/>
+            <w:vAlign w:val="center"/>
+            <w:tcBorders>
+              <w:top w:val="single" w:sz="5" w:color="000000"/>
+              <w:bottom w:val="single" w:sz="5" w:color="000000"/>
+              <w:left w:val="single" w:sz="5" w:color="000000"/>
+              <w:right w:val="single" w:sz="5" w:color="000000"/>
+            </w:tcBorders>
+          </w:tcPr>
+          <w:p>
+            <w:pPr>
+              <w:spacing w:after="0"/>
+              <w:jc w:val="center"/>
+            </w:pPr>
+            <w:r>
+              <w:rPr>
+                <w:sz w:val="16"/>
+              </w:rPr>
+              <w:t>PASS</w:t>
+            </w:r>
+          </w:p>
+        </w:tc>
+        <w:tc>
+          <w:tcPr>
+            <w:tcW w:type="dxa" w:w="2952"/>
+            <w:vAlign w:val="center"/>
+            <w:tcBorders>
+              <w:top w:val="single" w:sz="5" w:color="000000"/>
+              <w:bottom w:val="single" w:sz="5" w:color="000000"/>
+              <w:left w:val="single" w:sz="5" w:color="000000"/>
+              <w:right w:val="single" w:sz="5" w:color="000000"/>
+            </w:tcBorders>
+          </w:tcPr>
+          <w:p>
+            <w:pPr>
+              <w:spacing w:after="0"/>
+              <w:jc w:val="left"/>
+            </w:pPr>
+            <w:r>
+              <w:rPr>
+                <w:sz w:val="16"/>
+              </w:rPr>
+              <w:t>official KAT TextIO bench</w:t>
             </w:r>
           </w:p>
         </w:tc>
@@ -1220,7 +1318,7 @@
               <w:rPr>
                 <w:sz w:val="16"/>
               </w:rPr>
-              <w:t>Vivado 2023.2</w:t>
+              <w:t>Vivado implementation</w:t>
             </w:r>
           </w:p>
         </w:tc>
@@ -1244,7 +1342,105 @@
               <w:rPr>
                 <w:sz w:val="16"/>
               </w:rPr>
-              <w:t>not run</w:t>
+              <w:t>placed and routed</w:t>
+            </w:r>
+          </w:p>
+        </w:tc>
+        <w:tc>
+          <w:tcPr>
+            <w:tcW w:type="dxa" w:w="1800"/>
+            <w:vAlign w:val="center"/>
+            <w:tcBorders>
+              <w:top w:val="single" w:sz="5" w:color="000000"/>
+              <w:bottom w:val="single" w:sz="5" w:color="000000"/>
+              <w:left w:val="single" w:sz="5" w:color="000000"/>
+              <w:right w:val="single" w:sz="5" w:color="000000"/>
+            </w:tcBorders>
+          </w:tcPr>
+          <w:p>
+            <w:pPr>
+              <w:spacing w:after="0"/>
+              <w:jc w:val="center"/>
+            </w:pPr>
+            <w:r>
+              <w:rPr>
+                <w:sz w:val="16"/>
+              </w:rPr>
+              <w:t>PASS</w:t>
+            </w:r>
+          </w:p>
+        </w:tc>
+        <w:tc>
+          <w:tcPr>
+            <w:tcW w:type="dxa" w:w="2952"/>
+            <w:vAlign w:val="center"/>
+            <w:tcBorders>
+              <w:top w:val="single" w:sz="5" w:color="000000"/>
+              <w:bottom w:val="single" w:sz="5" w:color="000000"/>
+              <w:left w:val="single" w:sz="5" w:color="000000"/>
+              <w:right w:val="single" w:sz="5" w:color="000000"/>
+            </w:tcBorders>
+          </w:tcPr>
+          <w:p>
+            <w:pPr>
+              <w:spacing w:after="0"/>
+              <w:jc w:val="left"/>
+            </w:pPr>
+            <w:r>
+              <w:rPr>
+                <w:sz w:val="16"/>
+              </w:rPr>
+              <w:t>reports and bitstream</w:t>
+            </w:r>
+          </w:p>
+        </w:tc>
+      </w:tr>
+      <w:tr>
+        <w:tc>
+          <w:tcPr>
+            <w:tcW w:type="dxa" w:w="2952"/>
+            <w:vAlign w:val="center"/>
+            <w:tcBorders>
+              <w:top w:val="single" w:sz="5" w:color="000000"/>
+              <w:bottom w:val="single" w:sz="5" w:color="000000"/>
+              <w:left w:val="single" w:sz="5" w:color="000000"/>
+              <w:right w:val="single" w:sz="5" w:color="000000"/>
+            </w:tcBorders>
+          </w:tcPr>
+          <w:p>
+            <w:pPr>
+              <w:spacing w:after="0"/>
+              <w:jc w:val="left"/>
+            </w:pPr>
+            <w:r>
+              <w:rPr>
+                <w:sz w:val="16"/>
+              </w:rPr>
+              <w:t>Nexys A7 board</w:t>
+            </w:r>
+          </w:p>
+        </w:tc>
+        <w:tc>
+          <w:tcPr>
+            <w:tcW w:type="dxa" w:w="2088"/>
+            <w:vAlign w:val="center"/>
+            <w:tcBorders>
+              <w:top w:val="single" w:sz="5" w:color="000000"/>
+              <w:bottom w:val="single" w:sz="5" w:color="000000"/>
+              <w:left w:val="single" w:sz="5" w:color="000000"/>
+              <w:right w:val="single" w:sz="5" w:color="000000"/>
+            </w:tcBorders>
+          </w:tcPr>
+          <w:p>
+            <w:pPr>
+              <w:spacing w:after="0"/>
+              <w:jc w:val="center"/>
+            </w:pPr>
+            <w:r>
+              <w:rPr>
+                <w:sz w:val="16"/>
+              </w:rPr>
+              <w:t>four demo vectors</w:t>
             </w:r>
           </w:p>
         </w:tc>
@@ -1292,7 +1488,7 @@
               <w:rPr>
                 <w:sz w:val="16"/>
               </w:rPr>
-              <w:t>requires Windows/Linux host</w:t>
+              <w:t>programming and hardware test</w:t>
             </w:r>
           </w:p>
         </w:tc>
@@ -1308,7 +1504,7 @@
         <w:rPr>
           <w:sz w:val="17"/>
         </w:rPr>
-        <w:t>Table I. Verification results collected before Vivado implementation.</w:t>
+        <w:t>Table I. Verification and implementation status as of September 18, 2026.</w:t>
       </w:r>
     </w:p>
     <w:p>
@@ -1336,7 +1532,7 @@
         <w:jc w:val="both"/>
       </w:pPr>
       <w:r>
-        <w:t>The repository contains Tcl scripts for Vivado 2023.2 and an XDC file for the Nexys A7 100T part xc7a100tcsg324-1. The constraint sets the board clock to 100 MHz. A pure VHDL XSim testbench writes simulation_results.txt for human review and simulation_vectors.txt for scripts. The same file-driven bench was checked with GHDL across all 1,089 vectors in both directions. XSim uses the identical TextIO input. The official-vector TextIO run measured 34 to 88 command-to-done cycles. For a 32-byte payload, the mean across all 33 associated-data lengths was 72.636 cycles, equal to 352.441 Mb/s at 100 MHz. These are cycle-based simulation results, not a measured maximum clock rate. XSim execution, synthesis, implementation, timing, and power reporting still require the Vivado machine. Resource use, maximum clock rate, and post-route throughput are intentionally not estimated in this paper.</w:t>
+        <w:t>The repository contains Tcl scripts for Vivado 2023.2 and an XDC file for the Nexys A7 100T part xc7a100tcsg324-1. The constraint sets the board clock to 100 MHz. A pure VHDL XSim testbench writes simulation_results.txt for human review and simulation_vectors.txt for scripts. The same file-driven bench was checked with GHDL across all 1,089 vectors in both directions. XSim used the identical TextIO input and completed 2,178 encryption and decryption checks with no failures. The official-vector TextIO run measured 34 to 88 command-to-done cycles. For a 32-byte payload, the mean across all 33 associated-data lengths was 72.636 cycles, equal to 352.441 Mb/s at 100 MHz. These are cycle-based simulation results, not a measured maximum clock rate. The implementation results were extracted from the routed Vivado reports. Vivado used 1717 slice LUTs and 1372 slice registers, with no block RAM. The routed design met the 100 MHz constraint with 2.941 ns worst setup slack. Vivado estimated 0.137 W total on-chip power and generated the FPGA bitstream. Physical board programming and demonstration testing remain pending. The XDC sets CFGBVS to VCCO and CONFIG_VOLTAGE to 3.3 V. A fresh routed DRC reported zero violations. The power value is a Vivado estimate rather than a board measurement.</w:t>
       </w:r>
     </w:p>
     <w:p>
@@ -1392,7 +1588,7 @@
         <w:jc w:val="both"/>
       </w:pPr>
       <w:r>
-        <w:t>The project now has a readable NIST Ascon-AEAD128 RTL core, an explicit streaming protocol, an authentication-safe decryption contract, official-vector tests, and a reproducible Vivado setup. Portable simulation gives evidence that the algorithm and boundary handling are correct. The next measured step is to run the prepared Vivado flow, record utilization and post-route timing, and test the four-vector demonstration on the Nexys A7 board.</w:t>
+        <w:t>The project now has a readable NIST Ascon-AEAD128 RTL core, an explicit streaming protocol, an authentication-safe decryption contract, official-vector tests, and a completed Vivado synthesis and implementation flow. GHDL and XSim each passed all 1,089 official vectors in encryption and decryption. The routed design met the 100 MHz constraint, and Vivado generated a bitstream. The remaining work is to program the Nexys A7 and verify the four-vector demonstration on physical hardware.</w:t>
       </w:r>
     </w:p>
     <w:p>

</xml_diff>

<commit_message>
Document complete adapter speedup and add reproducible simulation checks
</commit_message>
<xml_diff>
--- a/paper/VHDL_Implementation_of_NIST_Ascon_AEAD128_on_a_Nexys_A7_FPGA.docx
+++ b/paper/VHDL_Implementation_of_NIST_Ascon_AEAD128_on_a_Nexys_A7_FPGA.docx
@@ -56,7 +56,7 @@
         <w:jc w:val="both"/>
       </w:pPr>
       <w:r>
-        <w:t>This paper describes a VHDL-2008 implementation of the standardized NIST Ascon-AEAD128 algorithm for a Nexys A7 100T FPGA. The design uses one shared 320-bit permutation datapath and completes one Ascon round per clock cycle. A 128-bit streaming interface accepts associated data and payload bytes, including empty and partial blocks. Encryption returns ciphertext and a tag. Decryption returns tentative plaintext and releases it only after tag verification. The portable test flow passed all 1,089 official known-answer vectors in both directions with GHDL and Vivado XSim. Generated Verilog was also checked with Icarus Verilog and Verilator. Vivado 2023.2 completed synthesis, placement, routing, timing analysis, and bitstream generation. Vivado used 1717 slice LUTs and 1372 slice registers, with no block RAM. The routed design met the 100 MHz constraint with 2.941 ns worst setup slack. Vivado estimated 0.137 W total on-chip power and generated the FPGA bitstream. Physical board programming and demonstration testing remain pending. An application experiment fine-tuned GPT-2 for 40 updates in Ubuntu under WSL 2 and exported a 497,904,640-byte FP32 checkpoint. A 1,024-byte weight sample was encrypted and authenticated by the same RTL core in XSim in 801 cycles, or 8.01 microseconds at a simulated 100 MHz clock. Decryption recovered the original sample exactly. This result is behavioral simulation latency rather than a physical board measurement.</w:t>
+        <w:t>This paper describes a VHDL-2008 implementation of the standardized NIST Ascon-AEAD128 algorithm for a Nexys A7 100T FPGA. The design uses one shared 320-bit permutation datapath with configurable round unrolling and optional input/output queues. A 128-bit streaming interface accepts associated data and payload bytes, including empty and partial blocks. Encryption returns ciphertext and a tag. Decryption returns provisional plaintext that an external quarantine releases only after tag verification. The portable test flow passed all 1,089 official known-answer vectors in both directions with GHDL and Vivado XSim. Generated Verilog was also checked with Icarus Verilog and Verilator. Vivado 2023.2 completed synthesis, placement, routing, timing analysis, and bitstream generation. At a simulated 100 MHz, the complete 2,397,696-byte FP32 adapter payload encrypts and decrypts in 899,153 cycles per direction with three rounds and buffering, compared with 1,798,305 for the one-round baseline: approximately twice the throughput. All recovered bytes match and authentication passes. Core-only routed timing closes at 100 MHz; the final board wrapper closes at 83.333 MHz and passes captured self-test and demo fixtures. Full-payload throughput remains a behavioral simulation result, separate from physical board validation.</w:t>
       </w:r>
     </w:p>
     <w:p>
@@ -1532,7 +1532,7 @@
         <w:jc w:val="both"/>
       </w:pPr>
       <w:r>
-        <w:t>The repository contains Tcl scripts for Vivado 2023.2 and an XDC file for the Nexys A7 100T part xc7a100tcsg324-1. The constraint sets the board clock to 100 MHz. A pure VHDL XSim testbench writes simulation_results.txt for human review and simulation_vectors.txt for scripts. The same file-driven bench was checked with GHDL across all 1,089 vectors in both directions. XSim used the identical TextIO input and completed 2,178 encryption and decryption checks with no failures. The official-vector TextIO run measured 34 to 88 command-to-done cycles. For a 32-byte payload, the mean across all 33 associated-data lengths was 72.636 cycles, equal to 352.441 Mb/s at 100 MHz. These are cycle-based simulation results, not a measured maximum clock rate. The implementation results were extracted from the routed Vivado reports. Vivado used 1717 slice LUTs and 1372 slice registers, with no block RAM. The routed design met the 100 MHz constraint with 2.941 ns worst setup slack. Vivado estimated 0.137 W total on-chip power and generated the FPGA bitstream. Physical board programming and demonstration testing remain pending. The original routed report included a CFGBVS-1 configuration warning. The repository XDC now sets CFGBVS to VCCO and CONFIG_VOLTAGE to 3.3 for the Nexys A7 configuration bank. Physical-board validation remains pending. The power value is a Vivado estimate rather than a board measurement.</w:t>
+        <w:t>The repository contains Tcl scripts for Vivado 2023.2 and an XDC file for the Nexys A7 100T part xc7a100tcsg324-1. The constraint sets the board clock to 100 MHz. A pure VHDL XSim testbench writes simulation_results.txt for human review and simulation_vectors.txt for scripts. The same file-driven bench was checked with GHDL across all 1,089 vectors in both directions. XSim used the identical TextIO input and completed 2,178 encryption and decryption checks with no failures. The official-vector TextIO run measured 34 to 88 command-to-done cycles. For a 32-byte payload, the mean across all 33 associated-data lengths was 72.636 cycles, equal to 352.441 Mb/s at 100 MHz. These are cycle-based simulation results, not a measured maximum clock rate. The implementation results were extracted from the routed Vivado reports. Vivado used 1717 slice LUTs and 1372 slice registers, with no block RAM. The routed design met the 100 MHz constraint with 2.941 ns worst setup slack. Vivado estimated 0.137 W total on-chip power and generated the FPGA bitstream. Physical board programming and demonstration testing were pending at this baseline stage; Section XIII records the later board tests. The original routed report included a CFGBVS-1 configuration warning. The repository XDC now sets CFGBVS to VCCO and CONFIG_VOLTAGE to 3.3 for the Nexys A7 configuration bank. Physical-board validation was pending at this baseline stage; later results appear in Section XIII. The power value is a Vivado estimate rather than a board measurement.</w:t>
       </w:r>
     </w:p>
     <w:p>
@@ -3726,7 +3726,7 @@
           <w:b/>
           <w:sz w:val="21"/>
         </w:rPr>
-        <w:t>X. Reducing latency at a fixed clock frequency</w:t>
+        <w:t>X. Historical latency study at a fixed clock frequency</w:t>
       </w:r>
     </w:p>
     <w:p>
@@ -3736,7 +3736,17 @@
         <w:jc w:val="both"/>
       </w:pPr>
       <w:r>
-        <w:t>The 1 KiB experiment provides a measured simulation baseline for evaluating architectural changes: 801 cycles, or 8.01 microseconds at 100 MHz. The following options are proposed research directions; none has been implemented or measured in this experiment. Published Ascon hardware supports multiple rounds per cycle, including two- and four-round configurations [11]. OpenTitan also identifies multiple rounds per cycle as a way to reduce permutation latency [12]. These sources establish the technique, not a performance result for this FPGA design.</w:t>
+        <w:t>This section preserves the initial architecture proposals and conditional estimates. Section XIII reports the later implemented three-round core, buffering, routed timing and complete adapter simulation. Statements about unimplemented options below describe the earlier study stage.</w:t>
+      </w:r>
+    </w:p>
+    <w:p>
+      <w:pPr>
+        <w:spacing w:after="60" w:line="245" w:lineRule="auto"/>
+        <w:ind w:firstLine="317"/>
+        <w:jc w:val="both"/>
+      </w:pPr>
+      <w:r>
+        <w:t>The initial 1 KiB baseline measured 801 cycles, or 8.01 microseconds at 100 MHz. Published two- and four-round configurations [11] and OpenTitan’s latency discussion [12] motivated the proposals below. These sources establish the technique; Section XIII supplies this project’s measured follow-up.</w:t>
       </w:r>
     </w:p>
     <w:p>
@@ -4334,7 +4344,7 @@
         <w:jc w:val="both"/>
       </w:pPr>
       <w:r>
-        <w:t>Two rounds per cycle is the first candidate to evaluate because it offers a substantial cycle reduction with a smaller increase in logic depth than four rounds. Unrolling increases logic and routing demands, so a lower cycle count is useful only if routed timing still meets 100 MHz. The estimates are derived from this workload and must not be presented as published benchmark measurements.</w:t>
+        <w:t>Two rounds was proposed first to limit combinational depth. Unrolling increases logic and routing demands, so these cycle estimates require routed timing validation and are not published benchmark measurements.</w:t>
       </w:r>
     </w:p>
     <w:p>
@@ -4730,7 +4740,7 @@
         <w:jc w:val="both"/>
       </w:pPr>
       <w:r>
-        <w:t>The next study should record a baseline cycle trace, implement a two-round permutation variant, and repeat the official-vector tests and the same 1 KiB encryption/decryption experiment. Report cycle latency, routed timing at 100 MHz, LUT and register use, and estimated power for both designs. Simulation, Vivado implementation estimates, and physical-board measurements should be reported separately. This comparison would determine whether the predicted cycle reduction is achieved without compromising functional correctness or timing closure.</w:t>
+        <w:t>The proposed comparison was to repeat official-vector and 1 KiB tests after unrolling, recording cycles, routed timing and resources separately from physical-board results. Section XIII now reports that follow-up, including buffering and complete adapter recovery.</w:t>
       </w:r>
     </w:p>
     <w:p>
@@ -6581,7 +6591,7 @@
           <w:b/>
           <w:sz w:val="21"/>
         </w:rPr>
-        <w:t>XIII. Limitations and next work</w:t>
+        <w:t>XIII. Three round acceleration of complete adapter weights</w:t>
       </w:r>
     </w:p>
     <w:p>
@@ -6591,7 +6601,7 @@
         <w:jc w:val="both"/>
       </w:pPr>
       <w:r>
-        <w:t>This version is an unprotected cryptographic core. It does not prevent power or electromagnetic side-channel analysis, and it does not detect injected faults. Kandi et al. describe threshold and redundancy-based hardware options that could be studied after the baseline is stable [3]. A faster unrolled or ping-pong architecture is another option, but it would use more logic and make the first implementation harder to inspect [4]. The external quarantine buffer is also a required part of safe decryption, not an optional application feature.</w:t>
+        <w:t>The complete SAGE adapter export was encrypted and recovered with half the baseline cycle count at a 100 MHz simulated clock. The unchanged one-round core required 1,798,305 cycles per direction; three rounds per cycle with input/output buffering and controller overlap required 899,153. This is a 1.999999-fold throughput improvement and a 49.99997% cycle reduction. Both runs recovered every byte and passed RTL authentication and commit. The result measures encryption and decryption throughput, not model inference speed.</w:t>
       </w:r>
     </w:p>
     <w:p>
@@ -6604,7 +6614,7 @@
           <w:b/>
           <w:sz w:val="21"/>
         </w:rPr>
-        <w:t>XIV. Conclusion</w:t>
+        <w:t>A. Architecture and sources</w:t>
       </w:r>
     </w:p>
     <w:p>
@@ -6614,7 +6624,1765 @@
         <w:jc w:val="both"/>
       </w:pPr>
       <w:r>
-        <w:t>The project now has a readable NIST Ascon-AEAD128 RTL core, an explicit streaming protocol, an authentication-safe decryption contract, official-vector tests, and a completed Vivado synthesis and implementation flow. GHDL and XSim each passed all 1,089 official vectors in encryption and decryption. The routed design met the 100 MHz constraint, and Vivado generated a bitstream. The remaining work is to program the Nexys A7 with the corrected configuration properties and verify the four-vector demonstration on physical hardware. The GPT-2 application experiment also demonstrated the complete path from GPU fine-tuning to exported weight bytes and authenticated VHDL encryption. A 1 KiB sample passed encryption and decryption in 801 cycles per direction at the testbench clock. Follow-up behavior tests passed all 17 checks, including tamper rejection and stalled transfers. Restoring the recovered slice into the full GPT-2 model preserved parameters, logits, generated tokens, and validation losses exactly. Whole-checkpoint GPT-2 encryption, physical transfer overhead, and board-level measurements remain future work.</w:t>
+        <w:t>NIST SP 800-232 defines the required Ascon-AEAD128 behavior [1]. The implementation retains its 128-bit rate, padding, round constants, twelve-round initialization/finalization, and eight-round block permutations. A configurable combinational chain defaults to one round per clock. The candidate evaluates p8 as 3 + 3 + 2 rounds and p12 as four groups of three. The last p8 group executes only its two remaining rounds; it neither omits a round nor executes a ninth round.</w:t>
+      </w:r>
+    </w:p>
+    <w:p>
+      <w:pPr>
+        <w:spacing w:after="60" w:line="245" w:lineRule="auto"/>
+        <w:ind w:firstLine="317"/>
+        <w:jc w:val="both"/>
+      </w:pPr>
+      <w:r>
+        <w:t>The earlier architecture study drew on Robert Primas’s public Ascon hardware variants, which provide one-, two-, and four-round unrolling [11], and OpenTitan’s discussion of latency, feedback dependencies, and the area cost of unrolling [12]. Those sources motivate the architectural technique; they do not supply this project’s three-round performance numbers. OpenTitan also limits its unrolling rationale to an unhardened datapath. This core remains unmasked and makes no side-channel-resistance claim.</w:t>
+      </w:r>
+    </w:p>
+    <w:p>
+      <w:pPr>
+        <w:spacing w:after="60" w:line="245" w:lineRule="auto"/>
+        <w:ind w:firstLine="317"/>
+        <w:jc w:val="both"/>
+      </w:pPr>
+      <w:r>
+        <w:t>The FIFO design follows the ready/valid principles summarized by LaForest [13]: transfer on a simultaneous ready/valid handshake, hold unaccepted data stable, and avoid advancing interface state without a completed transfer. This is a supporting design reference, not evidence that third-party FIFO RTL was copied. The two-entry input queue stores data and kind/keep/last metadata while the permutation runs. The two-entry output queue accepts a completed block before permutation work advances; the controller launches p8 on that enqueue edge. Simultaneous push/pop is supported, full queues cannot overwrite data, and input acceptance stops after the final payload beat. These queues and controller changes are this repository’s adaptation of the general ideas.</w:t>
+      </w:r>
+    </w:p>
+    <w:p>
+      <w:pPr>
+        <w:spacing w:after="60" w:line="245" w:lineRule="auto"/>
+        <w:ind w:firstLine="317"/>
+        <w:jc w:val="both"/>
+      </w:pPr>
+      <w:r>
+        <w:t>Decrypted bytes remain provisional. An external consumer must collect them into quarantine while the stream runs and publish only on commit_o; discard, protocol error, or reset invalidates that transaction. Authentication is delayed until queued plaintext drains, and pending ciphertext is retained through completion. Reset and protocol errors erase queued data and cryptographic storage. A selectable full-16-byte mask specialization saved no clocks and increased area in the controlled experiment, so it is disabled. Partial endings and mandatory final padding remain supported.</w:t>
+      </w:r>
+    </w:p>
+    <w:p>
+      <w:pPr>
+        <w:keepNext/>
+        <w:spacing w:before="100" w:after="40"/>
+      </w:pPr>
+      <w:r>
+        <w:rPr>
+          <w:b/>
+          <w:sz w:val="21"/>
+        </w:rPr>
+        <w:t>B. Adapter identity and simulation method</w:t>
+      </w:r>
+    </w:p>
+    <w:p>
+      <w:pPr>
+        <w:spacing w:after="60" w:line="245" w:lineRule="auto"/>
+        <w:ind w:firstLine="317"/>
+        <w:jc w:val="both"/>
+      </w:pPr>
+      <w:r>
+        <w:t>The existing file runs/adapter_fp32_200/export/adapter_weights.bin contains all 599,424 little-endian FP32 adapter values: down_w [12,32,768], down_b [12,32], up_w [12,768,32], and up_b [12,768]. Its length is 2,397,696 bytes (149,856 full blocks), with no export padding. The saved checkpoint is adapter_params_00000200.bin. The export is exactly its complete body after the 20-byte [B,L,C,r,T] format header. This experiment used saved artifacts and did not train a model.</w:t>
+      </w:r>
+    </w:p>
+    <w:p>
+      <w:pPr>
+        <w:spacing w:after="60" w:line="245" w:lineRule="auto"/>
+        <w:ind w:firstLine="317"/>
+        <w:jc w:val="both"/>
+      </w:pPr>
+      <w:r>
+        <w:t>On October 20, 2026, Vivado 2023.2 XSim ran the buffered three-round core with a 10 ns behavioral clock. A fresh GHDL run of unchanged origin/main reproduced the earlier one-round result exactly on the same file. Both file benches count command through done, including stream handshakes, empty associated data, mandatory final padding, and tag work; host I/O, Python reference execution, and simulator wall time are excluded. Output is always ready in this throughput test. Independent encryption runs use distinct nonces under a public test key. The corresponding decryption reuses each message’s nonce as required to verify it.</w:t>
+      </w:r>
+    </w:p>
+    <w:tbl>
+      <w:tblPr>
+        <w:tblW w:type="auto" w:w="0"/>
+        <w:jc w:val="center"/>
+        <w:tblLayout w:type="fixed"/>
+        <w:tblLook w:firstColumn="1" w:firstRow="1" w:lastColumn="0" w:lastRow="0" w:noHBand="0" w:noVBand="1" w:val="04A0"/>
+      </w:tblPr>
+      <w:tblGrid>
+        <w:gridCol w:w="4536"/>
+        <w:gridCol w:w="1800"/>
+        <w:gridCol w:w="1944"/>
+        <w:gridCol w:w="2002"/>
+      </w:tblGrid>
+      <w:tr>
+        <w:trPr>
+          <w:tblHeader/>
+        </w:trPr>
+        <w:tc>
+          <w:tcPr>
+            <w:tcW w:type="dxa" w:w="4536"/>
+            <w:vAlign w:val="center"/>
+            <w:tcBorders>
+              <w:top w:val="single" w:sz="4" w:color="D9D9D9"/>
+              <w:left w:val="single" w:sz="4" w:color="D9D9D9"/>
+              <w:bottom w:val="single" w:sz="4" w:color="D9D9D9"/>
+              <w:right w:val="single" w:sz="4" w:color="D9D9D9"/>
+            </w:tcBorders>
+            <w:shd w:fill="E7E6E6"/>
+            <w:tcMar>
+              <w:top w:w="75" w:type="dxa"/>
+              <w:left w:w="75" w:type="dxa"/>
+              <w:bottom w:w="75" w:type="dxa"/>
+              <w:right w:w="75" w:type="dxa"/>
+            </w:tcMar>
+          </w:tcPr>
+          <w:p>
+            <w:pPr>
+              <w:spacing w:after="20" w:line="240" w:lineRule="auto"/>
+            </w:pPr>
+            <w:r>
+              <w:rPr>
+                <w:b/>
+                <w:color w:val="000000"/>
+                <w:sz w:val="18"/>
+              </w:rPr>
+              <w:t>Configuration at 100 MHz</w:t>
+            </w:r>
+          </w:p>
+        </w:tc>
+        <w:tc>
+          <w:tcPr>
+            <w:tcW w:type="dxa" w:w="1800"/>
+            <w:vAlign w:val="center"/>
+            <w:tcBorders>
+              <w:top w:val="single" w:sz="4" w:color="D9D9D9"/>
+              <w:left w:val="single" w:sz="4" w:color="D9D9D9"/>
+              <w:bottom w:val="single" w:sz="4" w:color="D9D9D9"/>
+              <w:right w:val="single" w:sz="4" w:color="D9D9D9"/>
+            </w:tcBorders>
+            <w:shd w:fill="E7E6E6"/>
+            <w:tcMar>
+              <w:top w:w="75" w:type="dxa"/>
+              <w:left w:w="75" w:type="dxa"/>
+              <w:bottom w:w="75" w:type="dxa"/>
+              <w:right w:w="75" w:type="dxa"/>
+            </w:tcMar>
+          </w:tcPr>
+          <w:p>
+            <w:pPr>
+              <w:spacing w:after="20" w:line="240" w:lineRule="auto"/>
+            </w:pPr>
+            <w:r>
+              <w:rPr>
+                <w:b/>
+                <w:color w:val="000000"/>
+                <w:sz w:val="18"/>
+              </w:rPr>
+              <w:t>Cycles each</w:t>
+            </w:r>
+          </w:p>
+        </w:tc>
+        <w:tc>
+          <w:tcPr>
+            <w:tcW w:type="dxa" w:w="1944"/>
+            <w:vAlign w:val="center"/>
+            <w:tcBorders>
+              <w:top w:val="single" w:sz="4" w:color="D9D9D9"/>
+              <w:left w:val="single" w:sz="4" w:color="D9D9D9"/>
+              <w:bottom w:val="single" w:sz="4" w:color="D9D9D9"/>
+              <w:right w:val="single" w:sz="4" w:color="D9D9D9"/>
+            </w:tcBorders>
+            <w:shd w:fill="E7E6E6"/>
+            <w:tcMar>
+              <w:top w:w="75" w:type="dxa"/>
+              <w:left w:w="75" w:type="dxa"/>
+              <w:bottom w:w="75" w:type="dxa"/>
+              <w:right w:w="75" w:type="dxa"/>
+            </w:tcMar>
+          </w:tcPr>
+          <w:p>
+            <w:pPr>
+              <w:spacing w:after="20" w:line="240" w:lineRule="auto"/>
+            </w:pPr>
+            <w:r>
+              <w:rPr>
+                <w:b/>
+                <w:color w:val="000000"/>
+                <w:sz w:val="18"/>
+              </w:rPr>
+              <w:t>Latency each</w:t>
+            </w:r>
+          </w:p>
+        </w:tc>
+        <w:tc>
+          <w:tcPr>
+            <w:tcW w:type="dxa" w:w="2002"/>
+            <w:vAlign w:val="center"/>
+            <w:tcBorders>
+              <w:top w:val="single" w:sz="4" w:color="D9D9D9"/>
+              <w:left w:val="single" w:sz="4" w:color="D9D9D9"/>
+              <w:bottom w:val="single" w:sz="4" w:color="D9D9D9"/>
+              <w:right w:val="single" w:sz="4" w:color="D9D9D9"/>
+            </w:tcBorders>
+            <w:shd w:fill="E7E6E6"/>
+            <w:tcMar>
+              <w:top w:w="75" w:type="dxa"/>
+              <w:left w:w="75" w:type="dxa"/>
+              <w:bottom w:w="75" w:type="dxa"/>
+              <w:right w:w="75" w:type="dxa"/>
+            </w:tcMar>
+          </w:tcPr>
+          <w:p>
+            <w:pPr>
+              <w:spacing w:after="20" w:line="240" w:lineRule="auto"/>
+            </w:pPr>
+            <w:r>
+              <w:rPr>
+                <w:b/>
+                <w:color w:val="000000"/>
+                <w:sz w:val="18"/>
+              </w:rPr>
+              <w:t>Payload MB/s</w:t>
+            </w:r>
+          </w:p>
+        </w:tc>
+      </w:tr>
+      <w:tr>
+        <w:tc>
+          <w:tcPr>
+            <w:tcW w:type="dxa" w:w="4536"/>
+            <w:vAlign w:val="center"/>
+            <w:tcBorders>
+              <w:top w:val="single" w:sz="4" w:color="D9D9D9"/>
+              <w:left w:val="single" w:sz="4" w:color="D9D9D9"/>
+              <w:bottom w:val="single" w:sz="4" w:color="D9D9D9"/>
+              <w:right w:val="single" w:sz="4" w:color="D9D9D9"/>
+            </w:tcBorders>
+            <w:shd w:fill="FFFFFF"/>
+            <w:tcMar>
+              <w:top w:w="75" w:type="dxa"/>
+              <w:left w:w="75" w:type="dxa"/>
+              <w:bottom w:w="75" w:type="dxa"/>
+              <w:right w:w="75" w:type="dxa"/>
+            </w:tcMar>
+          </w:tcPr>
+          <w:p>
+            <w:pPr>
+              <w:spacing w:after="20" w:line="240" w:lineRule="auto"/>
+            </w:pPr>
+            <w:r>
+              <w:rPr>
+                <w:b w:val="0"/>
+                <w:color w:val="000000"/>
+                <w:sz w:val="18"/>
+              </w:rPr>
+              <w:t>Unchanged one-round baseline</w:t>
+            </w:r>
+          </w:p>
+        </w:tc>
+        <w:tc>
+          <w:tcPr>
+            <w:tcW w:type="dxa" w:w="1800"/>
+            <w:vAlign w:val="center"/>
+            <w:tcBorders>
+              <w:top w:val="single" w:sz="4" w:color="D9D9D9"/>
+              <w:left w:val="single" w:sz="4" w:color="D9D9D9"/>
+              <w:bottom w:val="single" w:sz="4" w:color="D9D9D9"/>
+              <w:right w:val="single" w:sz="4" w:color="D9D9D9"/>
+            </w:tcBorders>
+            <w:shd w:fill="FFFFFF"/>
+            <w:tcMar>
+              <w:top w:w="75" w:type="dxa"/>
+              <w:left w:w="75" w:type="dxa"/>
+              <w:bottom w:w="75" w:type="dxa"/>
+              <w:right w:w="75" w:type="dxa"/>
+            </w:tcMar>
+          </w:tcPr>
+          <w:p>
+            <w:pPr>
+              <w:spacing w:after="20" w:line="240" w:lineRule="auto"/>
+            </w:pPr>
+            <w:r>
+              <w:rPr>
+                <w:b w:val="0"/>
+                <w:color w:val="000000"/>
+                <w:sz w:val="18"/>
+              </w:rPr>
+              <w:t>1,798,305</w:t>
+            </w:r>
+          </w:p>
+        </w:tc>
+        <w:tc>
+          <w:tcPr>
+            <w:tcW w:type="dxa" w:w="1944"/>
+            <w:vAlign w:val="center"/>
+            <w:tcBorders>
+              <w:top w:val="single" w:sz="4" w:color="D9D9D9"/>
+              <w:left w:val="single" w:sz="4" w:color="D9D9D9"/>
+              <w:bottom w:val="single" w:sz="4" w:color="D9D9D9"/>
+              <w:right w:val="single" w:sz="4" w:color="D9D9D9"/>
+            </w:tcBorders>
+            <w:shd w:fill="FFFFFF"/>
+            <w:tcMar>
+              <w:top w:w="75" w:type="dxa"/>
+              <w:left w:w="75" w:type="dxa"/>
+              <w:bottom w:w="75" w:type="dxa"/>
+              <w:right w:w="75" w:type="dxa"/>
+            </w:tcMar>
+          </w:tcPr>
+          <w:p>
+            <w:pPr>
+              <w:spacing w:after="20" w:line="240" w:lineRule="auto"/>
+            </w:pPr>
+            <w:r>
+              <w:rPr>
+                <w:b w:val="0"/>
+                <w:color w:val="000000"/>
+                <w:sz w:val="18"/>
+              </w:rPr>
+              <w:t>17.98305 ms</w:t>
+            </w:r>
+          </w:p>
+        </w:tc>
+        <w:tc>
+          <w:tcPr>
+            <w:tcW w:type="dxa" w:w="2002"/>
+            <w:vAlign w:val="center"/>
+            <w:tcBorders>
+              <w:top w:val="single" w:sz="4" w:color="D9D9D9"/>
+              <w:left w:val="single" w:sz="4" w:color="D9D9D9"/>
+              <w:bottom w:val="single" w:sz="4" w:color="D9D9D9"/>
+              <w:right w:val="single" w:sz="4" w:color="D9D9D9"/>
+            </w:tcBorders>
+            <w:shd w:fill="FFFFFF"/>
+            <w:tcMar>
+              <w:top w:w="75" w:type="dxa"/>
+              <w:left w:w="75" w:type="dxa"/>
+              <w:bottom w:w="75" w:type="dxa"/>
+              <w:right w:w="75" w:type="dxa"/>
+            </w:tcMar>
+          </w:tcPr>
+          <w:p>
+            <w:pPr>
+              <w:spacing w:after="20" w:line="240" w:lineRule="auto"/>
+            </w:pPr>
+            <w:r>
+              <w:rPr>
+                <w:b w:val="0"/>
+                <w:color w:val="000000"/>
+                <w:sz w:val="18"/>
+              </w:rPr>
+              <w:t>133.331</w:t>
+            </w:r>
+          </w:p>
+        </w:tc>
+      </w:tr>
+      <w:tr>
+        <w:tc>
+          <w:tcPr>
+            <w:tcW w:type="dxa" w:w="4536"/>
+            <w:vAlign w:val="center"/>
+            <w:tcBorders>
+              <w:top w:val="single" w:sz="4" w:color="D9D9D9"/>
+              <w:left w:val="single" w:sz="4" w:color="D9D9D9"/>
+              <w:bottom w:val="single" w:sz="4" w:color="D9D9D9"/>
+              <w:right w:val="single" w:sz="4" w:color="D9D9D9"/>
+            </w:tcBorders>
+            <w:shd w:fill="F5F5F5"/>
+            <w:tcMar>
+              <w:top w:w="75" w:type="dxa"/>
+              <w:left w:w="75" w:type="dxa"/>
+              <w:bottom w:w="75" w:type="dxa"/>
+              <w:right w:w="75" w:type="dxa"/>
+            </w:tcMar>
+          </w:tcPr>
+          <w:p>
+            <w:pPr>
+              <w:spacing w:after="20" w:line="240" w:lineRule="auto"/>
+            </w:pPr>
+            <w:r>
+              <w:rPr>
+                <w:b w:val="0"/>
+                <w:color w:val="000000"/>
+                <w:sz w:val="18"/>
+              </w:rPr>
+              <w:t>Three rounds with queues and overlap</w:t>
+            </w:r>
+          </w:p>
+        </w:tc>
+        <w:tc>
+          <w:tcPr>
+            <w:tcW w:type="dxa" w:w="1800"/>
+            <w:vAlign w:val="center"/>
+            <w:tcBorders>
+              <w:top w:val="single" w:sz="4" w:color="D9D9D9"/>
+              <w:left w:val="single" w:sz="4" w:color="D9D9D9"/>
+              <w:bottom w:val="single" w:sz="4" w:color="D9D9D9"/>
+              <w:right w:val="single" w:sz="4" w:color="D9D9D9"/>
+            </w:tcBorders>
+            <w:shd w:fill="F5F5F5"/>
+            <w:tcMar>
+              <w:top w:w="75" w:type="dxa"/>
+              <w:left w:w="75" w:type="dxa"/>
+              <w:bottom w:w="75" w:type="dxa"/>
+              <w:right w:w="75" w:type="dxa"/>
+            </w:tcMar>
+          </w:tcPr>
+          <w:p>
+            <w:pPr>
+              <w:spacing w:after="20" w:line="240" w:lineRule="auto"/>
+            </w:pPr>
+            <w:r>
+              <w:rPr>
+                <w:b w:val="0"/>
+                <w:color w:val="000000"/>
+                <w:sz w:val="18"/>
+              </w:rPr>
+              <w:t>899,153</w:t>
+            </w:r>
+          </w:p>
+        </w:tc>
+        <w:tc>
+          <w:tcPr>
+            <w:tcW w:type="dxa" w:w="1944"/>
+            <w:vAlign w:val="center"/>
+            <w:tcBorders>
+              <w:top w:val="single" w:sz="4" w:color="D9D9D9"/>
+              <w:left w:val="single" w:sz="4" w:color="D9D9D9"/>
+              <w:bottom w:val="single" w:sz="4" w:color="D9D9D9"/>
+              <w:right w:val="single" w:sz="4" w:color="D9D9D9"/>
+            </w:tcBorders>
+            <w:shd w:fill="F5F5F5"/>
+            <w:tcMar>
+              <w:top w:w="75" w:type="dxa"/>
+              <w:left w:w="75" w:type="dxa"/>
+              <w:bottom w:w="75" w:type="dxa"/>
+              <w:right w:w="75" w:type="dxa"/>
+            </w:tcMar>
+          </w:tcPr>
+          <w:p>
+            <w:pPr>
+              <w:spacing w:after="20" w:line="240" w:lineRule="auto"/>
+            </w:pPr>
+            <w:r>
+              <w:rPr>
+                <w:b w:val="0"/>
+                <w:color w:val="000000"/>
+                <w:sz w:val="18"/>
+              </w:rPr>
+              <w:t>8.99153 ms</w:t>
+            </w:r>
+          </w:p>
+        </w:tc>
+        <w:tc>
+          <w:tcPr>
+            <w:tcW w:type="dxa" w:w="2002"/>
+            <w:vAlign w:val="center"/>
+            <w:tcBorders>
+              <w:top w:val="single" w:sz="4" w:color="D9D9D9"/>
+              <w:left w:val="single" w:sz="4" w:color="D9D9D9"/>
+              <w:bottom w:val="single" w:sz="4" w:color="D9D9D9"/>
+              <w:right w:val="single" w:sz="4" w:color="D9D9D9"/>
+            </w:tcBorders>
+            <w:shd w:fill="F5F5F5"/>
+            <w:tcMar>
+              <w:top w:w="75" w:type="dxa"/>
+              <w:left w:w="75" w:type="dxa"/>
+              <w:bottom w:w="75" w:type="dxa"/>
+              <w:right w:w="75" w:type="dxa"/>
+            </w:tcMar>
+          </w:tcPr>
+          <w:p>
+            <w:pPr>
+              <w:spacing w:after="20" w:line="240" w:lineRule="auto"/>
+            </w:pPr>
+            <w:r>
+              <w:rPr>
+                <w:b w:val="0"/>
+                <w:color w:val="000000"/>
+                <w:sz w:val="18"/>
+              </w:rPr>
+              <w:t>266.662</w:t>
+            </w:r>
+          </w:p>
+        </w:tc>
+      </w:tr>
+    </w:tbl>
+    <w:p>
+      <w:pPr>
+        <w:spacing w:after="0"/>
+      </w:pPr>
+    </w:p>
+    <w:p>
+      <w:pPr>
+        <w:keepNext w:val="0"/>
+        <w:spacing w:before="40" w:after="80"/>
+        <w:jc w:val="center"/>
+      </w:pPr>
+      <w:r>
+        <w:rPr>
+          <w:sz w:val="17"/>
+        </w:rPr>
+        <w:t>Table VII. Complete adapter payload; encryption and decryption have equal latency. MB denotes 1,000,000 bytes. The speedup combines unrolling, buffering, and launch overlap.</w:t>
+      </w:r>
+    </w:p>
+    <w:p>
+      <w:pPr>
+        <w:spacing w:after="60" w:line="245" w:lineRule="auto"/>
+        <w:ind w:firstLine="317"/>
+        <w:jc w:val="both"/>
+      </w:pPr>
+      <w:r>
+        <w:t>The Python oracle first passed all 1,089 official known-answer vectors. The full-file RTL runs then matched every ciphertext block and tag against that oracle, asserted authentication and commit, and recovered all payload bytes with zero mismatches. Original and recovered payload SHA-256: c184175fc18d24373f009875c03698e630e8c36a5341146aab2bd13a98fff8eb. Reattaching the original format header reproduced the complete saved checkpoint exactly, SHA-256 7c45c25b28ae54943c1fd4ee160001dcd9a68ee1f8430aee229f933545672de6. The header itself is outside the requested exported weight payload and was preserved unchanged.</w:t>
+      </w:r>
+    </w:p>
+    <w:p>
+      <w:pPr>
+        <w:keepNext/>
+        <w:spacing w:before="100" w:after="40"/>
+      </w:pPr>
+      <w:r>
+        <w:rPr>
+          <w:b/>
+          <w:sz w:val="21"/>
+        </w:rPr>
+        <w:t>C. Correctness coverage and comparison with earlier workloads</w:t>
+      </w:r>
+    </w:p>
+    <w:p>
+      <w:pPr>
+        <w:spacing w:after="60" w:line="245" w:lineRule="auto"/>
+        <w:ind w:firstLine="317"/>
+        <w:jc w:val="both"/>
+      </w:pPr>
+      <w:r>
+        <w:t>All three core configurations passed all 1,089 official vectors in both directions, or 2,178 checks per configuration. Additional tests covered concurrent sustained traffic, input gaps, long output stalls, FIFO capacities one through three, wraparound and simultaneous enqueue/dequeue, reset with buffered data, malformed streams, consecutive messages, empty inputs, all partial final lengths, and tampered ciphertext, associated data, nonces, and tags. Rejected transactions must never commit. Intermediate permutation-state traces check grouping without changing cryptographic round counts. These protocol checks are separate from the always-ready adapter throughput run.</w:t>
+      </w:r>
+    </w:p>
+    <w:tbl>
+      <w:tblPr>
+        <w:tblW w:type="auto" w:w="0"/>
+        <w:jc w:val="center"/>
+        <w:tblLayout w:type="fixed"/>
+        <w:tblLook w:firstColumn="1" w:firstRow="1" w:lastColumn="0" w:lastRow="0" w:noHBand="0" w:noVBand="1" w:val="04A0"/>
+      </w:tblPr>
+      <w:tblGrid>
+        <w:gridCol w:w="3816"/>
+        <w:gridCol w:w="1656"/>
+        <w:gridCol w:w="2794"/>
+        <w:gridCol w:w="2016"/>
+      </w:tblGrid>
+      <w:tr>
+        <w:trPr>
+          <w:tblHeader/>
+        </w:trPr>
+        <w:tc>
+          <w:tcPr>
+            <w:tcW w:type="dxa" w:w="3816"/>
+            <w:vAlign w:val="center"/>
+            <w:tcBorders>
+              <w:top w:val="single" w:sz="4" w:color="D9D9D9"/>
+              <w:left w:val="single" w:sz="4" w:color="D9D9D9"/>
+              <w:bottom w:val="single" w:sz="4" w:color="D9D9D9"/>
+              <w:right w:val="single" w:sz="4" w:color="D9D9D9"/>
+            </w:tcBorders>
+            <w:shd w:fill="E7E6E6"/>
+            <w:tcMar>
+              <w:top w:w="75" w:type="dxa"/>
+              <w:left w:w="75" w:type="dxa"/>
+              <w:bottom w:w="75" w:type="dxa"/>
+              <w:right w:w="75" w:type="dxa"/>
+            </w:tcMar>
+          </w:tcPr>
+          <w:p>
+            <w:pPr>
+              <w:spacing w:after="20" w:line="240" w:lineRule="auto"/>
+            </w:pPr>
+            <w:r>
+              <w:rPr>
+                <w:b/>
+                <w:color w:val="000000"/>
+                <w:sz w:val="18"/>
+              </w:rPr>
+              <w:t>Configuration</w:t>
+            </w:r>
+          </w:p>
+        </w:tc>
+        <w:tc>
+          <w:tcPr>
+            <w:tcW w:type="dxa" w:w="1656"/>
+            <w:vAlign w:val="center"/>
+            <w:tcBorders>
+              <w:top w:val="single" w:sz="4" w:color="D9D9D9"/>
+              <w:left w:val="single" w:sz="4" w:color="D9D9D9"/>
+              <w:bottom w:val="single" w:sz="4" w:color="D9D9D9"/>
+              <w:right w:val="single" w:sz="4" w:color="D9D9D9"/>
+            </w:tcBorders>
+            <w:shd w:fill="E7E6E6"/>
+            <w:tcMar>
+              <w:top w:w="75" w:type="dxa"/>
+              <w:left w:w="75" w:type="dxa"/>
+              <w:bottom w:w="75" w:type="dxa"/>
+              <w:right w:w="75" w:type="dxa"/>
+            </w:tcMar>
+          </w:tcPr>
+          <w:p>
+            <w:pPr>
+              <w:spacing w:after="20" w:line="240" w:lineRule="auto"/>
+            </w:pPr>
+            <w:r>
+              <w:rPr>
+                <w:b/>
+                <w:color w:val="000000"/>
+                <w:sz w:val="18"/>
+              </w:rPr>
+              <w:t>1 KiB cycles</w:t>
+            </w:r>
+          </w:p>
+        </w:tc>
+        <w:tc>
+          <w:tcPr>
+            <w:tcW w:type="dxa" w:w="2794"/>
+            <w:vAlign w:val="center"/>
+            <w:tcBorders>
+              <w:top w:val="single" w:sz="4" w:color="D9D9D9"/>
+              <w:left w:val="single" w:sz="4" w:color="D9D9D9"/>
+              <w:bottom w:val="single" w:sz="4" w:color="D9D9D9"/>
+              <w:right w:val="single" w:sz="4" w:color="D9D9D9"/>
+            </w:tcBorders>
+            <w:shd w:fill="E7E6E6"/>
+            <w:tcMar>
+              <w:top w:w="75" w:type="dxa"/>
+              <w:left w:w="75" w:type="dxa"/>
+              <w:bottom w:w="75" w:type="dxa"/>
+              <w:right w:w="75" w:type="dxa"/>
+            </w:tcMar>
+          </w:tcPr>
+          <w:p>
+            <w:pPr>
+              <w:spacing w:after="20" w:line="240" w:lineRule="auto"/>
+            </w:pPr>
+            <w:r>
+              <w:rPr>
+                <w:b/>
+                <w:color w:val="000000"/>
+                <w:sz w:val="18"/>
+              </w:rPr>
+              <w:t>1,641,984-byte cycles</w:t>
+            </w:r>
+          </w:p>
+        </w:tc>
+        <w:tc>
+          <w:tcPr>
+            <w:tcW w:type="dxa" w:w="2016"/>
+            <w:vAlign w:val="center"/>
+            <w:tcBorders>
+              <w:top w:val="single" w:sz="4" w:color="D9D9D9"/>
+              <w:left w:val="single" w:sz="4" w:color="D9D9D9"/>
+              <w:bottom w:val="single" w:sz="4" w:color="D9D9D9"/>
+              <w:right w:val="single" w:sz="4" w:color="D9D9D9"/>
+            </w:tcBorders>
+            <w:shd w:fill="E7E6E6"/>
+            <w:tcMar>
+              <w:top w:w="75" w:type="dxa"/>
+              <w:left w:w="75" w:type="dxa"/>
+              <w:bottom w:w="75" w:type="dxa"/>
+              <w:right w:w="75" w:type="dxa"/>
+            </w:tcMar>
+          </w:tcPr>
+          <w:p>
+            <w:pPr>
+              <w:spacing w:after="20" w:line="240" w:lineRule="auto"/>
+            </w:pPr>
+            <w:r>
+              <w:rPr>
+                <w:b/>
+                <w:color w:val="000000"/>
+                <w:sz w:val="18"/>
+              </w:rPr>
+              <w:t>Full-block interval</w:t>
+            </w:r>
+          </w:p>
+        </w:tc>
+      </w:tr>
+      <w:tr>
+        <w:tc>
+          <w:tcPr>
+            <w:tcW w:type="dxa" w:w="3816"/>
+            <w:vAlign w:val="center"/>
+            <w:tcBorders>
+              <w:top w:val="single" w:sz="4" w:color="D9D9D9"/>
+              <w:left w:val="single" w:sz="4" w:color="D9D9D9"/>
+              <w:bottom w:val="single" w:sz="4" w:color="D9D9D9"/>
+              <w:right w:val="single" w:sz="4" w:color="D9D9D9"/>
+            </w:tcBorders>
+            <w:shd w:fill="FFFFFF"/>
+            <w:tcMar>
+              <w:top w:w="75" w:type="dxa"/>
+              <w:left w:w="75" w:type="dxa"/>
+              <w:bottom w:w="75" w:type="dxa"/>
+              <w:right w:w="75" w:type="dxa"/>
+            </w:tcMar>
+          </w:tcPr>
+          <w:p>
+            <w:pPr>
+              <w:spacing w:after="20" w:line="240" w:lineRule="auto"/>
+            </w:pPr>
+            <w:r>
+              <w:rPr>
+                <w:b w:val="0"/>
+                <w:color w:val="000000"/>
+                <w:sz w:val="18"/>
+              </w:rPr>
+              <w:t>One round</w:t>
+            </w:r>
+          </w:p>
+        </w:tc>
+        <w:tc>
+          <w:tcPr>
+            <w:tcW w:type="dxa" w:w="1656"/>
+            <w:vAlign w:val="center"/>
+            <w:tcBorders>
+              <w:top w:val="single" w:sz="4" w:color="D9D9D9"/>
+              <w:left w:val="single" w:sz="4" w:color="D9D9D9"/>
+              <w:bottom w:val="single" w:sz="4" w:color="D9D9D9"/>
+              <w:right w:val="single" w:sz="4" w:color="D9D9D9"/>
+            </w:tcBorders>
+            <w:shd w:fill="FFFFFF"/>
+            <w:tcMar>
+              <w:top w:w="75" w:type="dxa"/>
+              <w:left w:w="75" w:type="dxa"/>
+              <w:bottom w:w="75" w:type="dxa"/>
+              <w:right w:w="75" w:type="dxa"/>
+            </w:tcMar>
+          </w:tcPr>
+          <w:p>
+            <w:pPr>
+              <w:spacing w:after="20" w:line="240" w:lineRule="auto"/>
+            </w:pPr>
+            <w:r>
+              <w:rPr>
+                <w:b w:val="0"/>
+                <w:color w:val="000000"/>
+                <w:sz w:val="18"/>
+              </w:rPr>
+              <w:t>801</w:t>
+            </w:r>
+          </w:p>
+        </w:tc>
+        <w:tc>
+          <w:tcPr>
+            <w:tcW w:type="dxa" w:w="2794"/>
+            <w:vAlign w:val="center"/>
+            <w:tcBorders>
+              <w:top w:val="single" w:sz="4" w:color="D9D9D9"/>
+              <w:left w:val="single" w:sz="4" w:color="D9D9D9"/>
+              <w:bottom w:val="single" w:sz="4" w:color="D9D9D9"/>
+              <w:right w:val="single" w:sz="4" w:color="D9D9D9"/>
+            </w:tcBorders>
+            <w:shd w:fill="FFFFFF"/>
+            <w:tcMar>
+              <w:top w:w="75" w:type="dxa"/>
+              <w:left w:w="75" w:type="dxa"/>
+              <w:bottom w:w="75" w:type="dxa"/>
+              <w:right w:w="75" w:type="dxa"/>
+            </w:tcMar>
+          </w:tcPr>
+          <w:p>
+            <w:pPr>
+              <w:spacing w:after="20" w:line="240" w:lineRule="auto"/>
+            </w:pPr>
+            <w:r>
+              <w:rPr>
+                <w:b w:val="0"/>
+                <w:color w:val="000000"/>
+                <w:sz w:val="18"/>
+              </w:rPr>
+              <w:t>1,231,521</w:t>
+            </w:r>
+          </w:p>
+        </w:tc>
+        <w:tc>
+          <w:tcPr>
+            <w:tcW w:type="dxa" w:w="2016"/>
+            <w:vAlign w:val="center"/>
+            <w:tcBorders>
+              <w:top w:val="single" w:sz="4" w:color="D9D9D9"/>
+              <w:left w:val="single" w:sz="4" w:color="D9D9D9"/>
+              <w:bottom w:val="single" w:sz="4" w:color="D9D9D9"/>
+              <w:right w:val="single" w:sz="4" w:color="D9D9D9"/>
+            </w:tcBorders>
+            <w:shd w:fill="FFFFFF"/>
+            <w:tcMar>
+              <w:top w:w="75" w:type="dxa"/>
+              <w:left w:w="75" w:type="dxa"/>
+              <w:bottom w:w="75" w:type="dxa"/>
+              <w:right w:w="75" w:type="dxa"/>
+            </w:tcMar>
+          </w:tcPr>
+          <w:p>
+            <w:pPr>
+              <w:spacing w:after="20" w:line="240" w:lineRule="auto"/>
+            </w:pPr>
+            <w:r>
+              <w:rPr>
+                <w:b w:val="0"/>
+                <w:color w:val="000000"/>
+                <w:sz w:val="18"/>
+              </w:rPr>
+              <w:t>12 clocks</w:t>
+            </w:r>
+          </w:p>
+        </w:tc>
+      </w:tr>
+      <w:tr>
+        <w:tc>
+          <w:tcPr>
+            <w:tcW w:type="dxa" w:w="3816"/>
+            <w:vAlign w:val="center"/>
+            <w:tcBorders>
+              <w:top w:val="single" w:sz="4" w:color="D9D9D9"/>
+              <w:left w:val="single" w:sz="4" w:color="D9D9D9"/>
+              <w:bottom w:val="single" w:sz="4" w:color="D9D9D9"/>
+              <w:right w:val="single" w:sz="4" w:color="D9D9D9"/>
+            </w:tcBorders>
+            <w:shd w:fill="F5F5F5"/>
+            <w:tcMar>
+              <w:top w:w="75" w:type="dxa"/>
+              <w:left w:w="75" w:type="dxa"/>
+              <w:bottom w:w="75" w:type="dxa"/>
+              <w:right w:w="75" w:type="dxa"/>
+            </w:tcMar>
+          </w:tcPr>
+          <w:p>
+            <w:pPr>
+              <w:spacing w:after="20" w:line="240" w:lineRule="auto"/>
+            </w:pPr>
+            <w:r>
+              <w:rPr>
+                <w:b w:val="0"/>
+                <w:color w:val="000000"/>
+                <w:sz w:val="18"/>
+              </w:rPr>
+              <w:t>Three rounds alone</w:t>
+            </w:r>
+          </w:p>
+        </w:tc>
+        <w:tc>
+          <w:tcPr>
+            <w:tcW w:type="dxa" w:w="1656"/>
+            <w:vAlign w:val="center"/>
+            <w:tcBorders>
+              <w:top w:val="single" w:sz="4" w:color="D9D9D9"/>
+              <w:left w:val="single" w:sz="4" w:color="D9D9D9"/>
+              <w:bottom w:val="single" w:sz="4" w:color="D9D9D9"/>
+              <w:right w:val="single" w:sz="4" w:color="D9D9D9"/>
+            </w:tcBorders>
+            <w:shd w:fill="F5F5F5"/>
+            <w:tcMar>
+              <w:top w:w="75" w:type="dxa"/>
+              <w:left w:w="75" w:type="dxa"/>
+              <w:bottom w:w="75" w:type="dxa"/>
+              <w:right w:w="75" w:type="dxa"/>
+            </w:tcMar>
+          </w:tcPr>
+          <w:p>
+            <w:pPr>
+              <w:spacing w:after="20" w:line="240" w:lineRule="auto"/>
+            </w:pPr>
+            <w:r>
+              <w:rPr>
+                <w:b w:val="0"/>
+                <w:color w:val="000000"/>
+                <w:sz w:val="18"/>
+              </w:rPr>
+              <w:t>465</w:t>
+            </w:r>
+          </w:p>
+        </w:tc>
+        <w:tc>
+          <w:tcPr>
+            <w:tcW w:type="dxa" w:w="2794"/>
+            <w:vAlign w:val="center"/>
+            <w:tcBorders>
+              <w:top w:val="single" w:sz="4" w:color="D9D9D9"/>
+              <w:left w:val="single" w:sz="4" w:color="D9D9D9"/>
+              <w:bottom w:val="single" w:sz="4" w:color="D9D9D9"/>
+              <w:right w:val="single" w:sz="4" w:color="D9D9D9"/>
+            </w:tcBorders>
+            <w:shd w:fill="F5F5F5"/>
+            <w:tcMar>
+              <w:top w:w="75" w:type="dxa"/>
+              <w:left w:w="75" w:type="dxa"/>
+              <w:bottom w:w="75" w:type="dxa"/>
+              <w:right w:w="75" w:type="dxa"/>
+            </w:tcMar>
+          </w:tcPr>
+          <w:p>
+            <w:pPr>
+              <w:spacing w:after="20" w:line="240" w:lineRule="auto"/>
+            </w:pPr>
+            <w:r>
+              <w:rPr>
+                <w:b w:val="0"/>
+                <w:color w:val="000000"/>
+                <w:sz w:val="18"/>
+              </w:rPr>
+              <w:t>718,385</w:t>
+            </w:r>
+          </w:p>
+        </w:tc>
+        <w:tc>
+          <w:tcPr>
+            <w:tcW w:type="dxa" w:w="2016"/>
+            <w:vAlign w:val="center"/>
+            <w:tcBorders>
+              <w:top w:val="single" w:sz="4" w:color="D9D9D9"/>
+              <w:left w:val="single" w:sz="4" w:color="D9D9D9"/>
+              <w:bottom w:val="single" w:sz="4" w:color="D9D9D9"/>
+              <w:right w:val="single" w:sz="4" w:color="D9D9D9"/>
+            </w:tcBorders>
+            <w:shd w:fill="F5F5F5"/>
+            <w:tcMar>
+              <w:top w:w="75" w:type="dxa"/>
+              <w:left w:w="75" w:type="dxa"/>
+              <w:bottom w:w="75" w:type="dxa"/>
+              <w:right w:w="75" w:type="dxa"/>
+            </w:tcMar>
+          </w:tcPr>
+          <w:p>
+            <w:pPr>
+              <w:spacing w:after="20" w:line="240" w:lineRule="auto"/>
+            </w:pPr>
+            <w:r>
+              <w:rPr>
+                <w:b w:val="0"/>
+                <w:color w:val="000000"/>
+                <w:sz w:val="18"/>
+              </w:rPr>
+              <w:t>7 clocks</w:t>
+            </w:r>
+          </w:p>
+        </w:tc>
+      </w:tr>
+      <w:tr>
+        <w:tc>
+          <w:tcPr>
+            <w:tcW w:type="dxa" w:w="3816"/>
+            <w:vAlign w:val="center"/>
+            <w:tcBorders>
+              <w:top w:val="single" w:sz="4" w:color="D9D9D9"/>
+              <w:left w:val="single" w:sz="4" w:color="D9D9D9"/>
+              <w:bottom w:val="single" w:sz="4" w:color="D9D9D9"/>
+              <w:right w:val="single" w:sz="4" w:color="D9D9D9"/>
+            </w:tcBorders>
+            <w:shd w:fill="FFFFFF"/>
+            <w:tcMar>
+              <w:top w:w="75" w:type="dxa"/>
+              <w:left w:w="75" w:type="dxa"/>
+              <w:bottom w:w="75" w:type="dxa"/>
+              <w:right w:w="75" w:type="dxa"/>
+            </w:tcMar>
+          </w:tcPr>
+          <w:p>
+            <w:pPr>
+              <w:spacing w:after="20" w:line="240" w:lineRule="auto"/>
+            </w:pPr>
+            <w:r>
+              <w:rPr>
+                <w:b w:val="0"/>
+                <w:color w:val="000000"/>
+                <w:sz w:val="18"/>
+              </w:rPr>
+              <w:t>Three rounds with queues and overlap</w:t>
+            </w:r>
+          </w:p>
+        </w:tc>
+        <w:tc>
+          <w:tcPr>
+            <w:tcW w:type="dxa" w:w="1656"/>
+            <w:vAlign w:val="center"/>
+            <w:tcBorders>
+              <w:top w:val="single" w:sz="4" w:color="D9D9D9"/>
+              <w:left w:val="single" w:sz="4" w:color="D9D9D9"/>
+              <w:bottom w:val="single" w:sz="4" w:color="D9D9D9"/>
+              <w:right w:val="single" w:sz="4" w:color="D9D9D9"/>
+            </w:tcBorders>
+            <w:shd w:fill="FFFFFF"/>
+            <w:tcMar>
+              <w:top w:w="75" w:type="dxa"/>
+              <w:left w:w="75" w:type="dxa"/>
+              <w:bottom w:w="75" w:type="dxa"/>
+              <w:right w:w="75" w:type="dxa"/>
+            </w:tcMar>
+          </w:tcPr>
+          <w:p>
+            <w:pPr>
+              <w:spacing w:after="20" w:line="240" w:lineRule="auto"/>
+            </w:pPr>
+            <w:r>
+              <w:rPr>
+                <w:b w:val="0"/>
+                <w:color w:val="000000"/>
+                <w:sz w:val="18"/>
+              </w:rPr>
+              <w:t>401</w:t>
+            </w:r>
+          </w:p>
+        </w:tc>
+        <w:tc>
+          <w:tcPr>
+            <w:tcW w:type="dxa" w:w="2794"/>
+            <w:vAlign w:val="center"/>
+            <w:tcBorders>
+              <w:top w:val="single" w:sz="4" w:color="D9D9D9"/>
+              <w:left w:val="single" w:sz="4" w:color="D9D9D9"/>
+              <w:bottom w:val="single" w:sz="4" w:color="D9D9D9"/>
+              <w:right w:val="single" w:sz="4" w:color="D9D9D9"/>
+            </w:tcBorders>
+            <w:shd w:fill="FFFFFF"/>
+            <w:tcMar>
+              <w:top w:w="75" w:type="dxa"/>
+              <w:left w:w="75" w:type="dxa"/>
+              <w:bottom w:w="75" w:type="dxa"/>
+              <w:right w:w="75" w:type="dxa"/>
+            </w:tcMar>
+          </w:tcPr>
+          <w:p>
+            <w:pPr>
+              <w:spacing w:after="20" w:line="240" w:lineRule="auto"/>
+            </w:pPr>
+            <w:r>
+              <w:rPr>
+                <w:b w:val="0"/>
+                <w:color w:val="000000"/>
+                <w:sz w:val="18"/>
+              </w:rPr>
+              <w:t>615,761</w:t>
+            </w:r>
+          </w:p>
+        </w:tc>
+        <w:tc>
+          <w:tcPr>
+            <w:tcW w:type="dxa" w:w="2016"/>
+            <w:vAlign w:val="center"/>
+            <w:tcBorders>
+              <w:top w:val="single" w:sz="4" w:color="D9D9D9"/>
+              <w:left w:val="single" w:sz="4" w:color="D9D9D9"/>
+              <w:bottom w:val="single" w:sz="4" w:color="D9D9D9"/>
+              <w:right w:val="single" w:sz="4" w:color="D9D9D9"/>
+            </w:tcBorders>
+            <w:shd w:fill="FFFFFF"/>
+            <w:tcMar>
+              <w:top w:w="75" w:type="dxa"/>
+              <w:left w:w="75" w:type="dxa"/>
+              <w:bottom w:w="75" w:type="dxa"/>
+              <w:right w:w="75" w:type="dxa"/>
+            </w:tcMar>
+          </w:tcPr>
+          <w:p>
+            <w:pPr>
+              <w:spacing w:after="20" w:line="240" w:lineRule="auto"/>
+            </w:pPr>
+            <w:r>
+              <w:rPr>
+                <w:b w:val="0"/>
+                <w:color w:val="000000"/>
+                <w:sz w:val="18"/>
+              </w:rPr>
+              <w:t>6 clocks</w:t>
+            </w:r>
+          </w:p>
+        </w:tc>
+      </w:tr>
+    </w:tbl>
+    <w:p>
+      <w:pPr>
+        <w:spacing w:after="0"/>
+      </w:pPr>
+    </w:p>
+    <w:p>
+      <w:pPr>
+        <w:keepNext w:val="0"/>
+        <w:spacing w:before="40" w:after="80"/>
+        <w:jc w:val="center"/>
+      </w:pPr>
+      <w:r>
+        <w:rPr>
+          <w:sz w:val="17"/>
+        </w:rPr>
+        <w:t>Table VIII. Separate complete small-LLaMA payload comparison from October 20, 2026. These are measured simulation counts, not estimates for the adapter file.</w:t>
+      </w:r>
+    </w:p>
+    <w:p>
+      <w:pPr>
+        <w:spacing w:after="60" w:line="245" w:lineRule="auto"/>
+        <w:ind w:firstLine="317"/>
+        <w:jc w:val="both"/>
+      </w:pPr>
+      <w:r>
+        <w:t>The adapter comparison does not separately measure three-round unrolling alone. Table VIII isolates that stage on another complete payload. Under a 1 KiB schedule with associated data, input gaps and output stalls, buffering reduced three-round cycles from 862 to 581. With always-ready traffic it added two clocks of first-output latency but reduced block spacing from seven clocks to six. Three clocks of the remaining six execute p8 round groups; request, completion and block-handling overhead remain. This explains why tripling round execution per clock gives approximately twice the complete-file throughput.</w:t>
+      </w:r>
+    </w:p>
+    <w:p>
+      <w:pPr>
+        <w:keepNext/>
+        <w:spacing w:before="100" w:after="40"/>
+      </w:pPr>
+      <w:r>
+        <w:rPr>
+          <w:b/>
+          <w:sz w:val="21"/>
+        </w:rPr>
+        <w:t>D. Routed timing and physical evidence</w:t>
+      </w:r>
+    </w:p>
+    <w:tbl>
+      <w:tblPr>
+        <w:tblW w:type="auto" w:w="0"/>
+        <w:jc w:val="center"/>
+        <w:tblLayout w:type="fixed"/>
+        <w:tblLook w:firstColumn="1" w:firstRow="1" w:lastColumn="0" w:lastRow="0" w:noHBand="0" w:noVBand="1" w:val="04A0"/>
+      </w:tblPr>
+      <w:tblGrid>
+        <w:gridCol w:w="4536"/>
+        <w:gridCol w:w="2290"/>
+        <w:gridCol w:w="1728"/>
+        <w:gridCol w:w="1728"/>
+      </w:tblGrid>
+      <w:tr>
+        <w:trPr>
+          <w:tblHeader/>
+        </w:trPr>
+        <w:tc>
+          <w:tcPr>
+            <w:tcW w:type="dxa" w:w="4536"/>
+            <w:vAlign w:val="center"/>
+            <w:tcBorders>
+              <w:top w:val="single" w:sz="4" w:color="D9D9D9"/>
+              <w:left w:val="single" w:sz="4" w:color="D9D9D9"/>
+              <w:bottom w:val="single" w:sz="4" w:color="D9D9D9"/>
+              <w:right w:val="single" w:sz="4" w:color="D9D9D9"/>
+            </w:tcBorders>
+            <w:shd w:fill="E7E6E6"/>
+            <w:tcMar>
+              <w:top w:w="75" w:type="dxa"/>
+              <w:left w:w="75" w:type="dxa"/>
+              <w:bottom w:w="75" w:type="dxa"/>
+              <w:right w:w="75" w:type="dxa"/>
+            </w:tcMar>
+          </w:tcPr>
+          <w:p>
+            <w:pPr>
+              <w:spacing w:after="20" w:line="240" w:lineRule="auto"/>
+            </w:pPr>
+            <w:r>
+              <w:rPr>
+                <w:b/>
+                <w:color w:val="000000"/>
+                <w:sz w:val="18"/>
+              </w:rPr>
+              <w:t>Core-only configuration</w:t>
+            </w:r>
+          </w:p>
+        </w:tc>
+        <w:tc>
+          <w:tcPr>
+            <w:tcW w:type="dxa" w:w="2290"/>
+            <w:vAlign w:val="center"/>
+            <w:tcBorders>
+              <w:top w:val="single" w:sz="4" w:color="D9D9D9"/>
+              <w:left w:val="single" w:sz="4" w:color="D9D9D9"/>
+              <w:bottom w:val="single" w:sz="4" w:color="D9D9D9"/>
+              <w:right w:val="single" w:sz="4" w:color="D9D9D9"/>
+            </w:tcBorders>
+            <w:shd w:fill="E7E6E6"/>
+            <w:tcMar>
+              <w:top w:w="75" w:type="dxa"/>
+              <w:left w:w="75" w:type="dxa"/>
+              <w:bottom w:w="75" w:type="dxa"/>
+              <w:right w:w="75" w:type="dxa"/>
+            </w:tcMar>
+          </w:tcPr>
+          <w:p>
+            <w:pPr>
+              <w:spacing w:after="20" w:line="240" w:lineRule="auto"/>
+            </w:pPr>
+            <w:r>
+              <w:rPr>
+                <w:b/>
+                <w:color w:val="000000"/>
+                <w:sz w:val="18"/>
+              </w:rPr>
+              <w:t>Setup / hold ns</w:t>
+            </w:r>
+          </w:p>
+        </w:tc>
+        <w:tc>
+          <w:tcPr>
+            <w:tcW w:type="dxa" w:w="1728"/>
+            <w:vAlign w:val="center"/>
+            <w:tcBorders>
+              <w:top w:val="single" w:sz="4" w:color="D9D9D9"/>
+              <w:left w:val="single" w:sz="4" w:color="D9D9D9"/>
+              <w:bottom w:val="single" w:sz="4" w:color="D9D9D9"/>
+              <w:right w:val="single" w:sz="4" w:color="D9D9D9"/>
+            </w:tcBorders>
+            <w:shd w:fill="E7E6E6"/>
+            <w:tcMar>
+              <w:top w:w="75" w:type="dxa"/>
+              <w:left w:w="75" w:type="dxa"/>
+              <w:bottom w:w="75" w:type="dxa"/>
+              <w:right w:w="75" w:type="dxa"/>
+            </w:tcMar>
+          </w:tcPr>
+          <w:p>
+            <w:pPr>
+              <w:spacing w:after="20" w:line="240" w:lineRule="auto"/>
+            </w:pPr>
+            <w:r>
+              <w:rPr>
+                <w:b/>
+                <w:color w:val="000000"/>
+                <w:sz w:val="18"/>
+              </w:rPr>
+              <w:t>LUTs</w:t>
+            </w:r>
+          </w:p>
+        </w:tc>
+        <w:tc>
+          <w:tcPr>
+            <w:tcW w:type="dxa" w:w="1728"/>
+            <w:vAlign w:val="center"/>
+            <w:tcBorders>
+              <w:top w:val="single" w:sz="4" w:color="D9D9D9"/>
+              <w:left w:val="single" w:sz="4" w:color="D9D9D9"/>
+              <w:bottom w:val="single" w:sz="4" w:color="D9D9D9"/>
+              <w:right w:val="single" w:sz="4" w:color="D9D9D9"/>
+            </w:tcBorders>
+            <w:shd w:fill="E7E6E6"/>
+            <w:tcMar>
+              <w:top w:w="75" w:type="dxa"/>
+              <w:left w:w="75" w:type="dxa"/>
+              <w:bottom w:w="75" w:type="dxa"/>
+              <w:right w:w="75" w:type="dxa"/>
+            </w:tcMar>
+          </w:tcPr>
+          <w:p>
+            <w:pPr>
+              <w:spacing w:after="20" w:line="240" w:lineRule="auto"/>
+            </w:pPr>
+            <w:r>
+              <w:rPr>
+                <w:b/>
+                <w:color w:val="000000"/>
+                <w:sz w:val="18"/>
+              </w:rPr>
+              <w:t>Registers</w:t>
+            </w:r>
+          </w:p>
+        </w:tc>
+      </w:tr>
+      <w:tr>
+        <w:tc>
+          <w:tcPr>
+            <w:tcW w:type="dxa" w:w="4536"/>
+            <w:vAlign w:val="center"/>
+            <w:tcBorders>
+              <w:top w:val="single" w:sz="4" w:color="D9D9D9"/>
+              <w:left w:val="single" w:sz="4" w:color="D9D9D9"/>
+              <w:bottom w:val="single" w:sz="4" w:color="D9D9D9"/>
+              <w:right w:val="single" w:sz="4" w:color="D9D9D9"/>
+            </w:tcBorders>
+            <w:shd w:fill="FFFFFF"/>
+            <w:tcMar>
+              <w:top w:w="75" w:type="dxa"/>
+              <w:left w:w="75" w:type="dxa"/>
+              <w:bottom w:w="75" w:type="dxa"/>
+              <w:right w:w="75" w:type="dxa"/>
+            </w:tcMar>
+          </w:tcPr>
+          <w:p>
+            <w:pPr>
+              <w:spacing w:after="20" w:line="240" w:lineRule="auto"/>
+            </w:pPr>
+            <w:r>
+              <w:rPr>
+                <w:b w:val="0"/>
+                <w:color w:val="000000"/>
+                <w:sz w:val="18"/>
+              </w:rPr>
+              <w:t>One round</w:t>
+            </w:r>
+          </w:p>
+        </w:tc>
+        <w:tc>
+          <w:tcPr>
+            <w:tcW w:type="dxa" w:w="2290"/>
+            <w:vAlign w:val="center"/>
+            <w:tcBorders>
+              <w:top w:val="single" w:sz="4" w:color="D9D9D9"/>
+              <w:left w:val="single" w:sz="4" w:color="D9D9D9"/>
+              <w:bottom w:val="single" w:sz="4" w:color="D9D9D9"/>
+              <w:right w:val="single" w:sz="4" w:color="D9D9D9"/>
+            </w:tcBorders>
+            <w:shd w:fill="FFFFFF"/>
+            <w:tcMar>
+              <w:top w:w="75" w:type="dxa"/>
+              <w:left w:w="75" w:type="dxa"/>
+              <w:bottom w:w="75" w:type="dxa"/>
+              <w:right w:w="75" w:type="dxa"/>
+            </w:tcMar>
+          </w:tcPr>
+          <w:p>
+            <w:pPr>
+              <w:spacing w:after="20" w:line="240" w:lineRule="auto"/>
+            </w:pPr>
+            <w:r>
+              <w:rPr>
+                <w:b w:val="0"/>
+                <w:color w:val="000000"/>
+                <w:sz w:val="18"/>
+              </w:rPr>
+              <w:t>+2.914 / +0.147</w:t>
+            </w:r>
+          </w:p>
+        </w:tc>
+        <w:tc>
+          <w:tcPr>
+            <w:tcW w:type="dxa" w:w="1728"/>
+            <w:vAlign w:val="center"/>
+            <w:tcBorders>
+              <w:top w:val="single" w:sz="4" w:color="D9D9D9"/>
+              <w:left w:val="single" w:sz="4" w:color="D9D9D9"/>
+              <w:bottom w:val="single" w:sz="4" w:color="D9D9D9"/>
+              <w:right w:val="single" w:sz="4" w:color="D9D9D9"/>
+            </w:tcBorders>
+            <w:shd w:fill="FFFFFF"/>
+            <w:tcMar>
+              <w:top w:w="75" w:type="dxa"/>
+              <w:left w:w="75" w:type="dxa"/>
+              <w:bottom w:w="75" w:type="dxa"/>
+              <w:right w:w="75" w:type="dxa"/>
+            </w:tcMar>
+          </w:tcPr>
+          <w:p>
+            <w:pPr>
+              <w:spacing w:after="20" w:line="240" w:lineRule="auto"/>
+            </w:pPr>
+            <w:r>
+              <w:rPr>
+                <w:b w:val="0"/>
+                <w:color w:val="000000"/>
+                <w:sz w:val="18"/>
+              </w:rPr>
+              <w:t>1,894</w:t>
+            </w:r>
+          </w:p>
+        </w:tc>
+        <w:tc>
+          <w:tcPr>
+            <w:tcW w:type="dxa" w:w="1728"/>
+            <w:vAlign w:val="center"/>
+            <w:tcBorders>
+              <w:top w:val="single" w:sz="4" w:color="D9D9D9"/>
+              <w:left w:val="single" w:sz="4" w:color="D9D9D9"/>
+              <w:bottom w:val="single" w:sz="4" w:color="D9D9D9"/>
+              <w:right w:val="single" w:sz="4" w:color="D9D9D9"/>
+            </w:tcBorders>
+            <w:shd w:fill="FFFFFF"/>
+            <w:tcMar>
+              <w:top w:w="75" w:type="dxa"/>
+              <w:left w:w="75" w:type="dxa"/>
+              <w:bottom w:w="75" w:type="dxa"/>
+              <w:right w:w="75" w:type="dxa"/>
+            </w:tcMar>
+          </w:tcPr>
+          <w:p>
+            <w:pPr>
+              <w:spacing w:after="20" w:line="240" w:lineRule="auto"/>
+            </w:pPr>
+            <w:r>
+              <w:rPr>
+                <w:b w:val="0"/>
+                <w:color w:val="000000"/>
+                <w:sz w:val="18"/>
+              </w:rPr>
+              <w:t>1,081</w:t>
+            </w:r>
+          </w:p>
+        </w:tc>
+      </w:tr>
+      <w:tr>
+        <w:tc>
+          <w:tcPr>
+            <w:tcW w:type="dxa" w:w="4536"/>
+            <w:vAlign w:val="center"/>
+            <w:tcBorders>
+              <w:top w:val="single" w:sz="4" w:color="D9D9D9"/>
+              <w:left w:val="single" w:sz="4" w:color="D9D9D9"/>
+              <w:bottom w:val="single" w:sz="4" w:color="D9D9D9"/>
+              <w:right w:val="single" w:sz="4" w:color="D9D9D9"/>
+            </w:tcBorders>
+            <w:shd w:fill="F5F5F5"/>
+            <w:tcMar>
+              <w:top w:w="75" w:type="dxa"/>
+              <w:left w:w="75" w:type="dxa"/>
+              <w:bottom w:w="75" w:type="dxa"/>
+              <w:right w:w="75" w:type="dxa"/>
+            </w:tcMar>
+          </w:tcPr>
+          <w:p>
+            <w:pPr>
+              <w:spacing w:after="20" w:line="240" w:lineRule="auto"/>
+            </w:pPr>
+            <w:r>
+              <w:rPr>
+                <w:b w:val="0"/>
+                <w:color w:val="000000"/>
+                <w:sz w:val="18"/>
+              </w:rPr>
+              <w:t>Three rounds alone</w:t>
+            </w:r>
+          </w:p>
+        </w:tc>
+        <w:tc>
+          <w:tcPr>
+            <w:tcW w:type="dxa" w:w="2290"/>
+            <w:vAlign w:val="center"/>
+            <w:tcBorders>
+              <w:top w:val="single" w:sz="4" w:color="D9D9D9"/>
+              <w:left w:val="single" w:sz="4" w:color="D9D9D9"/>
+              <w:bottom w:val="single" w:sz="4" w:color="D9D9D9"/>
+              <w:right w:val="single" w:sz="4" w:color="D9D9D9"/>
+            </w:tcBorders>
+            <w:shd w:fill="F5F5F5"/>
+            <w:tcMar>
+              <w:top w:w="75" w:type="dxa"/>
+              <w:left w:w="75" w:type="dxa"/>
+              <w:bottom w:w="75" w:type="dxa"/>
+              <w:right w:w="75" w:type="dxa"/>
+            </w:tcMar>
+          </w:tcPr>
+          <w:p>
+            <w:pPr>
+              <w:spacing w:after="20" w:line="240" w:lineRule="auto"/>
+            </w:pPr>
+            <w:r>
+              <w:rPr>
+                <w:b w:val="0"/>
+                <w:color w:val="000000"/>
+                <w:sz w:val="18"/>
+              </w:rPr>
+              <w:t>+0.125 / +0.152</w:t>
+            </w:r>
+          </w:p>
+        </w:tc>
+        <w:tc>
+          <w:tcPr>
+            <w:tcW w:type="dxa" w:w="1728"/>
+            <w:vAlign w:val="center"/>
+            <w:tcBorders>
+              <w:top w:val="single" w:sz="4" w:color="D9D9D9"/>
+              <w:left w:val="single" w:sz="4" w:color="D9D9D9"/>
+              <w:bottom w:val="single" w:sz="4" w:color="D9D9D9"/>
+              <w:right w:val="single" w:sz="4" w:color="D9D9D9"/>
+            </w:tcBorders>
+            <w:shd w:fill="F5F5F5"/>
+            <w:tcMar>
+              <w:top w:w="75" w:type="dxa"/>
+              <w:left w:w="75" w:type="dxa"/>
+              <w:bottom w:w="75" w:type="dxa"/>
+              <w:right w:w="75" w:type="dxa"/>
+            </w:tcMar>
+          </w:tcPr>
+          <w:p>
+            <w:pPr>
+              <w:spacing w:after="20" w:line="240" w:lineRule="auto"/>
+            </w:pPr>
+            <w:r>
+              <w:rPr>
+                <w:b w:val="0"/>
+                <w:color w:val="000000"/>
+                <w:sz w:val="18"/>
+              </w:rPr>
+              <w:t>3,192</w:t>
+            </w:r>
+          </w:p>
+        </w:tc>
+        <w:tc>
+          <w:tcPr>
+            <w:tcW w:type="dxa" w:w="1728"/>
+            <w:vAlign w:val="center"/>
+            <w:tcBorders>
+              <w:top w:val="single" w:sz="4" w:color="D9D9D9"/>
+              <w:left w:val="single" w:sz="4" w:color="D9D9D9"/>
+              <w:bottom w:val="single" w:sz="4" w:color="D9D9D9"/>
+              <w:right w:val="single" w:sz="4" w:color="D9D9D9"/>
+            </w:tcBorders>
+            <w:shd w:fill="F5F5F5"/>
+            <w:tcMar>
+              <w:top w:w="75" w:type="dxa"/>
+              <w:left w:w="75" w:type="dxa"/>
+              <w:bottom w:w="75" w:type="dxa"/>
+              <w:right w:w="75" w:type="dxa"/>
+            </w:tcMar>
+          </w:tcPr>
+          <w:p>
+            <w:pPr>
+              <w:spacing w:after="20" w:line="240" w:lineRule="auto"/>
+            </w:pPr>
+            <w:r>
+              <w:rPr>
+                <w:b w:val="0"/>
+                <w:color w:val="000000"/>
+                <w:sz w:val="18"/>
+              </w:rPr>
+              <w:t>1,088</w:t>
+            </w:r>
+          </w:p>
+        </w:tc>
+      </w:tr>
+      <w:tr>
+        <w:tc>
+          <w:tcPr>
+            <w:tcW w:type="dxa" w:w="4536"/>
+            <w:vAlign w:val="center"/>
+            <w:tcBorders>
+              <w:top w:val="single" w:sz="4" w:color="D9D9D9"/>
+              <w:left w:val="single" w:sz="4" w:color="D9D9D9"/>
+              <w:bottom w:val="single" w:sz="4" w:color="D9D9D9"/>
+              <w:right w:val="single" w:sz="4" w:color="D9D9D9"/>
+            </w:tcBorders>
+            <w:shd w:fill="FFFFFF"/>
+            <w:tcMar>
+              <w:top w:w="75" w:type="dxa"/>
+              <w:left w:w="75" w:type="dxa"/>
+              <w:bottom w:w="75" w:type="dxa"/>
+              <w:right w:w="75" w:type="dxa"/>
+            </w:tcMar>
+          </w:tcPr>
+          <w:p>
+            <w:pPr>
+              <w:spacing w:after="20" w:line="240" w:lineRule="auto"/>
+            </w:pPr>
+            <w:r>
+              <w:rPr>
+                <w:b w:val="0"/>
+                <w:color w:val="000000"/>
+                <w:sz w:val="18"/>
+              </w:rPr>
+              <w:t>Three rounds with queues and overlap</w:t>
+            </w:r>
+          </w:p>
+        </w:tc>
+        <w:tc>
+          <w:tcPr>
+            <w:tcW w:type="dxa" w:w="2290"/>
+            <w:vAlign w:val="center"/>
+            <w:tcBorders>
+              <w:top w:val="single" w:sz="4" w:color="D9D9D9"/>
+              <w:left w:val="single" w:sz="4" w:color="D9D9D9"/>
+              <w:bottom w:val="single" w:sz="4" w:color="D9D9D9"/>
+              <w:right w:val="single" w:sz="4" w:color="D9D9D9"/>
+            </w:tcBorders>
+            <w:shd w:fill="FFFFFF"/>
+            <w:tcMar>
+              <w:top w:w="75" w:type="dxa"/>
+              <w:left w:w="75" w:type="dxa"/>
+              <w:bottom w:w="75" w:type="dxa"/>
+              <w:right w:w="75" w:type="dxa"/>
+            </w:tcMar>
+          </w:tcPr>
+          <w:p>
+            <w:pPr>
+              <w:spacing w:after="20" w:line="240" w:lineRule="auto"/>
+            </w:pPr>
+            <w:r>
+              <w:rPr>
+                <w:b w:val="0"/>
+                <w:color w:val="000000"/>
+                <w:sz w:val="18"/>
+              </w:rPr>
+              <w:t>+0.038 / +0.144</w:t>
+            </w:r>
+          </w:p>
+        </w:tc>
+        <w:tc>
+          <w:tcPr>
+            <w:tcW w:type="dxa" w:w="1728"/>
+            <w:vAlign w:val="center"/>
+            <w:tcBorders>
+              <w:top w:val="single" w:sz="4" w:color="D9D9D9"/>
+              <w:left w:val="single" w:sz="4" w:color="D9D9D9"/>
+              <w:bottom w:val="single" w:sz="4" w:color="D9D9D9"/>
+              <w:right w:val="single" w:sz="4" w:color="D9D9D9"/>
+            </w:tcBorders>
+            <w:shd w:fill="FFFFFF"/>
+            <w:tcMar>
+              <w:top w:w="75" w:type="dxa"/>
+              <w:left w:w="75" w:type="dxa"/>
+              <w:bottom w:w="75" w:type="dxa"/>
+              <w:right w:w="75" w:type="dxa"/>
+            </w:tcMar>
+          </w:tcPr>
+          <w:p>
+            <w:pPr>
+              <w:spacing w:after="20" w:line="240" w:lineRule="auto"/>
+            </w:pPr>
+            <w:r>
+              <w:rPr>
+                <w:b w:val="0"/>
+                <w:color w:val="000000"/>
+                <w:sz w:val="18"/>
+              </w:rPr>
+              <w:t>3,708</w:t>
+            </w:r>
+          </w:p>
+        </w:tc>
+        <w:tc>
+          <w:tcPr>
+            <w:tcW w:type="dxa" w:w="1728"/>
+            <w:vAlign w:val="center"/>
+            <w:tcBorders>
+              <w:top w:val="single" w:sz="4" w:color="D9D9D9"/>
+              <w:left w:val="single" w:sz="4" w:color="D9D9D9"/>
+              <w:bottom w:val="single" w:sz="4" w:color="D9D9D9"/>
+              <w:right w:val="single" w:sz="4" w:color="D9D9D9"/>
+            </w:tcBorders>
+            <w:shd w:fill="FFFFFF"/>
+            <w:tcMar>
+              <w:top w:w="75" w:type="dxa"/>
+              <w:left w:w="75" w:type="dxa"/>
+              <w:bottom w:w="75" w:type="dxa"/>
+              <w:right w:w="75" w:type="dxa"/>
+            </w:tcMar>
+          </w:tcPr>
+          <w:p>
+            <w:pPr>
+              <w:spacing w:after="20" w:line="240" w:lineRule="auto"/>
+            </w:pPr>
+            <w:r>
+              <w:rPr>
+                <w:b w:val="0"/>
+                <w:color w:val="000000"/>
+                <w:sz w:val="18"/>
+              </w:rPr>
+              <w:t>1,680</w:t>
+            </w:r>
+          </w:p>
+        </w:tc>
+      </w:tr>
+    </w:tbl>
+    <w:p>
+      <w:pPr>
+        <w:spacing w:after="0"/>
+      </w:pPr>
+    </w:p>
+    <w:p>
+      <w:pPr>
+        <w:keepNext w:val="0"/>
+        <w:spacing w:before="40" w:after="80"/>
+        <w:jc w:val="center"/>
+      </w:pPr>
+      <w:r>
+        <w:rPr>
+          <w:sz w:val="17"/>
+        </w:rPr>
+        <w:t>Table IX. Vivado routed core-only results for xc7a100tcsg324-1 with a 10 ns clock. External I/O paths were unconstrained; these are internal core timing results.</w:t>
+      </w:r>
+    </w:p>
+    <w:p>
+      <w:pPr>
+        <w:spacing w:after="60" w:line="245" w:lineRule="auto"/>
+        <w:ind w:firstLine="317"/>
+        <w:jc w:val="both"/>
+      </w:pPr>
+      <w:r>
+        <w:t>The final board-integrated design contains separate demo and self-test cores plus ILA. It closed at 83.333 MHz with +1.110 ns setup and +0.024 ns hold slack, using 9,503 LUTs and 6,510 registers. Its MMCM generates a 12 ns clock from the board’s 100 MHz reference. An earlier board trial at 100 MHz failed setup at -0.130 ns; it predates the final demo fix and is not a timing result for the final source. The core-only 38 ps setup margin does not establish 100 MHz board closure.</w:t>
+      </w:r>
+    </w:p>
+    <w:p>
+      <w:pPr>
+        <w:spacing w:after="60" w:line="245" w:lineRule="auto"/>
+        <w:ind w:firstLine="317"/>
+        <w:jc w:val="both"/>
+      </w:pPr>
+      <w:r>
+        <w:t>Physical JTAG ILA captures on the confirmed Nexys A7-100T show completion/pass with no failure for 18 core self-test cases and eight demo vector/mode pairs. Latched counts were 1,161 and 274 cycles respectively, matching simulation. These captured bounded fixtures establish more than programming success, but do not establish full adapter transport or physical weight throughput. Complete adapter recovery remains simulation evidence. Full-file board testing would require a host transport beyond this core.</w:t>
+      </w:r>
+    </w:p>
+    <w:p>
+      <w:pPr>
+        <w:keepNext/>
+        <w:spacing w:before="100" w:after="40"/>
+      </w:pPr>
+      <w:r>
+        <w:rPr>
+          <w:b/>
+          <w:sz w:val="21"/>
+        </w:rPr>
+        <w:t>E. Reproduction and remaining bottlenecks</w:t>
+      </w:r>
+    </w:p>
+    <w:p>
+      <w:pPr>
+        <w:spacing w:after="60" w:line="245" w:lineRule="auto"/>
+        <w:ind w:firstLine="317"/>
+        <w:jc w:val="both"/>
+      </w:pPr>
+      <w:r>
+        <w:t>The new verification/simulate_adapter.py runner validates the export manifest and optional original checkpoint, then freezes unchanged origin/main and buffered candidate sources and runs the 1 KiB prefix and complete file at 10 ns. It checks all output/tag bytes and authenticated recovery, publishes recovered files only after PASS, reconstructs the checkpoint when supplied, and records source hashes, nonces and cycle counts. paper/evidence/adapter_100mhz_20261021 contains compact reports, manifests and simulation logs. docs/evidence/weight_stream_3rpc contains the wider protocol, implementation and hardware evidence. Binary weights, full dumps, simulator projects and bitstreams remain local.</w:t>
+      </w:r>
+    </w:p>
+    <w:p>
+      <w:pPr>
+        <w:spacing w:after="60" w:line="245" w:lineRule="auto"/>
+        <w:ind w:firstLine="317"/>
+        <w:jc w:val="both"/>
+      </w:pPr>
+      <w:r>
+        <w:t>Subsequent research could test absorption directly on permutation completion and determine whether the reduced controller overhead outweighs added critical-path delay. Parallel independent-message lanes need separate cryptographic contexts and bandwidth arbitration. Memory bursts need bus/DMA and memory-controller integration. Lossless compression needs a codec, framing, metadata and exact reconstruction, with a measured ratio on actual weights. None is included here; the present measurements first establish the benefit of buffering and controller scheduling.</w:t>
+      </w:r>
+    </w:p>
+    <w:p>
+      <w:r>
+        <w:br w:type="page"/>
+      </w:r>
+    </w:p>
+    <w:p>
+      <w:pPr>
+        <w:keepNext/>
+        <w:spacing w:before="100" w:after="40"/>
+      </w:pPr>
+      <w:r>
+        <w:rPr>
+          <w:b/>
+          <w:sz w:val="21"/>
+        </w:rPr>
+        <w:t>XIV. Limitations and next work</w:t>
+      </w:r>
+    </w:p>
+    <w:p>
+      <w:pPr>
+        <w:spacing w:after="60" w:line="245" w:lineRule="auto"/>
+        <w:ind w:firstLine="317"/>
+        <w:jc w:val="both"/>
+      </w:pPr>
+      <w:r>
+        <w:t>This version is an unprotected cryptographic core. It does not prevent power or electromagnetic side-channel analysis, and it does not detect injected faults. Kandi et al. describe threshold and redundancy-based hardware options that could be studied in subsequent work [3]. Section XIII measures the implemented unrolling and buffering tradeoff. Independent lanes, memory transport and lossless compression remain separate experiments requiring additional interfaces and components. The external quarantine buffer is also a required part of safe decryption, not an optional application feature.</w:t>
+      </w:r>
+    </w:p>
+    <w:p>
+      <w:pPr>
+        <w:keepNext/>
+        <w:spacing w:before="100" w:after="40"/>
+      </w:pPr>
+      <w:r>
+        <w:rPr>
+          <w:b/>
+          <w:sz w:val="21"/>
+        </w:rPr>
+        <w:t>XV. Conclusion</w:t>
+      </w:r>
+    </w:p>
+    <w:p>
+      <w:pPr>
+        <w:spacing w:after="60" w:line="245" w:lineRule="auto"/>
+        <w:ind w:firstLine="317"/>
+        <w:jc w:val="both"/>
+      </w:pPr>
+      <w:r>
+        <w:t>The configurable Ascon-AEAD128 core preserves standard round counts, exact byte recovery and authentication while reducing complete adapter simulation cycles by approximately 50%. At a simulated 100 MHz, all 2,397,696 adapter bytes encrypt or decrypt in 899,153 cycles (8.99153 ms), versus 1,798,305 cycles for the unchanged one-round baseline. All three configurations pass official encryption/decryption vectors and the added buffered protocol tests. Core-only routed timing closes at 100 MHz with a narrow candidate margin; the final board-integrated design closes at 83.333 MHz and passes captured self-test and demo fixtures. These are distinct evidence scopes. Full adapter transport on hardware and whole GPT-2 checkpoint encryption remain future work. The earlier GPT-2 slice experiment separately established unchanged inference after exact recovery of its tested 1 KiB slice.</w:t>
       </w:r>
     </w:p>
     <w:p>
@@ -6784,6 +8552,19 @@
           <w:sz w:val="16"/>
         </w:rPr>
         <w:t>[12] OpenTitan, “Ascon: Theory of Operation.” [Online]. Available: https://opentitan.org/book/hw/ip/ascon/doc/theory_of_operation.html. Accessed Oct. 6, 2026.</w:t>
+      </w:r>
+    </w:p>
+    <w:p>
+      <w:pPr>
+        <w:spacing w:after="30"/>
+        <w:ind w:left="317" w:hanging="317"/>
+        <w:jc w:val="left"/>
+      </w:pPr>
+      <w:r>
+        <w:rPr>
+          <w:sz w:val="16"/>
+        </w:rPr>
+        <w:t>[13] C. E. LaForest, “Rules for Ready/Valid Handshakes and Synchronization,” FPGA Design Elements. [Online]. Available: https://fpgacpu.ca/fpga/handshake.html. Accessed Oct. 21, 2026.</w:t>
       </w:r>
     </w:p>
     <w:p>

</xml_diff>

<commit_message>
Add folded Ascon absorption and document verified security fixes
</commit_message>
<xml_diff>
--- a/paper/VHDL_Implementation_of_NIST_Ascon_AEAD128_on_a_Nexys_A7_FPGA.docx
+++ b/paper/VHDL_Implementation_of_NIST_Ascon_AEAD128_on_a_Nexys_A7_FPGA.docx
@@ -56,7 +56,7 @@
         <w:jc w:val="both"/>
       </w:pPr>
       <w:r>
-        <w:t>This paper describes a VHDL-2008 implementation of the standardized NIST Ascon-AEAD128 algorithm for a Nexys A7 100T FPGA. The design uses one shared 320-bit permutation datapath with configurable round unrolling and optional input/output queues. A 128-bit streaming interface accepts associated data and payload bytes, including empty and partial blocks. Encryption returns ciphertext and a tag. Decryption returns provisional plaintext that an external quarantine releases only after tag verification. The portable test flow passed all 1,089 official known-answer vectors in both directions with GHDL and Vivado XSim. Generated Verilog was also checked with Icarus Verilog and Verilator. Vivado 2023.2 completed synthesis, placement, routing, timing analysis, and bitstream generation. At a simulated 100 MHz, the complete 2,397,696-byte FP32 adapter payload encrypts and decrypts in 899,153 cycles per direction with three rounds and buffering, compared with 1,798,305 for the one-round baseline: approximately twice the throughput. All recovered bytes match and authentication passes. Core-only routed timing closes at 100 MHz; the final board wrapper closes at 83.333 MHz and passes captured self-test and demo fixtures. Full-payload throughput remains a behavioral simulation result, separate from physical board validation.</w:t>
+        <w:t>This paper describes a VHDL-2008 implementation of the standardized NIST Ascon-AEAD128 algorithm for a Nexys A7 100T FPGA. The design uses one shared 320-bit permutation datapath with configurable round unrolling and optional input/output queues. A 128-bit streaming interface accepts associated data and payload bytes, including empty and partial blocks. Encryption returns ciphertext and a tag. Decryption returns provisional plaintext that an external quarantine releases only after tag verification. The portable test flow passed all 1,089 official known-answer vectors in both directions with GHDL and Vivado XSim. Generated Verilog was also checked with Icarus Verilog and Verilator. Vivado 2023.2 completed synthesis, placement, routing, timing analysis, and bitstream generation. At a simulated 100 MHz, the complete 2,397,696-byte FP32 adapter payload encrypts and decrypts in 449,581 cycles per direction with folded absorption, compared with 899,153 for the buffered three-round core and 1,798,305 for the one-round baseline. All recovered bytes match and authentication passes. The folded core routes at 100 MHz with unconstrained external I/O; a board-integrated copy also meets 100 MHz in one run. Earlier physical captures validate only the buffered design. The folded core has not been programmed or measured on hardware. Section XIV separates these evidence scopes and documents the later AD padding and decryption tag output fixes.</w:t>
       </w:r>
     </w:p>
     <w:p>
@@ -318,7 +318,7 @@
           <w:b/>
           <w:sz w:val="21"/>
         </w:rPr>
-        <w:t>III. Hardware architecture</w:t>
+        <w:t>III. Original hardware architecture</w:t>
       </w:r>
     </w:p>
     <w:p>
@@ -428,7 +428,7 @@
           <w:b/>
           <w:sz w:val="21"/>
         </w:rPr>
-        <w:t>V. Controller and verification</w:t>
+        <w:t>V. Original controller and verification</w:t>
       </w:r>
     </w:p>
     <w:p>
@@ -6591,7 +6591,7 @@
           <w:b/>
           <w:sz w:val="21"/>
         </w:rPr>
-        <w:t>XIII. Three round acceleration of complete adapter weights</w:t>
+        <w:t>XIII. Buffered three round adapter results</w:t>
       </w:r>
     </w:p>
     <w:p>
@@ -6601,7 +6601,7 @@
         <w:jc w:val="both"/>
       </w:pPr>
       <w:r>
-        <w:t>The complete SAGE adapter export was encrypted and recovered with half the baseline cycle count at a 100 MHz simulated clock. The unchanged one-round core required 1,798,305 cycles per direction; three rounds per cycle with input/output buffering and controller overlap required 899,153. This is a 1.999999-fold throughput improvement and a 49.99997% cycle reduction. Both runs recovered every byte and passed RTL authentication and commit. The result measures encryption and decryption throughput, not model inference speed.</w:t>
+        <w:t>The complete SAGE adapter export was encrypted and recovered with half the baseline cycle count at a 100 MHz simulated clock. The unchanged one-round core required 1,798,305 cycles per direction; three rounds per cycle with input/output buffering and controller overlap required 899,153. This approximately doubles throughput and halves the cycle count. Both runs recovered every byte and passed RTL authentication and commit. The result measures encryption and decryption throughput, not model inference speed.</w:t>
       </w:r>
     </w:p>
     <w:p>
@@ -8349,7 +8349,7 @@
           <w:b/>
           <w:sz w:val="21"/>
         </w:rPr>
-        <w:t>XIV. Limitations and next work</w:t>
+        <w:t>XIV. Folded absorption and controller fixes</w:t>
       </w:r>
     </w:p>
     <w:p>
@@ -8359,7 +8359,7 @@
         <w:jc w:val="both"/>
       </w:pPr>
       <w:r>
-        <w:t>This version is an unprotected cryptographic core. It does not prevent power or electromagnetic side-channel analysis, and it does not detect injected faults. Kandi et al. describe threshold and redundancy-based hardware options that could be studied in subsequent work [3]. Section XIII measures the implemented unrolling and buffering tradeoff. Independent lanes, memory transport and lossless compression remain separate experiments requiring additional interfaces and components. The external quarantine buffer is also a required part of safe decryption, not an optional application feature.</w:t>
+        <w:t>The folded core reduces the complete adapter run to 449,581 cycles per direction, compared with 899,153 for the buffered three-round core and 1,798,305 for the original one-round baseline. At the simulated 100 MHz clock, this is 4.49581 ms and 533.318 MB/s. Encryption matches the reference ciphertext and tag; decryption authenticates, commits and recovers all 2,397,696 bytes. Reattaching the preserved 20-byte header reconstructs the saved checkpoint exactly. These are GHDL simulation results, not measured memory or host-transfer rates [14].</w:t>
       </w:r>
     </w:p>
     <w:p>
@@ -8372,7 +8372,7 @@
           <w:b/>
           <w:sz w:val="21"/>
         </w:rPr>
-        <w:t>XV. Conclusion</w:t>
+        <w:t>A. State ownership and the three clock schedule</w:t>
       </w:r>
     </w:p>
     <w:p>
@@ -8382,7 +8382,1336 @@
         <w:jc w:val="both"/>
       </w:pPr>
       <w:r>
-        <w:t>The configurable Ascon-AEAD128 core preserves standard round counts, exact byte recovery and authentication while reducing complete adapter simulation cycles by approximately 50%. At a simulated 100 MHz, all 2,397,696 adapter bytes encrypt or decrypt in 899,153 cycles (8.99153 ms), versus 1,798,305 cycles for the unchanged one-round baseline. All three configurations pass official encryption/decryption vectors and the added buffered protocol tests. Core-only routed timing closes at 100 MHz with a narrow candidate margin; the final board-integrated design closes at 83.333 MHz and passes captured self-test and demo fixtures. These are distinct evidence scopes. Full adapter transport on hardware and whole GPT-2 checkpoint encryption remain future work. The earlier GPT-2 slice experiment separately established unchanged inference after exact recovery of its tested 1 KiB slice.</w:t>
+        <w:t>G_FOLDED_ABSORB selects a separate entity with one 320-bit state register. It requires G_ROUNDS_PER_CYCLE=3 and G_BUFFERING_ENABLE=true and is disabled by default. The earlier controller and permutation each owned a state register; absorption, request loading and completion copying added three clocks to every block. The folded entity removes those handoffs. It executes p8 in groups of 3, 3 and 2 rounds and absorbs the next queued block on the two-round tail edge. p12 still executes four groups of three. No cryptographic rounds are removed.</w:t>
+      </w:r>
+    </w:p>
+    <w:tbl>
+      <w:tblPr>
+        <w:tblW w:type="auto" w:w="0"/>
+        <w:jc w:val="center"/>
+        <w:tblLayout w:type="fixed"/>
+        <w:tblLook w:firstColumn="1" w:firstRow="1" w:lastColumn="0" w:lastRow="0" w:noHBand="0" w:noVBand="1" w:val="04A0"/>
+      </w:tblPr>
+      <w:tblGrid>
+        <w:gridCol w:w="2232"/>
+        <w:gridCol w:w="8050"/>
+      </w:tblGrid>
+      <w:tr>
+        <w:trPr>
+          <w:tblHeader/>
+        </w:trPr>
+        <w:tc>
+          <w:tcPr>
+            <w:tcW w:type="dxa" w:w="2232"/>
+            <w:vAlign w:val="center"/>
+            <w:tcBorders>
+              <w:top w:val="single" w:sz="4" w:color="D9D9D9"/>
+              <w:left w:val="single" w:sz="4" w:color="D9D9D9"/>
+              <w:bottom w:val="single" w:sz="4" w:color="D9D9D9"/>
+              <w:right w:val="single" w:sz="4" w:color="D9D9D9"/>
+            </w:tcBorders>
+            <w:shd w:fill="E7E6E6"/>
+            <w:tcMar>
+              <w:top w:w="75" w:type="dxa"/>
+              <w:left w:w="75" w:type="dxa"/>
+              <w:bottom w:w="75" w:type="dxa"/>
+              <w:right w:w="75" w:type="dxa"/>
+            </w:tcMar>
+          </w:tcPr>
+          <w:p>
+            <w:pPr>
+              <w:spacing w:after="20" w:line="240" w:lineRule="auto"/>
+            </w:pPr>
+            <w:r>
+              <w:rPr>
+                <w:b/>
+                <w:color w:val="000000"/>
+                <w:sz w:val="18"/>
+              </w:rPr>
+              <w:t>Steady state edge</w:t>
+            </w:r>
+          </w:p>
+        </w:tc>
+        <w:tc>
+          <w:tcPr>
+            <w:tcW w:type="dxa" w:w="8050"/>
+            <w:vAlign w:val="center"/>
+            <w:tcBorders>
+              <w:top w:val="single" w:sz="4" w:color="D9D9D9"/>
+              <w:left w:val="single" w:sz="4" w:color="D9D9D9"/>
+              <w:bottom w:val="single" w:sz="4" w:color="D9D9D9"/>
+              <w:right w:val="single" w:sz="4" w:color="D9D9D9"/>
+            </w:tcBorders>
+            <w:shd w:fill="E7E6E6"/>
+            <w:tcMar>
+              <w:top w:w="75" w:type="dxa"/>
+              <w:left w:w="75" w:type="dxa"/>
+              <w:bottom w:w="75" w:type="dxa"/>
+              <w:right w:w="75" w:type="dxa"/>
+            </w:tcMar>
+          </w:tcPr>
+          <w:p>
+            <w:pPr>
+              <w:spacing w:after="20" w:line="240" w:lineRule="auto"/>
+            </w:pPr>
+            <w:r>
+              <w:rPr>
+                <w:b/>
+                <w:color w:val="000000"/>
+                <w:sz w:val="18"/>
+              </w:rPr>
+              <w:t>State update</w:t>
+            </w:r>
+          </w:p>
+        </w:tc>
+      </w:tr>
+      <w:tr>
+        <w:tc>
+          <w:tcPr>
+            <w:tcW w:type="dxa" w:w="2232"/>
+            <w:vAlign w:val="center"/>
+            <w:tcBorders>
+              <w:top w:val="single" w:sz="4" w:color="D9D9D9"/>
+              <w:left w:val="single" w:sz="4" w:color="D9D9D9"/>
+              <w:bottom w:val="single" w:sz="4" w:color="D9D9D9"/>
+              <w:right w:val="single" w:sz="4" w:color="D9D9D9"/>
+            </w:tcBorders>
+            <w:shd w:fill="FFFFFF"/>
+            <w:tcMar>
+              <w:top w:w="75" w:type="dxa"/>
+              <w:left w:w="75" w:type="dxa"/>
+              <w:bottom w:w="75" w:type="dxa"/>
+              <w:right w:w="75" w:type="dxa"/>
+            </w:tcMar>
+          </w:tcPr>
+          <w:p>
+            <w:pPr>
+              <w:spacing w:after="20" w:line="240" w:lineRule="auto"/>
+            </w:pPr>
+            <w:r>
+              <w:rPr>
+                <w:b w:val="0"/>
+                <w:color w:val="000000"/>
+                <w:sz w:val="18"/>
+              </w:rPr>
+              <w:t>1</w:t>
+            </w:r>
+          </w:p>
+        </w:tc>
+        <w:tc>
+          <w:tcPr>
+            <w:tcW w:type="dxa" w:w="8050"/>
+            <w:vAlign w:val="center"/>
+            <w:tcBorders>
+              <w:top w:val="single" w:sz="4" w:color="D9D9D9"/>
+              <w:left w:val="single" w:sz="4" w:color="D9D9D9"/>
+              <w:bottom w:val="single" w:sz="4" w:color="D9D9D9"/>
+              <w:right w:val="single" w:sz="4" w:color="D9D9D9"/>
+            </w:tcBorders>
+            <w:shd w:fill="FFFFFF"/>
+            <w:tcMar>
+              <w:top w:w="75" w:type="dxa"/>
+              <w:left w:w="75" w:type="dxa"/>
+              <w:bottom w:w="75" w:type="dxa"/>
+              <w:right w:w="75" w:type="dxa"/>
+            </w:tcMar>
+          </w:tcPr>
+          <w:p>
+            <w:pPr>
+              <w:spacing w:after="20" w:line="240" w:lineRule="auto"/>
+            </w:pPr>
+            <w:r>
+              <w:rPr>
+                <w:b w:val="0"/>
+                <w:color w:val="000000"/>
+                <w:sz w:val="18"/>
+              </w:rPr>
+              <w:t>First three p8 rounds</w:t>
+            </w:r>
+          </w:p>
+        </w:tc>
+      </w:tr>
+      <w:tr>
+        <w:tc>
+          <w:tcPr>
+            <w:tcW w:type="dxa" w:w="2232"/>
+            <w:vAlign w:val="center"/>
+            <w:tcBorders>
+              <w:top w:val="single" w:sz="4" w:color="D9D9D9"/>
+              <w:left w:val="single" w:sz="4" w:color="D9D9D9"/>
+              <w:bottom w:val="single" w:sz="4" w:color="D9D9D9"/>
+              <w:right w:val="single" w:sz="4" w:color="D9D9D9"/>
+            </w:tcBorders>
+            <w:shd w:fill="F5F5F5"/>
+            <w:tcMar>
+              <w:top w:w="75" w:type="dxa"/>
+              <w:left w:w="75" w:type="dxa"/>
+              <w:bottom w:w="75" w:type="dxa"/>
+              <w:right w:w="75" w:type="dxa"/>
+            </w:tcMar>
+          </w:tcPr>
+          <w:p>
+            <w:pPr>
+              <w:spacing w:after="20" w:line="240" w:lineRule="auto"/>
+            </w:pPr>
+            <w:r>
+              <w:rPr>
+                <w:b w:val="0"/>
+                <w:color w:val="000000"/>
+                <w:sz w:val="18"/>
+              </w:rPr>
+              <w:t>2</w:t>
+            </w:r>
+          </w:p>
+        </w:tc>
+        <w:tc>
+          <w:tcPr>
+            <w:tcW w:type="dxa" w:w="8050"/>
+            <w:vAlign w:val="center"/>
+            <w:tcBorders>
+              <w:top w:val="single" w:sz="4" w:color="D9D9D9"/>
+              <w:left w:val="single" w:sz="4" w:color="D9D9D9"/>
+              <w:bottom w:val="single" w:sz="4" w:color="D9D9D9"/>
+              <w:right w:val="single" w:sz="4" w:color="D9D9D9"/>
+            </w:tcBorders>
+            <w:shd w:fill="F5F5F5"/>
+            <w:tcMar>
+              <w:top w:w="75" w:type="dxa"/>
+              <w:left w:w="75" w:type="dxa"/>
+              <w:bottom w:w="75" w:type="dxa"/>
+              <w:right w:w="75" w:type="dxa"/>
+            </w:tcMar>
+          </w:tcPr>
+          <w:p>
+            <w:pPr>
+              <w:spacing w:after="20" w:line="240" w:lineRule="auto"/>
+            </w:pPr>
+            <w:r>
+              <w:rPr>
+                <w:b w:val="0"/>
+                <w:color w:val="000000"/>
+                <w:sz w:val="18"/>
+              </w:rPr>
+              <w:t>Next three p8 rounds</w:t>
+            </w:r>
+          </w:p>
+        </w:tc>
+      </w:tr>
+      <w:tr>
+        <w:tc>
+          <w:tcPr>
+            <w:tcW w:type="dxa" w:w="2232"/>
+            <w:vAlign w:val="center"/>
+            <w:tcBorders>
+              <w:top w:val="single" w:sz="4" w:color="D9D9D9"/>
+              <w:left w:val="single" w:sz="4" w:color="D9D9D9"/>
+              <w:bottom w:val="single" w:sz="4" w:color="D9D9D9"/>
+              <w:right w:val="single" w:sz="4" w:color="D9D9D9"/>
+            </w:tcBorders>
+            <w:shd w:fill="FFFFFF"/>
+            <w:tcMar>
+              <w:top w:w="75" w:type="dxa"/>
+              <w:left w:w="75" w:type="dxa"/>
+              <w:bottom w:w="75" w:type="dxa"/>
+              <w:right w:w="75" w:type="dxa"/>
+            </w:tcMar>
+          </w:tcPr>
+          <w:p>
+            <w:pPr>
+              <w:spacing w:after="20" w:line="240" w:lineRule="auto"/>
+            </w:pPr>
+            <w:r>
+              <w:rPr>
+                <w:b w:val="0"/>
+                <w:color w:val="000000"/>
+                <w:sz w:val="18"/>
+              </w:rPr>
+              <w:t>3</w:t>
+            </w:r>
+          </w:p>
+        </w:tc>
+        <w:tc>
+          <w:tcPr>
+            <w:tcW w:type="dxa" w:w="8050"/>
+            <w:vAlign w:val="center"/>
+            <w:tcBorders>
+              <w:top w:val="single" w:sz="4" w:color="D9D9D9"/>
+              <w:left w:val="single" w:sz="4" w:color="D9D9D9"/>
+              <w:bottom w:val="single" w:sz="4" w:color="D9D9D9"/>
+              <w:right w:val="single" w:sz="4" w:color="D9D9D9"/>
+            </w:tcBorders>
+            <w:shd w:fill="FFFFFF"/>
+            <w:tcMar>
+              <w:top w:w="75" w:type="dxa"/>
+              <w:left w:w="75" w:type="dxa"/>
+              <w:bottom w:w="75" w:type="dxa"/>
+              <w:right w:w="75" w:type="dxa"/>
+            </w:tcMar>
+          </w:tcPr>
+          <w:p>
+            <w:pPr>
+              <w:spacing w:after="20" w:line="240" w:lineRule="auto"/>
+            </w:pPr>
+            <w:r>
+              <w:rPr>
+                <w:b w:val="0"/>
+                <w:color w:val="000000"/>
+                <w:sz w:val="18"/>
+              </w:rPr>
+              <w:t>Final two p8 rounds and next block absorption</w:t>
+            </w:r>
+          </w:p>
+        </w:tc>
+      </w:tr>
+    </w:tbl>
+    <w:p>
+      <w:pPr>
+        <w:spacing w:after="0"/>
+      </w:pPr>
+    </w:p>
+    <w:p>
+      <w:pPr>
+        <w:keepNext w:val="0"/>
+        <w:spacing w:before="40" w:after="80"/>
+        <w:jc w:val="center"/>
+      </w:pPr>
+      <w:r>
+        <w:rPr>
+          <w:sz w:val="17"/>
+        </w:rPr>
+        <w:t>Table X. Saturated full-block schedule. Initialization, finalization and stall recovery are separate.</w:t>
+      </w:r>
+    </w:p>
+    <w:p>
+      <w:pPr>
+        <w:spacing w:after="60" w:line="245" w:lineRule="auto"/>
+        <w:ind w:firstLine="317"/>
+        <w:jc w:val="both"/>
+      </w:pPr>
+      <w:r>
+        <w:t>Round constants are registered ahead of each group. Input keep masks, padding and error flags are prepared when a beat enters the queue. The tail uses ciphertext replacement during decryption and XOR absorption during encryption. If the next input is absent or output space is unavailable, p8 completes without absorption; a later absorb-only clock resumes the stream. The full and partial final-block paths retain mandatory padding. These changes apply established absorption and buffering techniques to this controller; no novelty claim is made [1], [11]–[13], [15].</w:t>
+      </w:r>
+    </w:p>
+    <w:p>
+      <w:pPr>
+        <w:spacing w:after="60" w:line="245" w:lineRule="auto"/>
+        <w:ind w:firstLine="317"/>
+        <w:jc w:val="both"/>
+      </w:pPr>
+      <w:r>
+        <w:t>Other hardware reports need separate interpretation. Liu, Han and Quan describe a larger parallel architecture using legacy Ascon-128 [4]; their throughput is not a single-stream SP 800-232 result. Huong, Nam and Phat report an IoT application of Ascon-AEAD128 [5]. Neither source supplies performance measurements for this adapter or board wrapper.</w:t>
+      </w:r>
+    </w:p>
+    <w:p>
+      <w:pPr>
+        <w:keepNext/>
+        <w:spacing w:before="100" w:after="40"/>
+      </w:pPr>
+      <w:r>
+        <w:rPr>
+          <w:b/>
+          <w:sz w:val="21"/>
+        </w:rPr>
+        <w:t>B. Verification and saved implementation results</w:t>
+      </w:r>
+    </w:p>
+    <w:tbl>
+      <w:tblPr>
+        <w:tblW w:type="auto" w:w="0"/>
+        <w:jc w:val="center"/>
+        <w:tblLayout w:type="fixed"/>
+        <w:tblLook w:firstColumn="1" w:firstRow="1" w:lastColumn="0" w:lastRow="0" w:noHBand="0" w:noVBand="1" w:val="04A0"/>
+      </w:tblPr>
+      <w:tblGrid>
+        <w:gridCol w:w="4824"/>
+        <w:gridCol w:w="2938"/>
+        <w:gridCol w:w="2520"/>
+      </w:tblGrid>
+      <w:tr>
+        <w:trPr>
+          <w:tblHeader/>
+        </w:trPr>
+        <w:tc>
+          <w:tcPr>
+            <w:tcW w:type="dxa" w:w="4824"/>
+            <w:vAlign w:val="center"/>
+            <w:tcBorders>
+              <w:top w:val="single" w:sz="4" w:color="D9D9D9"/>
+              <w:left w:val="single" w:sz="4" w:color="D9D9D9"/>
+              <w:bottom w:val="single" w:sz="4" w:color="D9D9D9"/>
+              <w:right w:val="single" w:sz="4" w:color="D9D9D9"/>
+            </w:tcBorders>
+            <w:shd w:fill="E7E6E6"/>
+            <w:tcMar>
+              <w:top w:w="75" w:type="dxa"/>
+              <w:left w:w="75" w:type="dxa"/>
+              <w:bottom w:w="75" w:type="dxa"/>
+              <w:right w:w="75" w:type="dxa"/>
+            </w:tcMar>
+          </w:tcPr>
+          <w:p>
+            <w:pPr>
+              <w:spacing w:after="20" w:line="240" w:lineRule="auto"/>
+            </w:pPr>
+            <w:r>
+              <w:rPr>
+                <w:b/>
+                <w:color w:val="000000"/>
+                <w:sz w:val="18"/>
+              </w:rPr>
+              <w:t>Configuration</w:t>
+            </w:r>
+          </w:p>
+        </w:tc>
+        <w:tc>
+          <w:tcPr>
+            <w:tcW w:type="dxa" w:w="2938"/>
+            <w:vAlign w:val="center"/>
+            <w:tcBorders>
+              <w:top w:val="single" w:sz="4" w:color="D9D9D9"/>
+              <w:left w:val="single" w:sz="4" w:color="D9D9D9"/>
+              <w:bottom w:val="single" w:sz="4" w:color="D9D9D9"/>
+              <w:right w:val="single" w:sz="4" w:color="D9D9D9"/>
+            </w:tcBorders>
+            <w:shd w:fill="E7E6E6"/>
+            <w:tcMar>
+              <w:top w:w="75" w:type="dxa"/>
+              <w:left w:w="75" w:type="dxa"/>
+              <w:bottom w:w="75" w:type="dxa"/>
+              <w:right w:w="75" w:type="dxa"/>
+            </w:tcMar>
+          </w:tcPr>
+          <w:p>
+            <w:pPr>
+              <w:spacing w:after="20" w:line="240" w:lineRule="auto"/>
+            </w:pPr>
+            <w:r>
+              <w:rPr>
+                <w:b/>
+                <w:color w:val="000000"/>
+                <w:sz w:val="18"/>
+              </w:rPr>
+              <w:t>Full adapter cycles</w:t>
+            </w:r>
+          </w:p>
+        </w:tc>
+        <w:tc>
+          <w:tcPr>
+            <w:tcW w:type="dxa" w:w="2520"/>
+            <w:vAlign w:val="center"/>
+            <w:tcBorders>
+              <w:top w:val="single" w:sz="4" w:color="D9D9D9"/>
+              <w:left w:val="single" w:sz="4" w:color="D9D9D9"/>
+              <w:bottom w:val="single" w:sz="4" w:color="D9D9D9"/>
+              <w:right w:val="single" w:sz="4" w:color="D9D9D9"/>
+            </w:tcBorders>
+            <w:shd w:fill="E7E6E6"/>
+            <w:tcMar>
+              <w:top w:w="75" w:type="dxa"/>
+              <w:left w:w="75" w:type="dxa"/>
+              <w:bottom w:w="75" w:type="dxa"/>
+              <w:right w:w="75" w:type="dxa"/>
+            </w:tcMar>
+          </w:tcPr>
+          <w:p>
+            <w:pPr>
+              <w:spacing w:after="20" w:line="240" w:lineRule="auto"/>
+            </w:pPr>
+            <w:r>
+              <w:rPr>
+                <w:b/>
+                <w:color w:val="000000"/>
+                <w:sz w:val="18"/>
+              </w:rPr>
+              <w:t>1 KiB cycles</w:t>
+            </w:r>
+          </w:p>
+        </w:tc>
+      </w:tr>
+      <w:tr>
+        <w:tc>
+          <w:tcPr>
+            <w:tcW w:type="dxa" w:w="4824"/>
+            <w:vAlign w:val="center"/>
+            <w:tcBorders>
+              <w:top w:val="single" w:sz="4" w:color="D9D9D9"/>
+              <w:left w:val="single" w:sz="4" w:color="D9D9D9"/>
+              <w:bottom w:val="single" w:sz="4" w:color="D9D9D9"/>
+              <w:right w:val="single" w:sz="4" w:color="D9D9D9"/>
+            </w:tcBorders>
+            <w:shd w:fill="FFFFFF"/>
+            <w:tcMar>
+              <w:top w:w="75" w:type="dxa"/>
+              <w:left w:w="75" w:type="dxa"/>
+              <w:bottom w:w="75" w:type="dxa"/>
+              <w:right w:w="75" w:type="dxa"/>
+            </w:tcMar>
+          </w:tcPr>
+          <w:p>
+            <w:pPr>
+              <w:spacing w:after="20" w:line="240" w:lineRule="auto"/>
+            </w:pPr>
+            <w:r>
+              <w:rPr>
+                <w:b w:val="0"/>
+                <w:color w:val="000000"/>
+                <w:sz w:val="18"/>
+              </w:rPr>
+              <w:t>Original one-round baseline</w:t>
+            </w:r>
+          </w:p>
+        </w:tc>
+        <w:tc>
+          <w:tcPr>
+            <w:tcW w:type="dxa" w:w="2938"/>
+            <w:vAlign w:val="center"/>
+            <w:tcBorders>
+              <w:top w:val="single" w:sz="4" w:color="D9D9D9"/>
+              <w:left w:val="single" w:sz="4" w:color="D9D9D9"/>
+              <w:bottom w:val="single" w:sz="4" w:color="D9D9D9"/>
+              <w:right w:val="single" w:sz="4" w:color="D9D9D9"/>
+            </w:tcBorders>
+            <w:shd w:fill="FFFFFF"/>
+            <w:tcMar>
+              <w:top w:w="75" w:type="dxa"/>
+              <w:left w:w="75" w:type="dxa"/>
+              <w:bottom w:w="75" w:type="dxa"/>
+              <w:right w:w="75" w:type="dxa"/>
+            </w:tcMar>
+          </w:tcPr>
+          <w:p>
+            <w:pPr>
+              <w:spacing w:after="20" w:line="240" w:lineRule="auto"/>
+            </w:pPr>
+            <w:r>
+              <w:rPr>
+                <w:b w:val="0"/>
+                <w:color w:val="000000"/>
+                <w:sz w:val="18"/>
+              </w:rPr>
+              <w:t>1,798,305</w:t>
+            </w:r>
+          </w:p>
+        </w:tc>
+        <w:tc>
+          <w:tcPr>
+            <w:tcW w:type="dxa" w:w="2520"/>
+            <w:vAlign w:val="center"/>
+            <w:tcBorders>
+              <w:top w:val="single" w:sz="4" w:color="D9D9D9"/>
+              <w:left w:val="single" w:sz="4" w:color="D9D9D9"/>
+              <w:bottom w:val="single" w:sz="4" w:color="D9D9D9"/>
+              <w:right w:val="single" w:sz="4" w:color="D9D9D9"/>
+            </w:tcBorders>
+            <w:shd w:fill="FFFFFF"/>
+            <w:tcMar>
+              <w:top w:w="75" w:type="dxa"/>
+              <w:left w:w="75" w:type="dxa"/>
+              <w:bottom w:w="75" w:type="dxa"/>
+              <w:right w:w="75" w:type="dxa"/>
+            </w:tcMar>
+          </w:tcPr>
+          <w:p>
+            <w:pPr>
+              <w:spacing w:after="20" w:line="240" w:lineRule="auto"/>
+            </w:pPr>
+            <w:r>
+              <w:rPr>
+                <w:b w:val="0"/>
+                <w:color w:val="000000"/>
+                <w:sz w:val="18"/>
+              </w:rPr>
+              <w:t>801</w:t>
+            </w:r>
+          </w:p>
+        </w:tc>
+      </w:tr>
+      <w:tr>
+        <w:tc>
+          <w:tcPr>
+            <w:tcW w:type="dxa" w:w="4824"/>
+            <w:vAlign w:val="center"/>
+            <w:tcBorders>
+              <w:top w:val="single" w:sz="4" w:color="D9D9D9"/>
+              <w:left w:val="single" w:sz="4" w:color="D9D9D9"/>
+              <w:bottom w:val="single" w:sz="4" w:color="D9D9D9"/>
+              <w:right w:val="single" w:sz="4" w:color="D9D9D9"/>
+            </w:tcBorders>
+            <w:shd w:fill="F5F5F5"/>
+            <w:tcMar>
+              <w:top w:w="75" w:type="dxa"/>
+              <w:left w:w="75" w:type="dxa"/>
+              <w:bottom w:w="75" w:type="dxa"/>
+              <w:right w:w="75" w:type="dxa"/>
+            </w:tcMar>
+          </w:tcPr>
+          <w:p>
+            <w:pPr>
+              <w:spacing w:after="20" w:line="240" w:lineRule="auto"/>
+            </w:pPr>
+            <w:r>
+              <w:rPr>
+                <w:b w:val="0"/>
+                <w:color w:val="000000"/>
+                <w:sz w:val="18"/>
+              </w:rPr>
+              <w:t>Buffered three-round core</w:t>
+            </w:r>
+          </w:p>
+        </w:tc>
+        <w:tc>
+          <w:tcPr>
+            <w:tcW w:type="dxa" w:w="2938"/>
+            <w:vAlign w:val="center"/>
+            <w:tcBorders>
+              <w:top w:val="single" w:sz="4" w:color="D9D9D9"/>
+              <w:left w:val="single" w:sz="4" w:color="D9D9D9"/>
+              <w:bottom w:val="single" w:sz="4" w:color="D9D9D9"/>
+              <w:right w:val="single" w:sz="4" w:color="D9D9D9"/>
+            </w:tcBorders>
+            <w:shd w:fill="F5F5F5"/>
+            <w:tcMar>
+              <w:top w:w="75" w:type="dxa"/>
+              <w:left w:w="75" w:type="dxa"/>
+              <w:bottom w:w="75" w:type="dxa"/>
+              <w:right w:w="75" w:type="dxa"/>
+            </w:tcMar>
+          </w:tcPr>
+          <w:p>
+            <w:pPr>
+              <w:spacing w:after="20" w:line="240" w:lineRule="auto"/>
+            </w:pPr>
+            <w:r>
+              <w:rPr>
+                <w:b w:val="0"/>
+                <w:color w:val="000000"/>
+                <w:sz w:val="18"/>
+              </w:rPr>
+              <w:t>899,153</w:t>
+            </w:r>
+          </w:p>
+        </w:tc>
+        <w:tc>
+          <w:tcPr>
+            <w:tcW w:type="dxa" w:w="2520"/>
+            <w:vAlign w:val="center"/>
+            <w:tcBorders>
+              <w:top w:val="single" w:sz="4" w:color="D9D9D9"/>
+              <w:left w:val="single" w:sz="4" w:color="D9D9D9"/>
+              <w:bottom w:val="single" w:sz="4" w:color="D9D9D9"/>
+              <w:right w:val="single" w:sz="4" w:color="D9D9D9"/>
+            </w:tcBorders>
+            <w:shd w:fill="F5F5F5"/>
+            <w:tcMar>
+              <w:top w:w="75" w:type="dxa"/>
+              <w:left w:w="75" w:type="dxa"/>
+              <w:bottom w:w="75" w:type="dxa"/>
+              <w:right w:w="75" w:type="dxa"/>
+            </w:tcMar>
+          </w:tcPr>
+          <w:p>
+            <w:pPr>
+              <w:spacing w:after="20" w:line="240" w:lineRule="auto"/>
+            </w:pPr>
+            <w:r>
+              <w:rPr>
+                <w:b w:val="0"/>
+                <w:color w:val="000000"/>
+                <w:sz w:val="18"/>
+              </w:rPr>
+              <w:t>401</w:t>
+            </w:r>
+          </w:p>
+        </w:tc>
+      </w:tr>
+      <w:tr>
+        <w:tc>
+          <w:tcPr>
+            <w:tcW w:type="dxa" w:w="4824"/>
+            <w:vAlign w:val="center"/>
+            <w:tcBorders>
+              <w:top w:val="single" w:sz="4" w:color="D9D9D9"/>
+              <w:left w:val="single" w:sz="4" w:color="D9D9D9"/>
+              <w:bottom w:val="single" w:sz="4" w:color="D9D9D9"/>
+              <w:right w:val="single" w:sz="4" w:color="D9D9D9"/>
+            </w:tcBorders>
+            <w:shd w:fill="FFFFFF"/>
+            <w:tcMar>
+              <w:top w:w="75" w:type="dxa"/>
+              <w:left w:w="75" w:type="dxa"/>
+              <w:bottom w:w="75" w:type="dxa"/>
+              <w:right w:w="75" w:type="dxa"/>
+            </w:tcMar>
+          </w:tcPr>
+          <w:p>
+            <w:pPr>
+              <w:spacing w:after="20" w:line="240" w:lineRule="auto"/>
+            </w:pPr>
+            <w:r>
+              <w:rPr>
+                <w:b w:val="0"/>
+                <w:color w:val="000000"/>
+                <w:sz w:val="18"/>
+              </w:rPr>
+              <w:t>Folded three-round core</w:t>
+            </w:r>
+          </w:p>
+        </w:tc>
+        <w:tc>
+          <w:tcPr>
+            <w:tcW w:type="dxa" w:w="2938"/>
+            <w:vAlign w:val="center"/>
+            <w:tcBorders>
+              <w:top w:val="single" w:sz="4" w:color="D9D9D9"/>
+              <w:left w:val="single" w:sz="4" w:color="D9D9D9"/>
+              <w:bottom w:val="single" w:sz="4" w:color="D9D9D9"/>
+              <w:right w:val="single" w:sz="4" w:color="D9D9D9"/>
+            </w:tcBorders>
+            <w:shd w:fill="FFFFFF"/>
+            <w:tcMar>
+              <w:top w:w="75" w:type="dxa"/>
+              <w:left w:w="75" w:type="dxa"/>
+              <w:bottom w:w="75" w:type="dxa"/>
+              <w:right w:w="75" w:type="dxa"/>
+            </w:tcMar>
+          </w:tcPr>
+          <w:p>
+            <w:pPr>
+              <w:spacing w:after="20" w:line="240" w:lineRule="auto"/>
+            </w:pPr>
+            <w:r>
+              <w:rPr>
+                <w:b w:val="0"/>
+                <w:color w:val="000000"/>
+                <w:sz w:val="18"/>
+              </w:rPr>
+              <w:t>449,581</w:t>
+            </w:r>
+          </w:p>
+        </w:tc>
+        <w:tc>
+          <w:tcPr>
+            <w:tcW w:type="dxa" w:w="2520"/>
+            <w:vAlign w:val="center"/>
+            <w:tcBorders>
+              <w:top w:val="single" w:sz="4" w:color="D9D9D9"/>
+              <w:left w:val="single" w:sz="4" w:color="D9D9D9"/>
+              <w:bottom w:val="single" w:sz="4" w:color="D9D9D9"/>
+              <w:right w:val="single" w:sz="4" w:color="D9D9D9"/>
+            </w:tcBorders>
+            <w:shd w:fill="FFFFFF"/>
+            <w:tcMar>
+              <w:top w:w="75" w:type="dxa"/>
+              <w:left w:w="75" w:type="dxa"/>
+              <w:bottom w:w="75" w:type="dxa"/>
+              <w:right w:w="75" w:type="dxa"/>
+            </w:tcMar>
+          </w:tcPr>
+          <w:p>
+            <w:pPr>
+              <w:spacing w:after="20" w:line="240" w:lineRule="auto"/>
+            </w:pPr>
+            <w:r>
+              <w:rPr>
+                <w:b w:val="0"/>
+                <w:color w:val="000000"/>
+                <w:sz w:val="18"/>
+              </w:rPr>
+              <w:t>205</w:t>
+            </w:r>
+          </w:p>
+        </w:tc>
+      </w:tr>
+    </w:tbl>
+    <w:p>
+      <w:pPr>
+        <w:spacing w:after="0"/>
+      </w:pPr>
+    </w:p>
+    <w:p>
+      <w:pPr>
+        <w:keepNext w:val="0"/>
+        <w:spacing w:before="40" w:after="80"/>
+        <w:jc w:val="center"/>
+      </w:pPr>
+      <w:r>
+        <w:rPr>
+          <w:sz w:val="17"/>
+        </w:rPr>
+        <w:t>Table XI. Command through done with empty AD and always-ready output. Counts are equal for encryption and decryption [14].</w:t>
+      </w:r>
+    </w:p>
+    <w:p>
+      <w:pPr>
+        <w:spacing w:after="60" w:line="245" w:lineRule="auto"/>
+        <w:ind w:firstLine="317"/>
+        <w:jc w:val="both"/>
+      </w:pPr>
+      <w:r>
+        <w:t>The folded core passed 2,178 official directional checks, concurrent stream tests, partial blocks, stalls, reset and malformed-input checks. test_fold compares intermediate round groups with the Python model and checks a mid-stream error with queued plaintext. test_cycles now checks documented cycle counts. Generated-Verilog smoke tests passed with Icarus and Verilator before the later legacy-engine fixes. The final tag-gate evidence records twelve test_ascon groups passing for all four configurations, full KAT runs for u1, buffered u3 and fold, full stream suites for buffered u3 and fold, and cycle regressions. Restoring the ungated legacy assignment makes the new tag-output test fail, as expected [14], [16].</w:t>
+      </w:r>
+    </w:p>
+    <w:tbl>
+      <w:tblPr>
+        <w:tblW w:type="auto" w:w="0"/>
+        <w:jc w:val="center"/>
+        <w:tblLayout w:type="fixed"/>
+        <w:tblLook w:firstColumn="1" w:firstRow="1" w:lastColumn="0" w:lastRow="0" w:noHBand="0" w:noVBand="1" w:val="04A0"/>
+      </w:tblPr>
+      <w:tblGrid>
+        <w:gridCol w:w="5400"/>
+        <w:gridCol w:w="2376"/>
+        <w:gridCol w:w="2506"/>
+      </w:tblGrid>
+      <w:tr>
+        <w:trPr>
+          <w:tblHeader/>
+        </w:trPr>
+        <w:tc>
+          <w:tcPr>
+            <w:tcW w:type="dxa" w:w="5400"/>
+            <w:vAlign w:val="center"/>
+            <w:tcBorders>
+              <w:top w:val="single" w:sz="4" w:color="D9D9D9"/>
+              <w:left w:val="single" w:sz="4" w:color="D9D9D9"/>
+              <w:bottom w:val="single" w:sz="4" w:color="D9D9D9"/>
+              <w:right w:val="single" w:sz="4" w:color="D9D9D9"/>
+            </w:tcBorders>
+            <w:shd w:fill="E7E6E6"/>
+            <w:tcMar>
+              <w:top w:w="75" w:type="dxa"/>
+              <w:left w:w="75" w:type="dxa"/>
+              <w:bottom w:w="75" w:type="dxa"/>
+              <w:right w:w="75" w:type="dxa"/>
+            </w:tcMar>
+          </w:tcPr>
+          <w:p>
+            <w:pPr>
+              <w:spacing w:after="20" w:line="240" w:lineRule="auto"/>
+            </w:pPr>
+            <w:r>
+              <w:rPr>
+                <w:b/>
+                <w:color w:val="000000"/>
+                <w:sz w:val="18"/>
+              </w:rPr>
+              <w:t>Core-only snapshot at 100 MHz</w:t>
+            </w:r>
+          </w:p>
+        </w:tc>
+        <w:tc>
+          <w:tcPr>
+            <w:tcW w:type="dxa" w:w="2376"/>
+            <w:vAlign w:val="center"/>
+            <w:tcBorders>
+              <w:top w:val="single" w:sz="4" w:color="D9D9D9"/>
+              <w:left w:val="single" w:sz="4" w:color="D9D9D9"/>
+              <w:bottom w:val="single" w:sz="4" w:color="D9D9D9"/>
+              <w:right w:val="single" w:sz="4" w:color="D9D9D9"/>
+            </w:tcBorders>
+            <w:shd w:fill="E7E6E6"/>
+            <w:tcMar>
+              <w:top w:w="75" w:type="dxa"/>
+              <w:left w:w="75" w:type="dxa"/>
+              <w:bottom w:w="75" w:type="dxa"/>
+              <w:right w:w="75" w:type="dxa"/>
+            </w:tcMar>
+          </w:tcPr>
+          <w:p>
+            <w:pPr>
+              <w:spacing w:after="20" w:line="240" w:lineRule="auto"/>
+            </w:pPr>
+            <w:r>
+              <w:rPr>
+                <w:b/>
+                <w:color w:val="000000"/>
+                <w:sz w:val="18"/>
+              </w:rPr>
+              <w:t>Setup / hold ns</w:t>
+            </w:r>
+          </w:p>
+        </w:tc>
+        <w:tc>
+          <w:tcPr>
+            <w:tcW w:type="dxa" w:w="2506"/>
+            <w:vAlign w:val="center"/>
+            <w:tcBorders>
+              <w:top w:val="single" w:sz="4" w:color="D9D9D9"/>
+              <w:left w:val="single" w:sz="4" w:color="D9D9D9"/>
+              <w:bottom w:val="single" w:sz="4" w:color="D9D9D9"/>
+              <w:right w:val="single" w:sz="4" w:color="D9D9D9"/>
+            </w:tcBorders>
+            <w:shd w:fill="E7E6E6"/>
+            <w:tcMar>
+              <w:top w:w="75" w:type="dxa"/>
+              <w:left w:w="75" w:type="dxa"/>
+              <w:bottom w:w="75" w:type="dxa"/>
+              <w:right w:w="75" w:type="dxa"/>
+            </w:tcMar>
+          </w:tcPr>
+          <w:p>
+            <w:pPr>
+              <w:spacing w:after="20" w:line="240" w:lineRule="auto"/>
+            </w:pPr>
+            <w:r>
+              <w:rPr>
+                <w:b/>
+                <w:color w:val="000000"/>
+                <w:sz w:val="18"/>
+              </w:rPr>
+              <w:t>LUT / FF</w:t>
+            </w:r>
+          </w:p>
+        </w:tc>
+      </w:tr>
+      <w:tr>
+        <w:tc>
+          <w:tcPr>
+            <w:tcW w:type="dxa" w:w="5400"/>
+            <w:vAlign w:val="center"/>
+            <w:tcBorders>
+              <w:top w:val="single" w:sz="4" w:color="D9D9D9"/>
+              <w:left w:val="single" w:sz="4" w:color="D9D9D9"/>
+              <w:bottom w:val="single" w:sz="4" w:color="D9D9D9"/>
+              <w:right w:val="single" w:sz="4" w:color="D9D9D9"/>
+            </w:tcBorders>
+            <w:shd w:fill="FFFFFF"/>
+            <w:tcMar>
+              <w:top w:w="75" w:type="dxa"/>
+              <w:left w:w="75" w:type="dxa"/>
+              <w:bottom w:w="75" w:type="dxa"/>
+              <w:right w:w="75" w:type="dxa"/>
+            </w:tcMar>
+          </w:tcPr>
+          <w:p>
+            <w:pPr>
+              <w:spacing w:after="20" w:line="240" w:lineRule="auto"/>
+            </w:pPr>
+            <w:r>
+              <w:rPr>
+                <w:b w:val="0"/>
+                <w:color w:val="000000"/>
+                <w:sz w:val="18"/>
+              </w:rPr>
+              <w:t>Buffered u3 before both fixes</w:t>
+            </w:r>
+          </w:p>
+        </w:tc>
+        <w:tc>
+          <w:tcPr>
+            <w:tcW w:type="dxa" w:w="2376"/>
+            <w:vAlign w:val="center"/>
+            <w:tcBorders>
+              <w:top w:val="single" w:sz="4" w:color="D9D9D9"/>
+              <w:left w:val="single" w:sz="4" w:color="D9D9D9"/>
+              <w:bottom w:val="single" w:sz="4" w:color="D9D9D9"/>
+              <w:right w:val="single" w:sz="4" w:color="D9D9D9"/>
+            </w:tcBorders>
+            <w:shd w:fill="FFFFFF"/>
+            <w:tcMar>
+              <w:top w:w="75" w:type="dxa"/>
+              <w:left w:w="75" w:type="dxa"/>
+              <w:bottom w:w="75" w:type="dxa"/>
+              <w:right w:w="75" w:type="dxa"/>
+            </w:tcMar>
+          </w:tcPr>
+          <w:p>
+            <w:pPr>
+              <w:spacing w:after="20" w:line="240" w:lineRule="auto"/>
+            </w:pPr>
+            <w:r>
+              <w:rPr>
+                <w:b w:val="0"/>
+                <w:color w:val="000000"/>
+                <w:sz w:val="18"/>
+              </w:rPr>
+              <w:t>+0.038 / +0.144</w:t>
+            </w:r>
+          </w:p>
+        </w:tc>
+        <w:tc>
+          <w:tcPr>
+            <w:tcW w:type="dxa" w:w="2506"/>
+            <w:vAlign w:val="center"/>
+            <w:tcBorders>
+              <w:top w:val="single" w:sz="4" w:color="D9D9D9"/>
+              <w:left w:val="single" w:sz="4" w:color="D9D9D9"/>
+              <w:bottom w:val="single" w:sz="4" w:color="D9D9D9"/>
+              <w:right w:val="single" w:sz="4" w:color="D9D9D9"/>
+            </w:tcBorders>
+            <w:shd w:fill="FFFFFF"/>
+            <w:tcMar>
+              <w:top w:w="75" w:type="dxa"/>
+              <w:left w:w="75" w:type="dxa"/>
+              <w:bottom w:w="75" w:type="dxa"/>
+              <w:right w:w="75" w:type="dxa"/>
+            </w:tcMar>
+          </w:tcPr>
+          <w:p>
+            <w:pPr>
+              <w:spacing w:after="20" w:line="240" w:lineRule="auto"/>
+            </w:pPr>
+            <w:r>
+              <w:rPr>
+                <w:b w:val="0"/>
+                <w:color w:val="000000"/>
+                <w:sz w:val="18"/>
+              </w:rPr>
+              <w:t>3,708 / 1,680</w:t>
+            </w:r>
+          </w:p>
+        </w:tc>
+      </w:tr>
+      <w:tr>
+        <w:tc>
+          <w:tcPr>
+            <w:tcW w:type="dxa" w:w="5400"/>
+            <w:vAlign w:val="center"/>
+            <w:tcBorders>
+              <w:top w:val="single" w:sz="4" w:color="D9D9D9"/>
+              <w:left w:val="single" w:sz="4" w:color="D9D9D9"/>
+              <w:bottom w:val="single" w:sz="4" w:color="D9D9D9"/>
+              <w:right w:val="single" w:sz="4" w:color="D9D9D9"/>
+            </w:tcBorders>
+            <w:shd w:fill="F5F5F5"/>
+            <w:tcMar>
+              <w:top w:w="75" w:type="dxa"/>
+              <w:left w:w="75" w:type="dxa"/>
+              <w:bottom w:w="75" w:type="dxa"/>
+              <w:right w:w="75" w:type="dxa"/>
+            </w:tcMar>
+          </w:tcPr>
+          <w:p>
+            <w:pPr>
+              <w:spacing w:after="20" w:line="240" w:lineRule="auto"/>
+            </w:pPr>
+            <w:r>
+              <w:rPr>
+                <w:b w:val="0"/>
+                <w:color w:val="000000"/>
+                <w:sz w:val="18"/>
+              </w:rPr>
+              <w:t>Buffered u3 after AD fix, before tag gate</w:t>
+            </w:r>
+          </w:p>
+        </w:tc>
+        <w:tc>
+          <w:tcPr>
+            <w:tcW w:type="dxa" w:w="2376"/>
+            <w:vAlign w:val="center"/>
+            <w:tcBorders>
+              <w:top w:val="single" w:sz="4" w:color="D9D9D9"/>
+              <w:left w:val="single" w:sz="4" w:color="D9D9D9"/>
+              <w:bottom w:val="single" w:sz="4" w:color="D9D9D9"/>
+              <w:right w:val="single" w:sz="4" w:color="D9D9D9"/>
+            </w:tcBorders>
+            <w:shd w:fill="F5F5F5"/>
+            <w:tcMar>
+              <w:top w:w="75" w:type="dxa"/>
+              <w:left w:w="75" w:type="dxa"/>
+              <w:bottom w:w="75" w:type="dxa"/>
+              <w:right w:w="75" w:type="dxa"/>
+            </w:tcMar>
+          </w:tcPr>
+          <w:p>
+            <w:pPr>
+              <w:spacing w:after="20" w:line="240" w:lineRule="auto"/>
+            </w:pPr>
+            <w:r>
+              <w:rPr>
+                <w:b w:val="0"/>
+                <w:color w:val="000000"/>
+                <w:sz w:val="18"/>
+              </w:rPr>
+              <w:t>+0.287 / +0.110</w:t>
+            </w:r>
+          </w:p>
+        </w:tc>
+        <w:tc>
+          <w:tcPr>
+            <w:tcW w:type="dxa" w:w="2506"/>
+            <w:vAlign w:val="center"/>
+            <w:tcBorders>
+              <w:top w:val="single" w:sz="4" w:color="D9D9D9"/>
+              <w:left w:val="single" w:sz="4" w:color="D9D9D9"/>
+              <w:bottom w:val="single" w:sz="4" w:color="D9D9D9"/>
+              <w:right w:val="single" w:sz="4" w:color="D9D9D9"/>
+            </w:tcBorders>
+            <w:shd w:fill="F5F5F5"/>
+            <w:tcMar>
+              <w:top w:w="75" w:type="dxa"/>
+              <w:left w:w="75" w:type="dxa"/>
+              <w:bottom w:w="75" w:type="dxa"/>
+              <w:right w:w="75" w:type="dxa"/>
+            </w:tcMar>
+          </w:tcPr>
+          <w:p>
+            <w:pPr>
+              <w:spacing w:after="20" w:line="240" w:lineRule="auto"/>
+            </w:pPr>
+            <w:r>
+              <w:rPr>
+                <w:b w:val="0"/>
+                <w:color w:val="000000"/>
+                <w:sz w:val="18"/>
+              </w:rPr>
+              <w:t>3,871 / 1,688</w:t>
+            </w:r>
+          </w:p>
+        </w:tc>
+      </w:tr>
+      <w:tr>
+        <w:tc>
+          <w:tcPr>
+            <w:tcW w:type="dxa" w:w="5400"/>
+            <w:vAlign w:val="center"/>
+            <w:tcBorders>
+              <w:top w:val="single" w:sz="4" w:color="D9D9D9"/>
+              <w:left w:val="single" w:sz="4" w:color="D9D9D9"/>
+              <w:bottom w:val="single" w:sz="4" w:color="D9D9D9"/>
+              <w:right w:val="single" w:sz="4" w:color="D9D9D9"/>
+            </w:tcBorders>
+            <w:shd w:fill="FFFFFF"/>
+            <w:tcMar>
+              <w:top w:w="75" w:type="dxa"/>
+              <w:left w:w="75" w:type="dxa"/>
+              <w:bottom w:w="75" w:type="dxa"/>
+              <w:right w:w="75" w:type="dxa"/>
+            </w:tcMar>
+          </w:tcPr>
+          <w:p>
+            <w:pPr>
+              <w:spacing w:after="20" w:line="240" w:lineRule="auto"/>
+            </w:pPr>
+            <w:r>
+              <w:rPr>
+                <w:b w:val="0"/>
+                <w:color w:val="000000"/>
+                <w:sz w:val="18"/>
+              </w:rPr>
+              <w:t>Folded core</w:t>
+            </w:r>
+          </w:p>
+        </w:tc>
+        <w:tc>
+          <w:tcPr>
+            <w:tcW w:type="dxa" w:w="2376"/>
+            <w:vAlign w:val="center"/>
+            <w:tcBorders>
+              <w:top w:val="single" w:sz="4" w:color="D9D9D9"/>
+              <w:left w:val="single" w:sz="4" w:color="D9D9D9"/>
+              <w:bottom w:val="single" w:sz="4" w:color="D9D9D9"/>
+              <w:right w:val="single" w:sz="4" w:color="D9D9D9"/>
+            </w:tcBorders>
+            <w:shd w:fill="FFFFFF"/>
+            <w:tcMar>
+              <w:top w:w="75" w:type="dxa"/>
+              <w:left w:w="75" w:type="dxa"/>
+              <w:bottom w:w="75" w:type="dxa"/>
+              <w:right w:w="75" w:type="dxa"/>
+            </w:tcMar>
+          </w:tcPr>
+          <w:p>
+            <w:pPr>
+              <w:spacing w:after="20" w:line="240" w:lineRule="auto"/>
+            </w:pPr>
+            <w:r>
+              <w:rPr>
+                <w:b w:val="0"/>
+                <w:color w:val="000000"/>
+                <w:sz w:val="18"/>
+              </w:rPr>
+              <w:t>+0.139 / +0.101</w:t>
+            </w:r>
+          </w:p>
+        </w:tc>
+        <w:tc>
+          <w:tcPr>
+            <w:tcW w:type="dxa" w:w="2506"/>
+            <w:vAlign w:val="center"/>
+            <w:tcBorders>
+              <w:top w:val="single" w:sz="4" w:color="D9D9D9"/>
+              <w:left w:val="single" w:sz="4" w:color="D9D9D9"/>
+              <w:bottom w:val="single" w:sz="4" w:color="D9D9D9"/>
+              <w:right w:val="single" w:sz="4" w:color="D9D9D9"/>
+            </w:tcBorders>
+            <w:shd w:fill="FFFFFF"/>
+            <w:tcMar>
+              <w:top w:w="75" w:type="dxa"/>
+              <w:left w:w="75" w:type="dxa"/>
+              <w:bottom w:w="75" w:type="dxa"/>
+              <w:right w:w="75" w:type="dxa"/>
+            </w:tcMar>
+          </w:tcPr>
+          <w:p>
+            <w:pPr>
+              <w:spacing w:after="20" w:line="240" w:lineRule="auto"/>
+            </w:pPr>
+            <w:r>
+              <w:rPr>
+                <w:b w:val="0"/>
+                <w:color w:val="000000"/>
+                <w:sz w:val="18"/>
+              </w:rPr>
+              <w:t>2,985 / 1,085</w:t>
+            </w:r>
+          </w:p>
+        </w:tc>
+      </w:tr>
+    </w:tbl>
+    <w:p>
+      <w:pPr>
+        <w:spacing w:after="0"/>
+      </w:pPr>
+    </w:p>
+    <w:p>
+      <w:pPr>
+        <w:keepNext w:val="0"/>
+        <w:spacing w:before="40" w:after="80"/>
+        <w:jc w:val="center"/>
+      </w:pPr>
+      <w:r>
+        <w:rPr>
+          <w:sz w:val="17"/>
+        </w:rPr>
+        <w:t>Table XII. Vivado 2023.2 routes on xc7a100tcsg324-1. External I/O delays are unconstrained; the final legacy tag gate has not been rerouted [14], [16].</w:t>
+      </w:r>
+    </w:p>
+    <w:p>
+      <w:pPr>
+        <w:spacing w:after="60" w:line="245" w:lineRule="auto"/>
+        <w:ind w:firstLine="317"/>
+        <w:jc w:val="both"/>
+      </w:pPr>
+      <w:r>
+        <w:t>Relative to the earlier buffered snapshot, the fold saves 723 LUTs and 595 registers. Its setup path still has seven LUT levels, with 9.841 ns data delay. The small slack differences are not evidence of a higher maximum frequency. AMD notes that 7-series LUT delay is included in net delay, so a large reported routing fraction cannot be interpreted as removable wire delay alone [17].</w:t>
+      </w:r>
+    </w:p>
+    <w:p>
+      <w:pPr>
+        <w:spacing w:after="60" w:line="245" w:lineRule="auto"/>
+        <w:ind w:firstLine="317"/>
+        <w:jc w:val="both"/>
+      </w:pPr>
+      <w:r>
+        <w:t>In separate RTL copies with both board cores folded, the board wrapper routed at 83.333 MHz with +0.785 ns setup and +0.024 ns hold slack, and at 100 MHz in one run with +0.181 ns setup and +0.049 ns hold slack. The 100 MHz build used 9,690 LUTs and 5,362 registers. Board LUT savings did not follow the core-only reduction. No folded bitstream was written or programmed. The earlier physical captures belong to the buffered core; fold board simulations passed the self-test in 995 cycles and all eight demo pairs in 198 cycles. Full-adapter physical streaming remains unmeasured [14].</w:t>
+      </w:r>
+    </w:p>
+    <w:p>
+      <w:pPr>
+        <w:keepNext/>
+        <w:spacing w:before="100" w:after="40"/>
+      </w:pPr>
+      <w:r>
+        <w:rPr>
+          <w:b/>
+          <w:sz w:val="21"/>
+        </w:rPr>
+        <w:t>C. Associated data framing and tag output fixes</w:t>
+      </w:r>
+    </w:p>
+    <w:p>
+      <w:pPr>
+        <w:spacing w:after="60" w:line="245" w:lineRule="auto"/>
+        <w:ind w:firstLine="317"/>
+        <w:jc w:val="both"/>
+      </w:pPr>
+      <w:r>
+        <w:t>The legacy engine incorrectly treated an empty last AD beat as empty AD even when full non-last AD beats preceded it. It skipped the padded block and p8, producing non-standard output and allowing two distinct AD strings to reach the same authentication state. The fix records whether any non-empty AD has been absorbed. An empty terminator after non-empty AD now takes the existing padding path; genuinely empty AD still skips p8. The folded entity already handled this case. Official-vector framing and the empty-AD adapter workload were unaffected [16].</w:t>
+      </w:r>
+    </w:p>
+    <w:p>
+      <w:pPr>
+        <w:spacing w:after="60" w:line="245" w:lineRule="auto"/>
+        <w:ind w:firstLine="317"/>
+        <w:jc w:val="both"/>
+      </w:pPr>
+      <w:r>
+        <w:t>A second fix holds tag_out_o at zero during legacy decryption. The previous assignment exposed the expected tag while the core awaited tag_in_i; routing those bits to an untrusted observer would undermine authentication. Encryption retains the extra tag-visible clock used by the existing demo. The folded entity already gated its tag output. Default configurations therefore intentionally differ from the published 8b886c0 source: pre-fix netlist-identity evidence is historical, not a claim about the final patched engine. Saved final regressions and negative controls cover the gate [16].</w:t>
+      </w:r>
+    </w:p>
+    <w:p>
+      <w:pPr>
+        <w:keepNext/>
+        <w:spacing w:before="100" w:after="40"/>
+      </w:pPr>
+      <w:r>
+        <w:rPr>
+          <w:b/>
+          <w:sz w:val="21"/>
+        </w:rPr>
+        <w:t>D. Weight loading and the remaining system boundary</w:t>
+      </w:r>
+    </w:p>
+    <w:p>
+      <w:pPr>
+        <w:spacing w:after="60" w:line="245" w:lineRule="auto"/>
+        <w:ind w:firstLine="317"/>
+        <w:jc w:val="both"/>
+      </w:pPr>
+      <w:r>
+        <w:t>The core emits provisional plaintext, so a trusted consumer must accept it into quarantine and release it only on commit_o. Discard, reset or protocol error invalidates that transaction. A FIFO is not a complete-message authentication buffer. Independent authenticated chunks can bound storage and allow loading to overlap compute, but require unique encryption nonces, authenticated model and tensor identity, offsets, lengths, chunk count and a trusted version policy. AEAD alone does not prevent rollback or hide weights from an authorized plaintext endpoint. GuardNN motivates workload-aware memory protection; its AES confidentiality-only FPGA prototype is not an Ascon integrity-performance measurement [18].</w:t>
+      </w:r>
+    </w:p>
+    <w:p>
+      <w:pPr>
+        <w:spacing w:after="60" w:line="245" w:lineRule="auto"/>
+        <w:ind w:firstLine="317"/>
+        <w:jc w:val="both"/>
+      </w:pPr>
+      <w:r>
+        <w:t>The weight study found that lossless exponent-oriented compression reduces this export to about 83% of its original size, with byte-exact recovery. That does not establish a faster integrated loader. A decoder must sustain the folded core and must not expose unauthenticated bytes. The next measurements should test folded-core timing across implementation strategies and actual memory service gaps before adding lanes. A two-round folded schedule is a separate, untested candidate [14].</w:t>
+      </w:r>
+    </w:p>
+    <w:p>
+      <w:r>
+        <w:br w:type="page"/>
+      </w:r>
+    </w:p>
+    <w:p>
+      <w:pPr>
+        <w:keepNext/>
+        <w:spacing w:before="100" w:after="40"/>
+      </w:pPr>
+      <w:r>
+        <w:rPr>
+          <w:b/>
+          <w:sz w:val="21"/>
+        </w:rPr>
+        <w:t>XV. Limitations and next work</w:t>
+      </w:r>
+    </w:p>
+    <w:p>
+      <w:pPr>
+        <w:spacing w:after="60" w:line="245" w:lineRule="auto"/>
+        <w:ind w:firstLine="317"/>
+        <w:jc w:val="both"/>
+      </w:pPr>
+      <w:r>
+        <w:t>This version is an unprotected cryptographic core. It does not prevent power or electromagnetic side-channel analysis, and it does not detect injected faults. Kandi et al. describe threshold and redundancy-based hardware options that could be studied in subsequent work [3]. Sections XIII and XIV measure the implemented unrolling and buffering tradeoff, including folded absorption. Independent lanes, memory transport and lossless compression remain separate experiments requiring additional interfaces and components. The external quarantine buffer is also a required part of safe decryption, not an optional application feature.</w:t>
+      </w:r>
+    </w:p>
+    <w:p>
+      <w:pPr>
+        <w:keepNext/>
+        <w:spacing w:before="100" w:after="40"/>
+      </w:pPr>
+      <w:r>
+        <w:rPr>
+          <w:b/>
+          <w:sz w:val="21"/>
+        </w:rPr>
+        <w:t>XVI. Findings</w:t>
+      </w:r>
+    </w:p>
+    <w:p>
+      <w:pPr>
+        <w:spacing w:after="60" w:line="245" w:lineRule="auto"/>
+        <w:ind w:firstLine="317"/>
+        <w:jc w:val="both"/>
+      </w:pPr>
+      <w:r>
+        <w:t>For this adapter, eliminating controller handoffs halves the buffered three-round core's cycle count without removing rounds. The folded core requires 449,581 cycles per direction, matches the reference ciphertext and tag, and reconstructs the complete checkpoint exactly. Its three-clock full-block interval is supported by simulation; its 100 MHz closure is a routed implementation result. Physical full-file transfer, memory bandwidth and authenticated compute integration remain unmeasured. Both the AD empty-terminator defect and legacy decryption tag exposure are fixed in this branch, with focused regressions and negative controls.</w:t>
       </w:r>
     </w:p>
     <w:p>
@@ -8434,7 +9763,7 @@
         <w:rPr>
           <w:sz w:val="16"/>
         </w:rPr>
-        <w:t>[3] A. Kandi et al., “Hardware Implementation of ASCON,” NIST Lightweight Cryptography Workshop, June 2023.</w:t>
+        <w:t>[3] A. Kandi et al., “Hardware Implementation of ASCON,” NIST Lightweight Cryptography Workshop, June 2023. https://csrc.nist.gov/csrc/media/Events/2023/lightweight-cryptography-workshop-2023/documents/accepted-papers/07-hardware-implementation-of-ascon.pdf</w:t>
       </w:r>
     </w:p>
     <w:p>
@@ -8565,6 +9894,71 @@
           <w:sz w:val="16"/>
         </w:rPr>
         <w:t>[13] C. E. LaForest, “Rules for Ready/Valid Handshakes and Synchronization,” FPGA Design Elements. [Online]. Available: https://fpgacpu.ca/fpga/handshake.html. Accessed Oct. 21, 2026.</w:t>
+      </w:r>
+    </w:p>
+    <w:p>
+      <w:pPr>
+        <w:spacing w:after="30"/>
+        <w:ind w:left="317" w:hanging="317"/>
+        <w:jc w:val="left"/>
+      </w:pPr>
+      <w:r>
+        <w:rPr>
+          <w:sz w:val="16"/>
+        </w:rPr>
+        <w:t>[14] K. Jones, Folded Ascon weight stream study, October 21, 2026. Repository reports/Ascon weight stream bottlenecks.md and docs/evidence/handoff_study_fold_20261021/. https://github.com/kroix-ovo/ascon-aead128-vhdl/tree/ascon-weight-stream-fold-absorb</w:t>
+      </w:r>
+    </w:p>
+    <w:p>
+      <w:pPr>
+        <w:spacing w:after="30"/>
+        <w:ind w:left="317" w:hanging="317"/>
+        <w:jc w:val="left"/>
+      </w:pPr>
+      <w:r>
+        <w:rPr>
+          <w:sz w:val="16"/>
+        </w:rPr>
+        <w:t>[15] T. Itschner, ascon_cipher_verilog, source architecture reference. https://github.com/tristanitschner/ascon_cipher_verilog. No third-party timing result is adopted here.</w:t>
+      </w:r>
+    </w:p>
+    <w:p>
+      <w:pPr>
+        <w:spacing w:after="30"/>
+        <w:ind w:left="317" w:hanging="317"/>
+        <w:jc w:val="left"/>
+      </w:pPr>
+      <w:r>
+        <w:rPr>
+          <w:sz w:val="16"/>
+        </w:rPr>
+        <w:t>[16] K. Jones, Associated data padding and decryption tag output fixes, October 21, 2026. Repository docs/ad_padding_fix.md; docs/evidence/ad_padding_fix_20261021/; docs/evidence/tag_output_gate_20261021/.</w:t>
+      </w:r>
+    </w:p>
+    <w:p>
+      <w:pPr>
+        <w:spacing w:after="30"/>
+        <w:ind w:left="317" w:hanging="317"/>
+        <w:jc w:val="left"/>
+      </w:pPr>
+      <w:r>
+        <w:rPr>
+          <w:sz w:val="16"/>
+        </w:rPr>
+        <w:t>[17] AMD, Vivado Design Suite User Guide Design Analysis and Closure Techniques, UG906, Category 1 Timing, 2026.1. https://docs.amd.com/r/en-US/ug906-vivado-design-analysis/Category-1-Timing</w:t>
+      </w:r>
+    </w:p>
+    <w:p>
+      <w:pPr>
+        <w:spacing w:after="30"/>
+        <w:ind w:left="317" w:hanging="317"/>
+        <w:jc w:val="left"/>
+      </w:pPr>
+      <w:r>
+        <w:rPr>
+          <w:sz w:val="16"/>
+        </w:rPr>
+        <w:t>[18] W. Hua, M. Umar, Z. Zhang and G. E. Suh, GuardNN Secure Accelerator Architecture for Privacy-Preserving Deep Learning, DAC 2022, doi: 10.1145/3489517.3530439. https://arxiv.org/html/2008.11632v2.</w:t>
       </w:r>
     </w:p>
     <w:p>

</xml_diff>

<commit_message>
Publish folded multicore results and pipeline research with architecture figures
</commit_message>
<xml_diff>
--- a/paper/VHDL_Implementation_of_NIST_Ascon_AEAD128_on_a_Nexys_A7_FPGA.docx
+++ b/paper/VHDL_Implementation_of_NIST_Ascon_AEAD128_on_a_Nexys_A7_FPGA.docx
@@ -56,7 +56,7 @@
         <w:jc w:val="both"/>
       </w:pPr>
       <w:r>
-        <w:t>This paper describes a VHDL-2008 implementation of the standardized NIST Ascon-AEAD128 algorithm for a Nexys A7 100T FPGA. The design uses one shared 320-bit permutation datapath with configurable round unrolling and optional input/output queues. A 128-bit streaming interface accepts associated data and payload bytes, including empty and partial blocks. Encryption returns ciphertext and a tag. Decryption returns provisional plaintext that an external quarantine releases only after tag verification. The portable test flow passed all 1,089 official known-answer vectors in both directions with GHDL and Vivado XSim. Generated Verilog was also checked with Icarus Verilog and Verilator. Vivado 2023.2 completed synthesis, placement, routing, timing analysis, and bitstream generation. At a simulated 100 MHz, the complete 2,397,696-byte FP32 adapter payload encrypts and decrypts in 449,581 cycles per direction with folded absorption, compared with 899,153 for the buffered three-round core and 1,798,305 for the one-round baseline. All recovered bytes match and authentication passes. The folded core routes at 100 MHz with unconstrained external I/O; a board-integrated copy also meets 100 MHz in one run. Earlier physical captures validate only the buffered design. The folded core has not been programmed or measured on hardware. Section XIV separates these evidence scopes and documents the later AD padding and decryption tag output fixes.</w:t>
+        <w:t>This paper describes a VHDL-2008 implementation of the standardized NIST Ascon-AEAD128 algorithm for a Nexys A7 100T FPGA. The design uses one shared 320-bit permutation datapath with configurable round unrolling and optional input/output queues. A 128-bit streaming interface accepts associated data and payload bytes, including empty and partial blocks. Encryption returns ciphertext and a tag. Decryption returns provisional plaintext that an external quarantine releases only after tag verification. The portable test flow passed all 1,089 official known-answer vectors in both directions with GHDL and Vivado XSim. Generated Verilog was also checked with Icarus Verilog and Verilator. Vivado 2023.2 completed synthesis, placement, routing, timing analysis, and bitstream generation. At a simulated 100 MHz, the complete 2,397,696-byte FP32 adapter payload encrypts and decrypts in 449,581 cycles per direction with folded absorption, compared with 899,153 for the buffered three-round core and 1,798,305 for the one-round baseline. All recovered bytes match and authentication passes. The folded core routes at 100 MHz with unconstrained external I/O; a board-integrated copy also meets 100 MHz in one run. Earlier physical captures validate only the buffered design. Later multicore board tests pass a 3,072-byte fixture for one, two and four folded cores; full-file physical transfer remains unmeasured. A separate dependent-round pipeline experiment finds that controller fixes improve the unchanged 12-clock design from 70.8 to 49.8 ns per block, while two- and three-stage round splits increase elapsed latency. Sections XIV through XVI distinguish simulation, routed timing, modeled memory and physical fixture evidence.</w:t>
       </w:r>
     </w:p>
     <w:p>
@@ -9893,7 +9893,7 @@
         <w:jc w:val="both"/>
       </w:pPr>
       <w:r>
-        <w:t>In separate RTL copies with both board cores folded, the board wrapper routed at 83.333 MHz with +0.785 ns setup and +0.024 ns hold slack, and at 100 MHz in one run with +0.181 ns setup and +0.049 ns hold slack. The 100 MHz build used 9,690 LUTs and 5,362 registers. Board LUT savings did not follow the core-only reduction. No folded bitstream was written or programmed. The earlier physical captures belong to the buffered core; fold board simulations passed the self-test in 995 cycles and all eight demo pairs in 198 cycles. Full-adapter physical streaming remains unmeasured [14].</w:t>
+        <w:t>In separate RTL copies with both board cores folded, the board wrapper routed at 83.333 MHz with +0.785 ns setup and +0.024 ns hold slack, and at 100 MHz in one run with +0.181 ns setup and +0.049 ns hold slack. The 100 MHz build used 9,690 LUTs and 5,362 registers. Board LUT savings did not follow the core-only reduction. At this October 21 stage, no folded bitstream was written or programmed; the later multicore fixture is reported in Section XVI. The earlier physical captures belong to the buffered core; fold board simulations passed the self-test in 995 cycles and all eight demo pairs in 198 cycles. Full-adapter physical streaming remains unmeasured [14].</w:t>
       </w:r>
     </w:p>
     <w:p>
@@ -9973,7 +9973,7 @@
           <w:b/>
           <w:sz w:val="21"/>
         </w:rPr>
-        <w:t>XV. Limitations and next work</w:t>
+        <w:t>XV. Dependent p8 round pipelining and controller timing</w:t>
       </w:r>
     </w:p>
     <w:p>
@@ -9983,7 +9983,1466 @@
         <w:jc w:val="both"/>
       </w:pPr>
       <w:r>
-        <w:t>This version is an unprotected cryptographic core. It does not prevent power or electromagnetic side-channel analysis, and it does not detect injected faults. Kandi et al. describe threshold and redundancy-based hardware options that could be studied in subsequent work [3]. Sections XIII and XIV measure the implemented unrolling and buffering tradeoff, including folded absorption. Independent lanes, memory transport and lossless compression remain separate experiments requiring additional interfaces and components. The external quarantine buffer is also a required part of safe decryption, not an optional application feature.</w:t>
+        <w:t>The isolated one-round experiment found no latency benefit from splitting a dependent round. The best tested design retains the original one-round datapath and optimizes its controller: 12 clocks at a 4.15 ns passing routed period, or 49.8 ns per block, compared with 70.8 ns for baseline A. This is a 1.422 times elapsed-time improvement. These are routed periods multiplied by simulated cycle counts; no pipeline variant was programmed or measured on the FPGA [19].</w:t>
+      </w:r>
+    </w:p>
+    <w:p>
+      <w:pPr>
+        <w:spacing w:after="60" w:line="245" w:lineRule="auto"/>
+        <w:ind w:firstLine="317"/>
+        <w:jc w:val="both"/>
+      </w:pPr>
+      <w:r>
+        <w:t>This experiment starts from main commit 3cceb3c and uses one message context, unchanged nonce semantics and no round unrolling or interleaving. It is separate from the folded and multicore designs. A denotes accept and absorb, O the output handshake, L the permutation load, and C the final capture. The schedule A, O, L, eight p8 rounds with constants B4 through 4B, C gives the measured 12-clock block interval. A two-stage reused round needs 20 clocks and a three-stage reused round needs 28. Initialization and finalization still use p12, with 12, 24 or 36 round clocks respectively.</w:t>
+      </w:r>
+    </w:p>
+    <w:p>
+      <w:pPr>
+        <w:keepNext/>
+        <w:spacing w:after="0"/>
+        <w:jc w:val="center"/>
+      </w:pPr>
+      <w:r>
+        <w:drawing>
+          <wp:inline xmlns:a="http://schemas.openxmlformats.org/drawingml/2006/main" xmlns:pic="http://schemas.openxmlformats.org/drawingml/2006/picture">
+            <wp:extent cx="6400800" cy="4417282"/>
+            <wp:docPr id="8" name="Picture 8"/>
+            <wp:cNvGraphicFramePr>
+              <a:graphicFrameLocks noChangeAspect="1"/>
+            </wp:cNvGraphicFramePr>
+            <a:graphic>
+              <a:graphicData uri="http://schemas.openxmlformats.org/drawingml/2006/picture">
+                <pic:pic>
+                  <pic:nvPicPr>
+                    <pic:cNvPr id="0" name="fig_xv_pipeline_rounds.png"/>
+                    <pic:cNvPicPr/>
+                  </pic:nvPicPr>
+                  <pic:blipFill>
+                    <a:blip r:embed="rId17"/>
+                    <a:stretch>
+                      <a:fillRect/>
+                    </a:stretch>
+                  </pic:blipFill>
+                  <pic:spPr>
+                    <a:xfrm>
+                      <a:off x="0" y="0"/>
+                      <a:ext cx="6400800" cy="4417282"/>
+                    </a:xfrm>
+                    <a:prstGeom prst="rect"/>
+                  </pic:spPr>
+                </pic:pic>
+              </a:graphicData>
+            </a:graphic>
+          </wp:inline>
+        </w:drawing>
+      </w:r>
+    </w:p>
+    <w:p>
+      <w:pPr>
+        <w:keepNext w:val="0"/>
+        <w:spacing w:before="40" w:after="80"/>
+        <w:jc w:val="center"/>
+      </w:pPr>
+      <w:r>
+        <w:rPr>
+          <w:sz w:val="17"/>
+        </w:rPr>
+        <w:t>Fig. 9. Implemented round boundaries for A, B and C. Each stage result is registered; the P register holds only completed rounds. Dependent rounds do not overlap. D uses B with controller fixes; A_ctrl2 retains A.</w:t>
+      </w:r>
+    </w:p>
+    <w:tbl>
+      <w:tblPr>
+        <w:tblW w:type="auto" w:w="0"/>
+        <w:jc w:val="center"/>
+        <w:tblLayout w:type="fixed"/>
+        <w:tblLook w:firstColumn="1" w:firstRow="1" w:lastColumn="0" w:lastRow="0" w:noHBand="0" w:noVBand="1" w:val="04A0"/>
+      </w:tblPr>
+      <w:tblGrid>
+        <w:gridCol w:w="2549"/>
+        <w:gridCol w:w="792"/>
+        <w:gridCol w:w="2419"/>
+        <w:gridCol w:w="1152"/>
+        <w:gridCol w:w="1397"/>
+        <w:gridCol w:w="1973"/>
+      </w:tblGrid>
+      <w:tr>
+        <w:trPr>
+          <w:tblHeader/>
+        </w:trPr>
+        <w:tc>
+          <w:tcPr>
+            <w:tcW w:type="dxa" w:w="2549"/>
+            <w:vAlign w:val="center"/>
+            <w:tcBorders>
+              <w:top w:val="single" w:sz="4" w:color="D9D9D9"/>
+              <w:left w:val="single" w:sz="4" w:color="D9D9D9"/>
+              <w:bottom w:val="single" w:sz="4" w:color="D9D9D9"/>
+              <w:right w:val="single" w:sz="4" w:color="D9D9D9"/>
+            </w:tcBorders>
+            <w:shd w:fill="E7E6E6"/>
+            <w:tcMar>
+              <w:top w:w="75" w:type="dxa"/>
+              <w:left w:w="75" w:type="dxa"/>
+              <w:bottom w:w="75" w:type="dxa"/>
+              <w:right w:w="75" w:type="dxa"/>
+            </w:tcMar>
+          </w:tcPr>
+          <w:p>
+            <w:pPr>
+              <w:spacing w:after="20" w:line="240" w:lineRule="auto"/>
+            </w:pPr>
+            <w:r>
+              <w:rPr>
+                <w:b/>
+                <w:color w:val="000000"/>
+                <w:sz w:val="18"/>
+              </w:rPr>
+              <w:t>Variant</w:t>
+            </w:r>
+          </w:p>
+        </w:tc>
+        <w:tc>
+          <w:tcPr>
+            <w:tcW w:type="dxa" w:w="792"/>
+            <w:vAlign w:val="center"/>
+            <w:tcBorders>
+              <w:top w:val="single" w:sz="4" w:color="D9D9D9"/>
+              <w:left w:val="single" w:sz="4" w:color="D9D9D9"/>
+              <w:bottom w:val="single" w:sz="4" w:color="D9D9D9"/>
+              <w:right w:val="single" w:sz="4" w:color="D9D9D9"/>
+            </w:tcBorders>
+            <w:shd w:fill="E7E6E6"/>
+            <w:tcMar>
+              <w:top w:w="75" w:type="dxa"/>
+              <w:left w:w="75" w:type="dxa"/>
+              <w:bottom w:w="75" w:type="dxa"/>
+              <w:right w:w="75" w:type="dxa"/>
+            </w:tcMar>
+          </w:tcPr>
+          <w:p>
+            <w:pPr>
+              <w:spacing w:after="20" w:line="240" w:lineRule="auto"/>
+            </w:pPr>
+            <w:r>
+              <w:rPr>
+                <w:b/>
+                <w:color w:val="000000"/>
+                <w:sz w:val="18"/>
+              </w:rPr>
+              <w:t>Cycles</w:t>
+            </w:r>
+          </w:p>
+        </w:tc>
+        <w:tc>
+          <w:tcPr>
+            <w:tcW w:type="dxa" w:w="2419"/>
+            <w:vAlign w:val="center"/>
+            <w:tcBorders>
+              <w:top w:val="single" w:sz="4" w:color="D9D9D9"/>
+              <w:left w:val="single" w:sz="4" w:color="D9D9D9"/>
+              <w:bottom w:val="single" w:sz="4" w:color="D9D9D9"/>
+              <w:right w:val="single" w:sz="4" w:color="D9D9D9"/>
+            </w:tcBorders>
+            <w:shd w:fill="E7E6E6"/>
+            <w:tcMar>
+              <w:top w:w="75" w:type="dxa"/>
+              <w:left w:w="75" w:type="dxa"/>
+              <w:bottom w:w="75" w:type="dxa"/>
+              <w:right w:w="75" w:type="dxa"/>
+            </w:tcMar>
+          </w:tcPr>
+          <w:p>
+            <w:pPr>
+              <w:spacing w:after="20" w:line="240" w:lineRule="auto"/>
+            </w:pPr>
+            <w:r>
+              <w:rPr>
+                <w:b/>
+                <w:color w:val="000000"/>
+                <w:sz w:val="18"/>
+              </w:rPr>
+              <w:t>Pass / next fail ns</w:t>
+            </w:r>
+          </w:p>
+        </w:tc>
+        <w:tc>
+          <w:tcPr>
+            <w:tcW w:type="dxa" w:w="1152"/>
+            <w:vAlign w:val="center"/>
+            <w:tcBorders>
+              <w:top w:val="single" w:sz="4" w:color="D9D9D9"/>
+              <w:left w:val="single" w:sz="4" w:color="D9D9D9"/>
+              <w:bottom w:val="single" w:sz="4" w:color="D9D9D9"/>
+              <w:right w:val="single" w:sz="4" w:color="D9D9D9"/>
+            </w:tcBorders>
+            <w:shd w:fill="E7E6E6"/>
+            <w:tcMar>
+              <w:top w:w="75" w:type="dxa"/>
+              <w:left w:w="75" w:type="dxa"/>
+              <w:bottom w:w="75" w:type="dxa"/>
+              <w:right w:w="75" w:type="dxa"/>
+            </w:tcMar>
+          </w:tcPr>
+          <w:p>
+            <w:pPr>
+              <w:spacing w:after="20" w:line="240" w:lineRule="auto"/>
+            </w:pPr>
+            <w:r>
+              <w:rPr>
+                <w:b/>
+                <w:color w:val="000000"/>
+                <w:sz w:val="18"/>
+              </w:rPr>
+              <w:t>MHz</w:t>
+            </w:r>
+          </w:p>
+        </w:tc>
+        <w:tc>
+          <w:tcPr>
+            <w:tcW w:type="dxa" w:w="1397"/>
+            <w:vAlign w:val="center"/>
+            <w:tcBorders>
+              <w:top w:val="single" w:sz="4" w:color="D9D9D9"/>
+              <w:left w:val="single" w:sz="4" w:color="D9D9D9"/>
+              <w:bottom w:val="single" w:sz="4" w:color="D9D9D9"/>
+              <w:right w:val="single" w:sz="4" w:color="D9D9D9"/>
+            </w:tcBorders>
+            <w:shd w:fill="E7E6E6"/>
+            <w:tcMar>
+              <w:top w:w="75" w:type="dxa"/>
+              <w:left w:w="75" w:type="dxa"/>
+              <w:bottom w:w="75" w:type="dxa"/>
+              <w:right w:w="75" w:type="dxa"/>
+            </w:tcMar>
+          </w:tcPr>
+          <w:p>
+            <w:pPr>
+              <w:spacing w:after="20" w:line="240" w:lineRule="auto"/>
+            </w:pPr>
+            <w:r>
+              <w:rPr>
+                <w:b/>
+                <w:color w:val="000000"/>
+                <w:sz w:val="18"/>
+              </w:rPr>
+              <w:t>Block ns</w:t>
+            </w:r>
+          </w:p>
+        </w:tc>
+        <w:tc>
+          <w:tcPr>
+            <w:tcW w:type="dxa" w:w="1973"/>
+            <w:vAlign w:val="center"/>
+            <w:tcBorders>
+              <w:top w:val="single" w:sz="4" w:color="D9D9D9"/>
+              <w:left w:val="single" w:sz="4" w:color="D9D9D9"/>
+              <w:bottom w:val="single" w:sz="4" w:color="D9D9D9"/>
+              <w:right w:val="single" w:sz="4" w:color="D9D9D9"/>
+            </w:tcBorders>
+            <w:shd w:fill="E7E6E6"/>
+            <w:tcMar>
+              <w:top w:w="75" w:type="dxa"/>
+              <w:left w:w="75" w:type="dxa"/>
+              <w:bottom w:w="75" w:type="dxa"/>
+              <w:right w:w="75" w:type="dxa"/>
+            </w:tcMar>
+          </w:tcPr>
+          <w:p>
+            <w:pPr>
+              <w:spacing w:after="20" w:line="240" w:lineRule="auto"/>
+            </w:pPr>
+            <w:r>
+              <w:rPr>
+                <w:b/>
+                <w:color w:val="000000"/>
+                <w:sz w:val="18"/>
+              </w:rPr>
+              <w:t>Speedup</w:t>
+            </w:r>
+          </w:p>
+        </w:tc>
+      </w:tr>
+      <w:tr>
+        <w:tc>
+          <w:tcPr>
+            <w:tcW w:type="dxa" w:w="2549"/>
+            <w:vAlign w:val="center"/>
+            <w:tcBorders>
+              <w:top w:val="single" w:sz="4" w:color="D9D9D9"/>
+              <w:left w:val="single" w:sz="4" w:color="D9D9D9"/>
+              <w:bottom w:val="single" w:sz="4" w:color="D9D9D9"/>
+              <w:right w:val="single" w:sz="4" w:color="D9D9D9"/>
+            </w:tcBorders>
+            <w:shd w:fill="FFFFFF"/>
+            <w:tcMar>
+              <w:top w:w="75" w:type="dxa"/>
+              <w:left w:w="75" w:type="dxa"/>
+              <w:bottom w:w="75" w:type="dxa"/>
+              <w:right w:w="75" w:type="dxa"/>
+            </w:tcMar>
+          </w:tcPr>
+          <w:p>
+            <w:pPr>
+              <w:spacing w:after="20" w:line="240" w:lineRule="auto"/>
+            </w:pPr>
+            <w:r>
+              <w:rPr>
+                <w:b w:val="0"/>
+                <w:color w:val="000000"/>
+                <w:sz w:val="18"/>
+              </w:rPr>
+              <w:t>A baseline</w:t>
+            </w:r>
+          </w:p>
+        </w:tc>
+        <w:tc>
+          <w:tcPr>
+            <w:tcW w:type="dxa" w:w="792"/>
+            <w:vAlign w:val="center"/>
+            <w:tcBorders>
+              <w:top w:val="single" w:sz="4" w:color="D9D9D9"/>
+              <w:left w:val="single" w:sz="4" w:color="D9D9D9"/>
+              <w:bottom w:val="single" w:sz="4" w:color="D9D9D9"/>
+              <w:right w:val="single" w:sz="4" w:color="D9D9D9"/>
+            </w:tcBorders>
+            <w:shd w:fill="FFFFFF"/>
+            <w:tcMar>
+              <w:top w:w="75" w:type="dxa"/>
+              <w:left w:w="75" w:type="dxa"/>
+              <w:bottom w:w="75" w:type="dxa"/>
+              <w:right w:w="75" w:type="dxa"/>
+            </w:tcMar>
+          </w:tcPr>
+          <w:p>
+            <w:pPr>
+              <w:spacing w:after="20" w:line="240" w:lineRule="auto"/>
+            </w:pPr>
+            <w:r>
+              <w:rPr>
+                <w:b w:val="0"/>
+                <w:color w:val="000000"/>
+                <w:sz w:val="18"/>
+              </w:rPr>
+              <w:t>12</w:t>
+            </w:r>
+          </w:p>
+        </w:tc>
+        <w:tc>
+          <w:tcPr>
+            <w:tcW w:type="dxa" w:w="2419"/>
+            <w:vAlign w:val="center"/>
+            <w:tcBorders>
+              <w:top w:val="single" w:sz="4" w:color="D9D9D9"/>
+              <w:left w:val="single" w:sz="4" w:color="D9D9D9"/>
+              <w:bottom w:val="single" w:sz="4" w:color="D9D9D9"/>
+              <w:right w:val="single" w:sz="4" w:color="D9D9D9"/>
+            </w:tcBorders>
+            <w:shd w:fill="FFFFFF"/>
+            <w:tcMar>
+              <w:top w:w="75" w:type="dxa"/>
+              <w:left w:w="75" w:type="dxa"/>
+              <w:bottom w:w="75" w:type="dxa"/>
+              <w:right w:w="75" w:type="dxa"/>
+            </w:tcMar>
+          </w:tcPr>
+          <w:p>
+            <w:pPr>
+              <w:spacing w:after="20" w:line="240" w:lineRule="auto"/>
+            </w:pPr>
+            <w:r>
+              <w:rPr>
+                <w:b w:val="0"/>
+                <w:color w:val="000000"/>
+                <w:sz w:val="18"/>
+              </w:rPr>
+              <w:t>5.90 / 5.85</w:t>
+            </w:r>
+          </w:p>
+        </w:tc>
+        <w:tc>
+          <w:tcPr>
+            <w:tcW w:type="dxa" w:w="1152"/>
+            <w:vAlign w:val="center"/>
+            <w:tcBorders>
+              <w:top w:val="single" w:sz="4" w:color="D9D9D9"/>
+              <w:left w:val="single" w:sz="4" w:color="D9D9D9"/>
+              <w:bottom w:val="single" w:sz="4" w:color="D9D9D9"/>
+              <w:right w:val="single" w:sz="4" w:color="D9D9D9"/>
+            </w:tcBorders>
+            <w:shd w:fill="FFFFFF"/>
+            <w:tcMar>
+              <w:top w:w="75" w:type="dxa"/>
+              <w:left w:w="75" w:type="dxa"/>
+              <w:bottom w:w="75" w:type="dxa"/>
+              <w:right w:w="75" w:type="dxa"/>
+            </w:tcMar>
+          </w:tcPr>
+          <w:p>
+            <w:pPr>
+              <w:spacing w:after="20" w:line="240" w:lineRule="auto"/>
+            </w:pPr>
+            <w:r>
+              <w:rPr>
+                <w:b w:val="0"/>
+                <w:color w:val="000000"/>
+                <w:sz w:val="18"/>
+              </w:rPr>
+              <w:t>169.5</w:t>
+            </w:r>
+          </w:p>
+        </w:tc>
+        <w:tc>
+          <w:tcPr>
+            <w:tcW w:type="dxa" w:w="1397"/>
+            <w:vAlign w:val="center"/>
+            <w:tcBorders>
+              <w:top w:val="single" w:sz="4" w:color="D9D9D9"/>
+              <w:left w:val="single" w:sz="4" w:color="D9D9D9"/>
+              <w:bottom w:val="single" w:sz="4" w:color="D9D9D9"/>
+              <w:right w:val="single" w:sz="4" w:color="D9D9D9"/>
+            </w:tcBorders>
+            <w:shd w:fill="FFFFFF"/>
+            <w:tcMar>
+              <w:top w:w="75" w:type="dxa"/>
+              <w:left w:w="75" w:type="dxa"/>
+              <w:bottom w:w="75" w:type="dxa"/>
+              <w:right w:w="75" w:type="dxa"/>
+            </w:tcMar>
+          </w:tcPr>
+          <w:p>
+            <w:pPr>
+              <w:spacing w:after="20" w:line="240" w:lineRule="auto"/>
+            </w:pPr>
+            <w:r>
+              <w:rPr>
+                <w:b w:val="0"/>
+                <w:color w:val="000000"/>
+                <w:sz w:val="18"/>
+              </w:rPr>
+              <w:t>70.8</w:t>
+            </w:r>
+          </w:p>
+        </w:tc>
+        <w:tc>
+          <w:tcPr>
+            <w:tcW w:type="dxa" w:w="1973"/>
+            <w:vAlign w:val="center"/>
+            <w:tcBorders>
+              <w:top w:val="single" w:sz="4" w:color="D9D9D9"/>
+              <w:left w:val="single" w:sz="4" w:color="D9D9D9"/>
+              <w:bottom w:val="single" w:sz="4" w:color="D9D9D9"/>
+              <w:right w:val="single" w:sz="4" w:color="D9D9D9"/>
+            </w:tcBorders>
+            <w:shd w:fill="FFFFFF"/>
+            <w:tcMar>
+              <w:top w:w="75" w:type="dxa"/>
+              <w:left w:w="75" w:type="dxa"/>
+              <w:bottom w:w="75" w:type="dxa"/>
+              <w:right w:w="75" w:type="dxa"/>
+            </w:tcMar>
+          </w:tcPr>
+          <w:p>
+            <w:pPr>
+              <w:spacing w:after="20" w:line="240" w:lineRule="auto"/>
+            </w:pPr>
+            <w:r>
+              <w:rPr>
+                <w:b w:val="0"/>
+                <w:color w:val="000000"/>
+                <w:sz w:val="18"/>
+              </w:rPr>
+              <w:t>1.000</w:t>
+            </w:r>
+          </w:p>
+        </w:tc>
+      </w:tr>
+      <w:tr>
+        <w:tc>
+          <w:tcPr>
+            <w:tcW w:type="dxa" w:w="2549"/>
+            <w:vAlign w:val="center"/>
+            <w:tcBorders>
+              <w:top w:val="single" w:sz="4" w:color="D9D9D9"/>
+              <w:left w:val="single" w:sz="4" w:color="D9D9D9"/>
+              <w:bottom w:val="single" w:sz="4" w:color="D9D9D9"/>
+              <w:right w:val="single" w:sz="4" w:color="D9D9D9"/>
+            </w:tcBorders>
+            <w:shd w:fill="F5F5F5"/>
+            <w:tcMar>
+              <w:top w:w="75" w:type="dxa"/>
+              <w:left w:w="75" w:type="dxa"/>
+              <w:bottom w:w="75" w:type="dxa"/>
+              <w:right w:w="75" w:type="dxa"/>
+            </w:tcMar>
+          </w:tcPr>
+          <w:p>
+            <w:pPr>
+              <w:spacing w:after="20" w:line="240" w:lineRule="auto"/>
+            </w:pPr>
+            <w:r>
+              <w:rPr>
+                <w:b w:val="0"/>
+                <w:color w:val="000000"/>
+                <w:sz w:val="18"/>
+              </w:rPr>
+              <w:t>B two-stage</w:t>
+            </w:r>
+          </w:p>
+        </w:tc>
+        <w:tc>
+          <w:tcPr>
+            <w:tcW w:type="dxa" w:w="792"/>
+            <w:vAlign w:val="center"/>
+            <w:tcBorders>
+              <w:top w:val="single" w:sz="4" w:color="D9D9D9"/>
+              <w:left w:val="single" w:sz="4" w:color="D9D9D9"/>
+              <w:bottom w:val="single" w:sz="4" w:color="D9D9D9"/>
+              <w:right w:val="single" w:sz="4" w:color="D9D9D9"/>
+            </w:tcBorders>
+            <w:shd w:fill="F5F5F5"/>
+            <w:tcMar>
+              <w:top w:w="75" w:type="dxa"/>
+              <w:left w:w="75" w:type="dxa"/>
+              <w:bottom w:w="75" w:type="dxa"/>
+              <w:right w:w="75" w:type="dxa"/>
+            </w:tcMar>
+          </w:tcPr>
+          <w:p>
+            <w:pPr>
+              <w:spacing w:after="20" w:line="240" w:lineRule="auto"/>
+            </w:pPr>
+            <w:r>
+              <w:rPr>
+                <w:b w:val="0"/>
+                <w:color w:val="000000"/>
+                <w:sz w:val="18"/>
+              </w:rPr>
+              <w:t>20</w:t>
+            </w:r>
+          </w:p>
+        </w:tc>
+        <w:tc>
+          <w:tcPr>
+            <w:tcW w:type="dxa" w:w="2419"/>
+            <w:vAlign w:val="center"/>
+            <w:tcBorders>
+              <w:top w:val="single" w:sz="4" w:color="D9D9D9"/>
+              <w:left w:val="single" w:sz="4" w:color="D9D9D9"/>
+              <w:bottom w:val="single" w:sz="4" w:color="D9D9D9"/>
+              <w:right w:val="single" w:sz="4" w:color="D9D9D9"/>
+            </w:tcBorders>
+            <w:shd w:fill="F5F5F5"/>
+            <w:tcMar>
+              <w:top w:w="75" w:type="dxa"/>
+              <w:left w:w="75" w:type="dxa"/>
+              <w:bottom w:w="75" w:type="dxa"/>
+              <w:right w:w="75" w:type="dxa"/>
+            </w:tcMar>
+          </w:tcPr>
+          <w:p>
+            <w:pPr>
+              <w:spacing w:after="20" w:line="240" w:lineRule="auto"/>
+            </w:pPr>
+            <w:r>
+              <w:rPr>
+                <w:b w:val="0"/>
+                <w:color w:val="000000"/>
+                <w:sz w:val="18"/>
+              </w:rPr>
+              <w:t>6.20 / 6.15</w:t>
+            </w:r>
+          </w:p>
+        </w:tc>
+        <w:tc>
+          <w:tcPr>
+            <w:tcW w:type="dxa" w:w="1152"/>
+            <w:vAlign w:val="center"/>
+            <w:tcBorders>
+              <w:top w:val="single" w:sz="4" w:color="D9D9D9"/>
+              <w:left w:val="single" w:sz="4" w:color="D9D9D9"/>
+              <w:bottom w:val="single" w:sz="4" w:color="D9D9D9"/>
+              <w:right w:val="single" w:sz="4" w:color="D9D9D9"/>
+            </w:tcBorders>
+            <w:shd w:fill="F5F5F5"/>
+            <w:tcMar>
+              <w:top w:w="75" w:type="dxa"/>
+              <w:left w:w="75" w:type="dxa"/>
+              <w:bottom w:w="75" w:type="dxa"/>
+              <w:right w:w="75" w:type="dxa"/>
+            </w:tcMar>
+          </w:tcPr>
+          <w:p>
+            <w:pPr>
+              <w:spacing w:after="20" w:line="240" w:lineRule="auto"/>
+            </w:pPr>
+            <w:r>
+              <w:rPr>
+                <w:b w:val="0"/>
+                <w:color w:val="000000"/>
+                <w:sz w:val="18"/>
+              </w:rPr>
+              <w:t>161.3</w:t>
+            </w:r>
+          </w:p>
+        </w:tc>
+        <w:tc>
+          <w:tcPr>
+            <w:tcW w:type="dxa" w:w="1397"/>
+            <w:vAlign w:val="center"/>
+            <w:tcBorders>
+              <w:top w:val="single" w:sz="4" w:color="D9D9D9"/>
+              <w:left w:val="single" w:sz="4" w:color="D9D9D9"/>
+              <w:bottom w:val="single" w:sz="4" w:color="D9D9D9"/>
+              <w:right w:val="single" w:sz="4" w:color="D9D9D9"/>
+            </w:tcBorders>
+            <w:shd w:fill="F5F5F5"/>
+            <w:tcMar>
+              <w:top w:w="75" w:type="dxa"/>
+              <w:left w:w="75" w:type="dxa"/>
+              <w:bottom w:w="75" w:type="dxa"/>
+              <w:right w:w="75" w:type="dxa"/>
+            </w:tcMar>
+          </w:tcPr>
+          <w:p>
+            <w:pPr>
+              <w:spacing w:after="20" w:line="240" w:lineRule="auto"/>
+            </w:pPr>
+            <w:r>
+              <w:rPr>
+                <w:b w:val="0"/>
+                <w:color w:val="000000"/>
+                <w:sz w:val="18"/>
+              </w:rPr>
+              <w:t>124.0</w:t>
+            </w:r>
+          </w:p>
+        </w:tc>
+        <w:tc>
+          <w:tcPr>
+            <w:tcW w:type="dxa" w:w="1973"/>
+            <w:vAlign w:val="center"/>
+            <w:tcBorders>
+              <w:top w:val="single" w:sz="4" w:color="D9D9D9"/>
+              <w:left w:val="single" w:sz="4" w:color="D9D9D9"/>
+              <w:bottom w:val="single" w:sz="4" w:color="D9D9D9"/>
+              <w:right w:val="single" w:sz="4" w:color="D9D9D9"/>
+            </w:tcBorders>
+            <w:shd w:fill="F5F5F5"/>
+            <w:tcMar>
+              <w:top w:w="75" w:type="dxa"/>
+              <w:left w:w="75" w:type="dxa"/>
+              <w:bottom w:w="75" w:type="dxa"/>
+              <w:right w:w="75" w:type="dxa"/>
+            </w:tcMar>
+          </w:tcPr>
+          <w:p>
+            <w:pPr>
+              <w:spacing w:after="20" w:line="240" w:lineRule="auto"/>
+            </w:pPr>
+            <w:r>
+              <w:rPr>
+                <w:b w:val="0"/>
+                <w:color w:val="000000"/>
+                <w:sz w:val="18"/>
+              </w:rPr>
+              <w:t>0.571</w:t>
+            </w:r>
+          </w:p>
+        </w:tc>
+      </w:tr>
+      <w:tr>
+        <w:tc>
+          <w:tcPr>
+            <w:tcW w:type="dxa" w:w="2549"/>
+            <w:vAlign w:val="center"/>
+            <w:tcBorders>
+              <w:top w:val="single" w:sz="4" w:color="D9D9D9"/>
+              <w:left w:val="single" w:sz="4" w:color="D9D9D9"/>
+              <w:bottom w:val="single" w:sz="4" w:color="D9D9D9"/>
+              <w:right w:val="single" w:sz="4" w:color="D9D9D9"/>
+            </w:tcBorders>
+            <w:shd w:fill="FFFFFF"/>
+            <w:tcMar>
+              <w:top w:w="75" w:type="dxa"/>
+              <w:left w:w="75" w:type="dxa"/>
+              <w:bottom w:w="75" w:type="dxa"/>
+              <w:right w:w="75" w:type="dxa"/>
+            </w:tcMar>
+          </w:tcPr>
+          <w:p>
+            <w:pPr>
+              <w:spacing w:after="20" w:line="240" w:lineRule="auto"/>
+            </w:pPr>
+            <w:r>
+              <w:rPr>
+                <w:b w:val="0"/>
+                <w:color w:val="000000"/>
+                <w:sz w:val="18"/>
+              </w:rPr>
+              <w:t>C three-stage</w:t>
+            </w:r>
+          </w:p>
+        </w:tc>
+        <w:tc>
+          <w:tcPr>
+            <w:tcW w:type="dxa" w:w="792"/>
+            <w:vAlign w:val="center"/>
+            <w:tcBorders>
+              <w:top w:val="single" w:sz="4" w:color="D9D9D9"/>
+              <w:left w:val="single" w:sz="4" w:color="D9D9D9"/>
+              <w:bottom w:val="single" w:sz="4" w:color="D9D9D9"/>
+              <w:right w:val="single" w:sz="4" w:color="D9D9D9"/>
+            </w:tcBorders>
+            <w:shd w:fill="FFFFFF"/>
+            <w:tcMar>
+              <w:top w:w="75" w:type="dxa"/>
+              <w:left w:w="75" w:type="dxa"/>
+              <w:bottom w:w="75" w:type="dxa"/>
+              <w:right w:w="75" w:type="dxa"/>
+            </w:tcMar>
+          </w:tcPr>
+          <w:p>
+            <w:pPr>
+              <w:spacing w:after="20" w:line="240" w:lineRule="auto"/>
+            </w:pPr>
+            <w:r>
+              <w:rPr>
+                <w:b w:val="0"/>
+                <w:color w:val="000000"/>
+                <w:sz w:val="18"/>
+              </w:rPr>
+              <w:t>28</w:t>
+            </w:r>
+          </w:p>
+        </w:tc>
+        <w:tc>
+          <w:tcPr>
+            <w:tcW w:type="dxa" w:w="2419"/>
+            <w:vAlign w:val="center"/>
+            <w:tcBorders>
+              <w:top w:val="single" w:sz="4" w:color="D9D9D9"/>
+              <w:left w:val="single" w:sz="4" w:color="D9D9D9"/>
+              <w:bottom w:val="single" w:sz="4" w:color="D9D9D9"/>
+              <w:right w:val="single" w:sz="4" w:color="D9D9D9"/>
+            </w:tcBorders>
+            <w:shd w:fill="FFFFFF"/>
+            <w:tcMar>
+              <w:top w:w="75" w:type="dxa"/>
+              <w:left w:w="75" w:type="dxa"/>
+              <w:bottom w:w="75" w:type="dxa"/>
+              <w:right w:w="75" w:type="dxa"/>
+            </w:tcMar>
+          </w:tcPr>
+          <w:p>
+            <w:pPr>
+              <w:spacing w:after="20" w:line="240" w:lineRule="auto"/>
+            </w:pPr>
+            <w:r>
+              <w:rPr>
+                <w:b w:val="0"/>
+                <w:color w:val="000000"/>
+                <w:sz w:val="18"/>
+              </w:rPr>
+              <w:t>6.35 / 6.30</w:t>
+            </w:r>
+          </w:p>
+        </w:tc>
+        <w:tc>
+          <w:tcPr>
+            <w:tcW w:type="dxa" w:w="1152"/>
+            <w:vAlign w:val="center"/>
+            <w:tcBorders>
+              <w:top w:val="single" w:sz="4" w:color="D9D9D9"/>
+              <w:left w:val="single" w:sz="4" w:color="D9D9D9"/>
+              <w:bottom w:val="single" w:sz="4" w:color="D9D9D9"/>
+              <w:right w:val="single" w:sz="4" w:color="D9D9D9"/>
+            </w:tcBorders>
+            <w:shd w:fill="FFFFFF"/>
+            <w:tcMar>
+              <w:top w:w="75" w:type="dxa"/>
+              <w:left w:w="75" w:type="dxa"/>
+              <w:bottom w:w="75" w:type="dxa"/>
+              <w:right w:w="75" w:type="dxa"/>
+            </w:tcMar>
+          </w:tcPr>
+          <w:p>
+            <w:pPr>
+              <w:spacing w:after="20" w:line="240" w:lineRule="auto"/>
+            </w:pPr>
+            <w:r>
+              <w:rPr>
+                <w:b w:val="0"/>
+                <w:color w:val="000000"/>
+                <w:sz w:val="18"/>
+              </w:rPr>
+              <w:t>157.5</w:t>
+            </w:r>
+          </w:p>
+        </w:tc>
+        <w:tc>
+          <w:tcPr>
+            <w:tcW w:type="dxa" w:w="1397"/>
+            <w:vAlign w:val="center"/>
+            <w:tcBorders>
+              <w:top w:val="single" w:sz="4" w:color="D9D9D9"/>
+              <w:left w:val="single" w:sz="4" w:color="D9D9D9"/>
+              <w:bottom w:val="single" w:sz="4" w:color="D9D9D9"/>
+              <w:right w:val="single" w:sz="4" w:color="D9D9D9"/>
+            </w:tcBorders>
+            <w:shd w:fill="FFFFFF"/>
+            <w:tcMar>
+              <w:top w:w="75" w:type="dxa"/>
+              <w:left w:w="75" w:type="dxa"/>
+              <w:bottom w:w="75" w:type="dxa"/>
+              <w:right w:w="75" w:type="dxa"/>
+            </w:tcMar>
+          </w:tcPr>
+          <w:p>
+            <w:pPr>
+              <w:spacing w:after="20" w:line="240" w:lineRule="auto"/>
+            </w:pPr>
+            <w:r>
+              <w:rPr>
+                <w:b w:val="0"/>
+                <w:color w:val="000000"/>
+                <w:sz w:val="18"/>
+              </w:rPr>
+              <w:t>177.8</w:t>
+            </w:r>
+          </w:p>
+        </w:tc>
+        <w:tc>
+          <w:tcPr>
+            <w:tcW w:type="dxa" w:w="1973"/>
+            <w:vAlign w:val="center"/>
+            <w:tcBorders>
+              <w:top w:val="single" w:sz="4" w:color="D9D9D9"/>
+              <w:left w:val="single" w:sz="4" w:color="D9D9D9"/>
+              <w:bottom w:val="single" w:sz="4" w:color="D9D9D9"/>
+              <w:right w:val="single" w:sz="4" w:color="D9D9D9"/>
+            </w:tcBorders>
+            <w:shd w:fill="FFFFFF"/>
+            <w:tcMar>
+              <w:top w:w="75" w:type="dxa"/>
+              <w:left w:w="75" w:type="dxa"/>
+              <w:bottom w:w="75" w:type="dxa"/>
+              <w:right w:w="75" w:type="dxa"/>
+            </w:tcMar>
+          </w:tcPr>
+          <w:p>
+            <w:pPr>
+              <w:spacing w:after="20" w:line="240" w:lineRule="auto"/>
+            </w:pPr>
+            <w:r>
+              <w:rPr>
+                <w:b w:val="0"/>
+                <w:color w:val="000000"/>
+                <w:sz w:val="18"/>
+              </w:rPr>
+              <w:t>0.398</w:t>
+            </w:r>
+          </w:p>
+        </w:tc>
+      </w:tr>
+      <w:tr>
+        <w:tc>
+          <w:tcPr>
+            <w:tcW w:type="dxa" w:w="2549"/>
+            <w:vAlign w:val="center"/>
+            <w:tcBorders>
+              <w:top w:val="single" w:sz="4" w:color="D9D9D9"/>
+              <w:left w:val="single" w:sz="4" w:color="D9D9D9"/>
+              <w:bottom w:val="single" w:sz="4" w:color="D9D9D9"/>
+              <w:right w:val="single" w:sz="4" w:color="D9D9D9"/>
+            </w:tcBorders>
+            <w:shd w:fill="F5F5F5"/>
+            <w:tcMar>
+              <w:top w:w="75" w:type="dxa"/>
+              <w:left w:w="75" w:type="dxa"/>
+              <w:bottom w:w="75" w:type="dxa"/>
+              <w:right w:w="75" w:type="dxa"/>
+            </w:tcMar>
+          </w:tcPr>
+          <w:p>
+            <w:pPr>
+              <w:spacing w:after="20" w:line="240" w:lineRule="auto"/>
+            </w:pPr>
+            <w:r>
+              <w:rPr>
+                <w:b w:val="0"/>
+                <w:color w:val="000000"/>
+                <w:sz w:val="18"/>
+              </w:rPr>
+              <w:t>D B plus fixes</w:t>
+            </w:r>
+          </w:p>
+        </w:tc>
+        <w:tc>
+          <w:tcPr>
+            <w:tcW w:type="dxa" w:w="792"/>
+            <w:vAlign w:val="center"/>
+            <w:tcBorders>
+              <w:top w:val="single" w:sz="4" w:color="D9D9D9"/>
+              <w:left w:val="single" w:sz="4" w:color="D9D9D9"/>
+              <w:bottom w:val="single" w:sz="4" w:color="D9D9D9"/>
+              <w:right w:val="single" w:sz="4" w:color="D9D9D9"/>
+            </w:tcBorders>
+            <w:shd w:fill="F5F5F5"/>
+            <w:tcMar>
+              <w:top w:w="75" w:type="dxa"/>
+              <w:left w:w="75" w:type="dxa"/>
+              <w:bottom w:w="75" w:type="dxa"/>
+              <w:right w:w="75" w:type="dxa"/>
+            </w:tcMar>
+          </w:tcPr>
+          <w:p>
+            <w:pPr>
+              <w:spacing w:after="20" w:line="240" w:lineRule="auto"/>
+            </w:pPr>
+            <w:r>
+              <w:rPr>
+                <w:b w:val="0"/>
+                <w:color w:val="000000"/>
+                <w:sz w:val="18"/>
+              </w:rPr>
+              <w:t>20</w:t>
+            </w:r>
+          </w:p>
+        </w:tc>
+        <w:tc>
+          <w:tcPr>
+            <w:tcW w:type="dxa" w:w="2419"/>
+            <w:vAlign w:val="center"/>
+            <w:tcBorders>
+              <w:top w:val="single" w:sz="4" w:color="D9D9D9"/>
+              <w:left w:val="single" w:sz="4" w:color="D9D9D9"/>
+              <w:bottom w:val="single" w:sz="4" w:color="D9D9D9"/>
+              <w:right w:val="single" w:sz="4" w:color="D9D9D9"/>
+            </w:tcBorders>
+            <w:shd w:fill="F5F5F5"/>
+            <w:tcMar>
+              <w:top w:w="75" w:type="dxa"/>
+              <w:left w:w="75" w:type="dxa"/>
+              <w:bottom w:w="75" w:type="dxa"/>
+              <w:right w:w="75" w:type="dxa"/>
+            </w:tcMar>
+          </w:tcPr>
+          <w:p>
+            <w:pPr>
+              <w:spacing w:after="20" w:line="240" w:lineRule="auto"/>
+            </w:pPr>
+            <w:r>
+              <w:rPr>
+                <w:b w:val="0"/>
+                <w:color w:val="000000"/>
+                <w:sz w:val="18"/>
+              </w:rPr>
+              <w:t>4.30 / 4.25</w:t>
+            </w:r>
+          </w:p>
+        </w:tc>
+        <w:tc>
+          <w:tcPr>
+            <w:tcW w:type="dxa" w:w="1152"/>
+            <w:vAlign w:val="center"/>
+            <w:tcBorders>
+              <w:top w:val="single" w:sz="4" w:color="D9D9D9"/>
+              <w:left w:val="single" w:sz="4" w:color="D9D9D9"/>
+              <w:bottom w:val="single" w:sz="4" w:color="D9D9D9"/>
+              <w:right w:val="single" w:sz="4" w:color="D9D9D9"/>
+            </w:tcBorders>
+            <w:shd w:fill="F5F5F5"/>
+            <w:tcMar>
+              <w:top w:w="75" w:type="dxa"/>
+              <w:left w:w="75" w:type="dxa"/>
+              <w:bottom w:w="75" w:type="dxa"/>
+              <w:right w:w="75" w:type="dxa"/>
+            </w:tcMar>
+          </w:tcPr>
+          <w:p>
+            <w:pPr>
+              <w:spacing w:after="20" w:line="240" w:lineRule="auto"/>
+            </w:pPr>
+            <w:r>
+              <w:rPr>
+                <w:b w:val="0"/>
+                <w:color w:val="000000"/>
+                <w:sz w:val="18"/>
+              </w:rPr>
+              <w:t>232.6</w:t>
+            </w:r>
+          </w:p>
+        </w:tc>
+        <w:tc>
+          <w:tcPr>
+            <w:tcW w:type="dxa" w:w="1397"/>
+            <w:vAlign w:val="center"/>
+            <w:tcBorders>
+              <w:top w:val="single" w:sz="4" w:color="D9D9D9"/>
+              <w:left w:val="single" w:sz="4" w:color="D9D9D9"/>
+              <w:bottom w:val="single" w:sz="4" w:color="D9D9D9"/>
+              <w:right w:val="single" w:sz="4" w:color="D9D9D9"/>
+            </w:tcBorders>
+            <w:shd w:fill="F5F5F5"/>
+            <w:tcMar>
+              <w:top w:w="75" w:type="dxa"/>
+              <w:left w:w="75" w:type="dxa"/>
+              <w:bottom w:w="75" w:type="dxa"/>
+              <w:right w:w="75" w:type="dxa"/>
+            </w:tcMar>
+          </w:tcPr>
+          <w:p>
+            <w:pPr>
+              <w:spacing w:after="20" w:line="240" w:lineRule="auto"/>
+            </w:pPr>
+            <w:r>
+              <w:rPr>
+                <w:b w:val="0"/>
+                <w:color w:val="000000"/>
+                <w:sz w:val="18"/>
+              </w:rPr>
+              <w:t>86.0</w:t>
+            </w:r>
+          </w:p>
+        </w:tc>
+        <w:tc>
+          <w:tcPr>
+            <w:tcW w:type="dxa" w:w="1973"/>
+            <w:vAlign w:val="center"/>
+            <w:tcBorders>
+              <w:top w:val="single" w:sz="4" w:color="D9D9D9"/>
+              <w:left w:val="single" w:sz="4" w:color="D9D9D9"/>
+              <w:bottom w:val="single" w:sz="4" w:color="D9D9D9"/>
+              <w:right w:val="single" w:sz="4" w:color="D9D9D9"/>
+            </w:tcBorders>
+            <w:shd w:fill="F5F5F5"/>
+            <w:tcMar>
+              <w:top w:w="75" w:type="dxa"/>
+              <w:left w:w="75" w:type="dxa"/>
+              <w:bottom w:w="75" w:type="dxa"/>
+              <w:right w:w="75" w:type="dxa"/>
+            </w:tcMar>
+          </w:tcPr>
+          <w:p>
+            <w:pPr>
+              <w:spacing w:after="20" w:line="240" w:lineRule="auto"/>
+            </w:pPr>
+            <w:r>
+              <w:rPr>
+                <w:b w:val="0"/>
+                <w:color w:val="000000"/>
+                <w:sz w:val="18"/>
+              </w:rPr>
+              <w:t>0.823</w:t>
+            </w:r>
+          </w:p>
+        </w:tc>
+      </w:tr>
+      <w:tr>
+        <w:tc>
+          <w:tcPr>
+            <w:tcW w:type="dxa" w:w="2549"/>
+            <w:vAlign w:val="center"/>
+            <w:tcBorders>
+              <w:top w:val="single" w:sz="4" w:color="D9D9D9"/>
+              <w:left w:val="single" w:sz="4" w:color="D9D9D9"/>
+              <w:bottom w:val="single" w:sz="4" w:color="D9D9D9"/>
+              <w:right w:val="single" w:sz="4" w:color="D9D9D9"/>
+            </w:tcBorders>
+            <w:shd w:fill="FFFFFF"/>
+            <w:tcMar>
+              <w:top w:w="75" w:type="dxa"/>
+              <w:left w:w="75" w:type="dxa"/>
+              <w:bottom w:w="75" w:type="dxa"/>
+              <w:right w:w="75" w:type="dxa"/>
+            </w:tcMar>
+          </w:tcPr>
+          <w:p>
+            <w:pPr>
+              <w:spacing w:after="20" w:line="240" w:lineRule="auto"/>
+            </w:pPr>
+            <w:r>
+              <w:rPr>
+                <w:b w:val="0"/>
+                <w:color w:val="000000"/>
+                <w:sz w:val="18"/>
+              </w:rPr>
+              <w:t>A_ctrl1 decode</w:t>
+            </w:r>
+          </w:p>
+        </w:tc>
+        <w:tc>
+          <w:tcPr>
+            <w:tcW w:type="dxa" w:w="792"/>
+            <w:vAlign w:val="center"/>
+            <w:tcBorders>
+              <w:top w:val="single" w:sz="4" w:color="D9D9D9"/>
+              <w:left w:val="single" w:sz="4" w:color="D9D9D9"/>
+              <w:bottom w:val="single" w:sz="4" w:color="D9D9D9"/>
+              <w:right w:val="single" w:sz="4" w:color="D9D9D9"/>
+            </w:tcBorders>
+            <w:shd w:fill="FFFFFF"/>
+            <w:tcMar>
+              <w:top w:w="75" w:type="dxa"/>
+              <w:left w:w="75" w:type="dxa"/>
+              <w:bottom w:w="75" w:type="dxa"/>
+              <w:right w:w="75" w:type="dxa"/>
+            </w:tcMar>
+          </w:tcPr>
+          <w:p>
+            <w:pPr>
+              <w:spacing w:after="20" w:line="240" w:lineRule="auto"/>
+            </w:pPr>
+            <w:r>
+              <w:rPr>
+                <w:b w:val="0"/>
+                <w:color w:val="000000"/>
+                <w:sz w:val="18"/>
+              </w:rPr>
+              <w:t>12</w:t>
+            </w:r>
+          </w:p>
+        </w:tc>
+        <w:tc>
+          <w:tcPr>
+            <w:tcW w:type="dxa" w:w="2419"/>
+            <w:vAlign w:val="center"/>
+            <w:tcBorders>
+              <w:top w:val="single" w:sz="4" w:color="D9D9D9"/>
+              <w:left w:val="single" w:sz="4" w:color="D9D9D9"/>
+              <w:bottom w:val="single" w:sz="4" w:color="D9D9D9"/>
+              <w:right w:val="single" w:sz="4" w:color="D9D9D9"/>
+            </w:tcBorders>
+            <w:shd w:fill="FFFFFF"/>
+            <w:tcMar>
+              <w:top w:w="75" w:type="dxa"/>
+              <w:left w:w="75" w:type="dxa"/>
+              <w:bottom w:w="75" w:type="dxa"/>
+              <w:right w:w="75" w:type="dxa"/>
+            </w:tcMar>
+          </w:tcPr>
+          <w:p>
+            <w:pPr>
+              <w:spacing w:after="20" w:line="240" w:lineRule="auto"/>
+            </w:pPr>
+            <w:r>
+              <w:rPr>
+                <w:b w:val="0"/>
+                <w:color w:val="000000"/>
+                <w:sz w:val="18"/>
+              </w:rPr>
+              <w:t>4.70 / 4.65</w:t>
+            </w:r>
+          </w:p>
+        </w:tc>
+        <w:tc>
+          <w:tcPr>
+            <w:tcW w:type="dxa" w:w="1152"/>
+            <w:vAlign w:val="center"/>
+            <w:tcBorders>
+              <w:top w:val="single" w:sz="4" w:color="D9D9D9"/>
+              <w:left w:val="single" w:sz="4" w:color="D9D9D9"/>
+              <w:bottom w:val="single" w:sz="4" w:color="D9D9D9"/>
+              <w:right w:val="single" w:sz="4" w:color="D9D9D9"/>
+            </w:tcBorders>
+            <w:shd w:fill="FFFFFF"/>
+            <w:tcMar>
+              <w:top w:w="75" w:type="dxa"/>
+              <w:left w:w="75" w:type="dxa"/>
+              <w:bottom w:w="75" w:type="dxa"/>
+              <w:right w:w="75" w:type="dxa"/>
+            </w:tcMar>
+          </w:tcPr>
+          <w:p>
+            <w:pPr>
+              <w:spacing w:after="20" w:line="240" w:lineRule="auto"/>
+            </w:pPr>
+            <w:r>
+              <w:rPr>
+                <w:b w:val="0"/>
+                <w:color w:val="000000"/>
+                <w:sz w:val="18"/>
+              </w:rPr>
+              <w:t>212.8</w:t>
+            </w:r>
+          </w:p>
+        </w:tc>
+        <w:tc>
+          <w:tcPr>
+            <w:tcW w:type="dxa" w:w="1397"/>
+            <w:vAlign w:val="center"/>
+            <w:tcBorders>
+              <w:top w:val="single" w:sz="4" w:color="D9D9D9"/>
+              <w:left w:val="single" w:sz="4" w:color="D9D9D9"/>
+              <w:bottom w:val="single" w:sz="4" w:color="D9D9D9"/>
+              <w:right w:val="single" w:sz="4" w:color="D9D9D9"/>
+            </w:tcBorders>
+            <w:shd w:fill="FFFFFF"/>
+            <w:tcMar>
+              <w:top w:w="75" w:type="dxa"/>
+              <w:left w:w="75" w:type="dxa"/>
+              <w:bottom w:w="75" w:type="dxa"/>
+              <w:right w:w="75" w:type="dxa"/>
+            </w:tcMar>
+          </w:tcPr>
+          <w:p>
+            <w:pPr>
+              <w:spacing w:after="20" w:line="240" w:lineRule="auto"/>
+            </w:pPr>
+            <w:r>
+              <w:rPr>
+                <w:b w:val="0"/>
+                <w:color w:val="000000"/>
+                <w:sz w:val="18"/>
+              </w:rPr>
+              <w:t>56.4</w:t>
+            </w:r>
+          </w:p>
+        </w:tc>
+        <w:tc>
+          <w:tcPr>
+            <w:tcW w:type="dxa" w:w="1973"/>
+            <w:vAlign w:val="center"/>
+            <w:tcBorders>
+              <w:top w:val="single" w:sz="4" w:color="D9D9D9"/>
+              <w:left w:val="single" w:sz="4" w:color="D9D9D9"/>
+              <w:bottom w:val="single" w:sz="4" w:color="D9D9D9"/>
+              <w:right w:val="single" w:sz="4" w:color="D9D9D9"/>
+            </w:tcBorders>
+            <w:shd w:fill="FFFFFF"/>
+            <w:tcMar>
+              <w:top w:w="75" w:type="dxa"/>
+              <w:left w:w="75" w:type="dxa"/>
+              <w:bottom w:w="75" w:type="dxa"/>
+              <w:right w:w="75" w:type="dxa"/>
+            </w:tcMar>
+          </w:tcPr>
+          <w:p>
+            <w:pPr>
+              <w:spacing w:after="20" w:line="240" w:lineRule="auto"/>
+            </w:pPr>
+            <w:r>
+              <w:rPr>
+                <w:b w:val="0"/>
+                <w:color w:val="000000"/>
+                <w:sz w:val="18"/>
+              </w:rPr>
+              <w:t>1.255</w:t>
+            </w:r>
+          </w:p>
+        </w:tc>
+      </w:tr>
+      <w:tr>
+        <w:tc>
+          <w:tcPr>
+            <w:tcW w:type="dxa" w:w="2549"/>
+            <w:vAlign w:val="center"/>
+            <w:tcBorders>
+              <w:top w:val="single" w:sz="4" w:color="D9D9D9"/>
+              <w:left w:val="single" w:sz="4" w:color="D9D9D9"/>
+              <w:bottom w:val="single" w:sz="4" w:color="D9D9D9"/>
+              <w:right w:val="single" w:sz="4" w:color="D9D9D9"/>
+            </w:tcBorders>
+            <w:shd w:fill="F5F5F5"/>
+            <w:tcMar>
+              <w:top w:w="75" w:type="dxa"/>
+              <w:left w:w="75" w:type="dxa"/>
+              <w:bottom w:w="75" w:type="dxa"/>
+              <w:right w:w="75" w:type="dxa"/>
+            </w:tcMar>
+          </w:tcPr>
+          <w:p>
+            <w:pPr>
+              <w:spacing w:after="20" w:line="240" w:lineRule="auto"/>
+            </w:pPr>
+            <w:r>
+              <w:rPr>
+                <w:b w:val="0"/>
+                <w:color w:val="000000"/>
+                <w:sz w:val="18"/>
+              </w:rPr>
+              <w:t>A_ctrl2 all fixes</w:t>
+            </w:r>
+          </w:p>
+        </w:tc>
+        <w:tc>
+          <w:tcPr>
+            <w:tcW w:type="dxa" w:w="792"/>
+            <w:vAlign w:val="center"/>
+            <w:tcBorders>
+              <w:top w:val="single" w:sz="4" w:color="D9D9D9"/>
+              <w:left w:val="single" w:sz="4" w:color="D9D9D9"/>
+              <w:bottom w:val="single" w:sz="4" w:color="D9D9D9"/>
+              <w:right w:val="single" w:sz="4" w:color="D9D9D9"/>
+            </w:tcBorders>
+            <w:shd w:fill="F5F5F5"/>
+            <w:tcMar>
+              <w:top w:w="75" w:type="dxa"/>
+              <w:left w:w="75" w:type="dxa"/>
+              <w:bottom w:w="75" w:type="dxa"/>
+              <w:right w:w="75" w:type="dxa"/>
+            </w:tcMar>
+          </w:tcPr>
+          <w:p>
+            <w:pPr>
+              <w:spacing w:after="20" w:line="240" w:lineRule="auto"/>
+            </w:pPr>
+            <w:r>
+              <w:rPr>
+                <w:b w:val="0"/>
+                <w:color w:val="000000"/>
+                <w:sz w:val="18"/>
+              </w:rPr>
+              <w:t>12</w:t>
+            </w:r>
+          </w:p>
+        </w:tc>
+        <w:tc>
+          <w:tcPr>
+            <w:tcW w:type="dxa" w:w="2419"/>
+            <w:vAlign w:val="center"/>
+            <w:tcBorders>
+              <w:top w:val="single" w:sz="4" w:color="D9D9D9"/>
+              <w:left w:val="single" w:sz="4" w:color="D9D9D9"/>
+              <w:bottom w:val="single" w:sz="4" w:color="D9D9D9"/>
+              <w:right w:val="single" w:sz="4" w:color="D9D9D9"/>
+            </w:tcBorders>
+            <w:shd w:fill="F5F5F5"/>
+            <w:tcMar>
+              <w:top w:w="75" w:type="dxa"/>
+              <w:left w:w="75" w:type="dxa"/>
+              <w:bottom w:w="75" w:type="dxa"/>
+              <w:right w:w="75" w:type="dxa"/>
+            </w:tcMar>
+          </w:tcPr>
+          <w:p>
+            <w:pPr>
+              <w:spacing w:after="20" w:line="240" w:lineRule="auto"/>
+            </w:pPr>
+            <w:r>
+              <w:rPr>
+                <w:b w:val="0"/>
+                <w:color w:val="000000"/>
+                <w:sz w:val="18"/>
+              </w:rPr>
+              <w:t>4.15 / 4.10</w:t>
+            </w:r>
+          </w:p>
+        </w:tc>
+        <w:tc>
+          <w:tcPr>
+            <w:tcW w:type="dxa" w:w="1152"/>
+            <w:vAlign w:val="center"/>
+            <w:tcBorders>
+              <w:top w:val="single" w:sz="4" w:color="D9D9D9"/>
+              <w:left w:val="single" w:sz="4" w:color="D9D9D9"/>
+              <w:bottom w:val="single" w:sz="4" w:color="D9D9D9"/>
+              <w:right w:val="single" w:sz="4" w:color="D9D9D9"/>
+            </w:tcBorders>
+            <w:shd w:fill="F5F5F5"/>
+            <w:tcMar>
+              <w:top w:w="75" w:type="dxa"/>
+              <w:left w:w="75" w:type="dxa"/>
+              <w:bottom w:w="75" w:type="dxa"/>
+              <w:right w:w="75" w:type="dxa"/>
+            </w:tcMar>
+          </w:tcPr>
+          <w:p>
+            <w:pPr>
+              <w:spacing w:after="20" w:line="240" w:lineRule="auto"/>
+            </w:pPr>
+            <w:r>
+              <w:rPr>
+                <w:b w:val="0"/>
+                <w:color w:val="000000"/>
+                <w:sz w:val="18"/>
+              </w:rPr>
+              <w:t>241.0</w:t>
+            </w:r>
+          </w:p>
+        </w:tc>
+        <w:tc>
+          <w:tcPr>
+            <w:tcW w:type="dxa" w:w="1397"/>
+            <w:vAlign w:val="center"/>
+            <w:tcBorders>
+              <w:top w:val="single" w:sz="4" w:color="D9D9D9"/>
+              <w:left w:val="single" w:sz="4" w:color="D9D9D9"/>
+              <w:bottom w:val="single" w:sz="4" w:color="D9D9D9"/>
+              <w:right w:val="single" w:sz="4" w:color="D9D9D9"/>
+            </w:tcBorders>
+            <w:shd w:fill="F5F5F5"/>
+            <w:tcMar>
+              <w:top w:w="75" w:type="dxa"/>
+              <w:left w:w="75" w:type="dxa"/>
+              <w:bottom w:w="75" w:type="dxa"/>
+              <w:right w:w="75" w:type="dxa"/>
+            </w:tcMar>
+          </w:tcPr>
+          <w:p>
+            <w:pPr>
+              <w:spacing w:after="20" w:line="240" w:lineRule="auto"/>
+            </w:pPr>
+            <w:r>
+              <w:rPr>
+                <w:b w:val="0"/>
+                <w:color w:val="000000"/>
+                <w:sz w:val="18"/>
+              </w:rPr>
+              <w:t>49.8</w:t>
+            </w:r>
+          </w:p>
+        </w:tc>
+        <w:tc>
+          <w:tcPr>
+            <w:tcW w:type="dxa" w:w="1973"/>
+            <w:vAlign w:val="center"/>
+            <w:tcBorders>
+              <w:top w:val="single" w:sz="4" w:color="D9D9D9"/>
+              <w:left w:val="single" w:sz="4" w:color="D9D9D9"/>
+              <w:bottom w:val="single" w:sz="4" w:color="D9D9D9"/>
+              <w:right w:val="single" w:sz="4" w:color="D9D9D9"/>
+            </w:tcBorders>
+            <w:shd w:fill="F5F5F5"/>
+            <w:tcMar>
+              <w:top w:w="75" w:type="dxa"/>
+              <w:left w:w="75" w:type="dxa"/>
+              <w:bottom w:w="75" w:type="dxa"/>
+              <w:right w:w="75" w:type="dxa"/>
+            </w:tcMar>
+          </w:tcPr>
+          <w:p>
+            <w:pPr>
+              <w:spacing w:after="20" w:line="240" w:lineRule="auto"/>
+            </w:pPr>
+            <w:r>
+              <w:rPr>
+                <w:b w:val="0"/>
+                <w:color w:val="000000"/>
+                <w:sz w:val="18"/>
+              </w:rPr>
+              <w:t>1.422</w:t>
+            </w:r>
+          </w:p>
+        </w:tc>
+      </w:tr>
+    </w:tbl>
+    <w:p>
+      <w:pPr>
+        <w:spacing w:after="0"/>
+      </w:pPr>
+    </w:p>
+    <w:p>
+      <w:pPr>
+        <w:keepNext w:val="0"/>
+        <w:spacing w:before="40" w:after="80"/>
+        <w:jc w:val="center"/>
+      </w:pPr>
+      <w:r>
+        <w:rPr>
+          <w:sz w:val="17"/>
+        </w:rPr>
+        <w:t>Table XIII. Best tested passing periods at 0.05 ns resolution. Speedup is 70.8 ns divided by block latency. A, D and A_ctrl2 use explore; the others use default [19].</w:t>
       </w:r>
     </w:p>
     <w:p>
@@ -9996,7 +11455,2387 @@
           <w:b/>
           <w:sz w:val="21"/>
         </w:rPr>
-        <w:t>XVI. Findings</w:t>
+        <w:t>A. Critical paths and the control experiment</w:t>
+      </w:r>
+    </w:p>
+    <w:p>
+      <w:pPr>
+        <w:spacing w:after="60" w:line="245" w:lineRule="auto"/>
+        <w:ind w:firstLine="317"/>
+        <w:jc w:val="both"/>
+      </w:pPr>
+      <w:r>
+        <w:t>At baseline A's 5.90 ns target, the round has about 1.9 ns of spare time. The limiting path is in_keep decoding into wide state-register enables: six logic levels, approximately 1.2 ns logic and 4.7 ns reported routing, with fanout 129. Round splitting preserves this limit while adding registers and control load. B and C reach only about 0.97 and 0.94 times A's frequency, against required ratios above 20/12 = 1.667 and 28/12 = 2.333. C's stages already take about 2.4 to 2.5 ns each; balancing those stages alone does not remove the limiting control path. Reported routing fractions are Vivado categories and do not imply that all net delay is removable wire delay [17].</w:t>
+      </w:r>
+    </w:p>
+    <w:p>
+      <w:pPr>
+        <w:spacing w:after="60" w:line="245" w:lineRule="auto"/>
+        <w:ind w:firstLine="317"/>
+        <w:jc w:val="both"/>
+      </w:pPr>
+      <w:r>
+        <w:t>D was built on B because its measured latency was lower than C's. Control optimization raises D to 232.6 MHz, or 1.37 times baseline A's frequency, but its 20 clocks still take 86.0 ns. Applying the same changes to A is the decisive control experiment. Per-lane keep decoding removes keep-count and validation logic from wide enables; default-strategy frequency rises from 166.7 to 212.8 MHz. A one-hot controller and a tree-shaped tag compare, five levels instead of thirteen, complete A_ctrl2. The combined changes reach 241.0 MHz at the same 12 clocks. B adds 315 core registers and C adds 638; A_ctrl2 uses 2,271 LUTs and 1,090 registers versus A's 2,369 and 1,080.</w:t>
+      </w:r>
+    </w:p>
+    <w:p>
+      <w:pPr>
+        <w:keepNext/>
+        <w:spacing w:after="0"/>
+        <w:jc w:val="center"/>
+      </w:pPr>
+      <w:r>
+        <w:drawing>
+          <wp:inline xmlns:a="http://schemas.openxmlformats.org/drawingml/2006/main" xmlns:pic="http://schemas.openxmlformats.org/drawingml/2006/picture">
+            <wp:extent cx="6400800" cy="3017868"/>
+            <wp:docPr id="9" name="Picture 9"/>
+            <wp:cNvGraphicFramePr>
+              <a:graphicFrameLocks noChangeAspect="1"/>
+            </wp:cNvGraphicFramePr>
+            <a:graphic>
+              <a:graphicData uri="http://schemas.openxmlformats.org/drawingml/2006/picture">
+                <pic:pic>
+                  <pic:nvPicPr>
+                    <pic:cNvPr id="0" name="fig_xv_pipeline_control.png"/>
+                    <pic:cNvPicPr/>
+                  </pic:nvPicPr>
+                  <pic:blipFill>
+                    <a:blip r:embed="rId18"/>
+                    <a:stretch>
+                      <a:fillRect/>
+                    </a:stretch>
+                  </pic:blipFill>
+                  <pic:spPr>
+                    <a:xfrm>
+                      <a:off x="0" y="0"/>
+                      <a:ext cx="6400800" cy="3017868"/>
+                    </a:xfrm>
+                    <a:prstGeom prst="rect"/>
+                  </pic:spPr>
+                </pic:pic>
+              </a:graphicData>
+            </a:graphic>
+          </wp:inline>
+        </w:drawing>
+      </w:r>
+    </w:p>
+    <w:p>
+      <w:pPr>
+        <w:keepNext w:val="0"/>
+        <w:spacing w:before="40" w:after="80"/>
+        <w:jc w:val="center"/>
+      </w:pPr>
+      <w:r>
+        <w:rPr>
+          <w:sz w:val="17"/>
+        </w:rPr>
+        <w:t>Fig. 10. Controller changes that produce the measured gain. Gray blocks show local keep decoding, one-hot control and the tree tag compare. A_ctrl2 keeps the single-clock round and both original state owners; command, padding and output details are omitted.</w:t>
+      </w:r>
+    </w:p>
+    <w:p>
+      <w:pPr>
+        <w:spacing w:after="60" w:line="245" w:lineRule="auto"/>
+        <w:ind w:firstLine="317"/>
+        <w:jc w:val="both"/>
+      </w:pPr>
+      <w:r>
+        <w:t>Explore improves the best periods by only a few percent: A 6.00 to 5.90 ns, A_ctrl2 4.30 to 4.15 ns, and D 4.50 to 4.30 ns. Retiming never improves these results and more than doubles A's register count. A_ctrl2's remaining limits include tag comparison, controller and done fanout, and the round itself, now only 0.48 ns from critical. A 20-cycle candidate must close every path below 4.15 times 12/20 = 2.49 ns, above 401.6 MHz, to beat A_ctrl2. The 241 MHz result is the highest tested pass, not a measured hardware maximum.</w:t>
+      </w:r>
+    </w:p>
+    <w:p>
+      <w:pPr>
+        <w:keepNext/>
+        <w:spacing w:before="100" w:after="40"/>
+      </w:pPr>
+      <w:r>
+        <w:rPr>
+          <w:b/>
+          <w:sz w:val="21"/>
+        </w:rPr>
+        <w:t>B. Verification and measurement boundaries</w:t>
+      </w:r>
+    </w:p>
+    <w:p>
+      <w:pPr>
+        <w:spacing w:after="60" w:line="245" w:lineRule="auto"/>
+        <w:ind w:firstLine="317"/>
+        <w:jc w:val="both"/>
+      </w:pPr>
+      <w:r>
+        <w:t>Each final variant passes 2,178 official directional checks, 400 per-round permutation runs, 520 unstalled streaming transactions and 520 transactions with random stalls. Tests cover empty, partial and full blocks, 1 KiB and 4 KiB messages, forged tags, and resets throughout the pipeline phases and during transactions. Saved logs also cover D_alt_3stage, which was verified but not timing-swept. Encryption and decryption have identical unstalled cycle counts. With no AD, A_ctrl2 takes 801 clocks or 3,324.2 ns for 1 KiB, and 3,105 clocks or 12,885.8 ns for 4 KiB; these are message simulations, not complete-adapter or memory-transfer measurements.</w:t>
+      </w:r>
+    </w:p>
+    <w:p>
+      <w:pPr>
+        <w:spacing w:after="60" w:line="245" w:lineRule="auto"/>
+        <w:ind w:firstLine="317"/>
+        <w:jc w:val="both"/>
+      </w:pPr>
+      <w:r>
+        <w:t>All twelve reported best implementation runs have nonnegative setup, hold and pulse-width slack, zero routing errors, zero DRC errors and zero DRC critical warnings. No timing exceptions are used. Internal endpoints are constrained; the asynchronous button input and LED output are the only unconstrained I/O. The registered timing harness prevents unused logic from disappearing. Source hashes and comment-stripped pre-relabel hashes preserve measurement provenance. The saved next failing period brackets each reported passing point but does not prove a global frequency limit. Faster board operation requires an MMCM or PLL and reset held until synchronized lock; editing create_clock does not change the oscillator.</w:t>
+      </w:r>
+    </w:p>
+    <w:p>
+      <w:pPr>
+        <w:keepNext/>
+        <w:pageBreakBefore/>
+        <w:spacing w:before="100" w:after="40"/>
+      </w:pPr>
+      <w:r>
+        <w:rPr>
+          <w:b/>
+          <w:sz w:val="21"/>
+        </w:rPr>
+        <w:t>XVI. Folded multicore architecture and physical fixture</w:t>
+      </w:r>
+    </w:p>
+    <w:p>
+      <w:pPr>
+        <w:spacing w:after="60" w:line="245" w:lineRule="auto"/>
+        <w:ind w:firstLine="317"/>
+        <w:jc w:val="both"/>
+      </w:pPr>
+      <w:r>
+        <w:t>The folded multicore experiment assigns twelve independently authenticated layer chunks to one, two or four folded cores. In full-adapter simulation, two cores nearly halve the one-core cycle count, while four approach the shared 128-bit input and output bus ceiling. A later FPGA test validates all three core counts on a bounded 3,072-byte adapter fixture. It does not measure transfer of the complete adapter or service from DDR2 [20].</w:t>
+      </w:r>
+    </w:p>
+    <w:p>
+      <w:pPr>
+        <w:spacing w:after="60" w:line="245" w:lineRule="auto"/>
+        <w:ind w:firstLine="317"/>
+        <w:jc w:val="both"/>
+      </w:pPr>
+      <w:r>
+        <w:t>The complete 2,397,696-byte FP32 payload is gathered into twelve 199,808-byte chunks. Each chunk has 96 bytes of authenticated metadata, its own nonce and tag, and preserved chunk/offset identity. Input arbitration admits at most one 128-bit beat per clock across all lanes; the output collector also serves at most one beat per clock. Each lane has an optional registered-ready elastic boundary around a folded 3+3+2 core. Chunks are distributed by lane index and then advanced by the core count. Provisional decrypted output must terminate in trusted quarantine; transaction commit permits release and discard, abort or reset invalidates it. The diagram's quarantine is a required system consumer, not a complete-adapter storage block implemented by this wrapper.</w:t>
+      </w:r>
+    </w:p>
+    <w:p>
+      <w:pPr>
+        <w:keepNext/>
+        <w:spacing w:after="0"/>
+        <w:jc w:val="center"/>
+      </w:pPr>
+      <w:r>
+        <w:drawing>
+          <wp:inline xmlns:a="http://schemas.openxmlformats.org/drawingml/2006/main" xmlns:pic="http://schemas.openxmlformats.org/drawingml/2006/picture">
+            <wp:extent cx="6400800" cy="4106977"/>
+            <wp:docPr id="10" name="Picture 10"/>
+            <wp:cNvGraphicFramePr>
+              <a:graphicFrameLocks noChangeAspect="1"/>
+            </wp:cNvGraphicFramePr>
+            <a:graphic>
+              <a:graphicData uri="http://schemas.openxmlformats.org/drawingml/2006/picture">
+                <pic:pic>
+                  <pic:nvPicPr>
+                    <pic:cNvPr id="0" name="fig_xvi_multicore.png"/>
+                    <pic:cNvPicPr/>
+                  </pic:nvPicPr>
+                  <pic:blipFill>
+                    <a:blip r:embed="rId19"/>
+                    <a:stretch>
+                      <a:fillRect/>
+                    </a:stretch>
+                  </pic:blipFill>
+                  <pic:spPr>
+                    <a:xfrm>
+                      <a:off x="0" y="0"/>
+                      <a:ext cx="6400800" cy="4106977"/>
+                    </a:xfrm>
+                    <a:prstGeom prst="rect"/>
+                  </pic:spPr>
+                </pic:pic>
+              </a:graphicData>
+            </a:graphic>
+          </wp:inline>
+        </w:drawing>
+      </w:r>
+    </w:p>
+    <w:p>
+      <w:pPr>
+        <w:keepNext w:val="0"/>
+        <w:spacing w:before="40" w:after="80"/>
+        <w:jc w:val="center"/>
+      </w:pPr>
+      <w:r>
+        <w:rPr>
+          <w:sz w:val="17"/>
+        </w:rPr>
+        <w:t>Fig. 11. Four-lane view of the configurable one-, two- and four-core wrapper. Shared input framing and output collection bound aggregate traffic. Each core independently authenticates its chunks; transaction control collects completion and failure. Memory hardware is outside this architecture.</w:t>
+      </w:r>
+    </w:p>
+    <w:tbl>
+      <w:tblPr>
+        <w:tblW w:type="auto" w:w="0"/>
+        <w:jc w:val="center"/>
+        <w:tblLayout w:type="fixed"/>
+        <w:tblLook w:firstColumn="1" w:firstRow="1" w:lastColumn="0" w:lastRow="0" w:noHBand="0" w:noVBand="1" w:val="04A0"/>
+      </w:tblPr>
+      <w:tblGrid>
+        <w:gridCol w:w="864"/>
+        <w:gridCol w:w="2376"/>
+        <w:gridCol w:w="2376"/>
+        <w:gridCol w:w="2592"/>
+        <w:gridCol w:w="2074"/>
+      </w:tblGrid>
+      <w:tr>
+        <w:trPr>
+          <w:tblHeader/>
+        </w:trPr>
+        <w:tc>
+          <w:tcPr>
+            <w:tcW w:type="dxa" w:w="864"/>
+            <w:vAlign w:val="center"/>
+            <w:tcBorders>
+              <w:top w:val="single" w:sz="4" w:color="D9D9D9"/>
+              <w:left w:val="single" w:sz="4" w:color="D9D9D9"/>
+              <w:bottom w:val="single" w:sz="4" w:color="D9D9D9"/>
+              <w:right w:val="single" w:sz="4" w:color="D9D9D9"/>
+            </w:tcBorders>
+            <w:shd w:fill="E7E6E6"/>
+            <w:tcMar>
+              <w:top w:w="75" w:type="dxa"/>
+              <w:left w:w="75" w:type="dxa"/>
+              <w:bottom w:w="75" w:type="dxa"/>
+              <w:right w:w="75" w:type="dxa"/>
+            </w:tcMar>
+          </w:tcPr>
+          <w:p>
+            <w:pPr>
+              <w:spacing w:after="20" w:line="240" w:lineRule="auto"/>
+            </w:pPr>
+            <w:r>
+              <w:rPr>
+                <w:b/>
+                <w:color w:val="000000"/>
+                <w:sz w:val="18"/>
+              </w:rPr>
+              <w:t>Cores</w:t>
+            </w:r>
+          </w:p>
+        </w:tc>
+        <w:tc>
+          <w:tcPr>
+            <w:tcW w:type="dxa" w:w="2376"/>
+            <w:vAlign w:val="center"/>
+            <w:tcBorders>
+              <w:top w:val="single" w:sz="4" w:color="D9D9D9"/>
+              <w:left w:val="single" w:sz="4" w:color="D9D9D9"/>
+              <w:bottom w:val="single" w:sz="4" w:color="D9D9D9"/>
+              <w:right w:val="single" w:sz="4" w:color="D9D9D9"/>
+            </w:tcBorders>
+            <w:shd w:fill="E7E6E6"/>
+            <w:tcMar>
+              <w:top w:w="75" w:type="dxa"/>
+              <w:left w:w="75" w:type="dxa"/>
+              <w:bottom w:w="75" w:type="dxa"/>
+              <w:right w:w="75" w:type="dxa"/>
+            </w:tcMar>
+          </w:tcPr>
+          <w:p>
+            <w:pPr>
+              <w:spacing w:after="20" w:line="240" w:lineRule="auto"/>
+            </w:pPr>
+            <w:r>
+              <w:rPr>
+                <w:b/>
+                <w:color w:val="000000"/>
+                <w:sz w:val="18"/>
+              </w:rPr>
+              <w:t>Encrypt cycles</w:t>
+            </w:r>
+          </w:p>
+        </w:tc>
+        <w:tc>
+          <w:tcPr>
+            <w:tcW w:type="dxa" w:w="2376"/>
+            <w:vAlign w:val="center"/>
+            <w:tcBorders>
+              <w:top w:val="single" w:sz="4" w:color="D9D9D9"/>
+              <w:left w:val="single" w:sz="4" w:color="D9D9D9"/>
+              <w:bottom w:val="single" w:sz="4" w:color="D9D9D9"/>
+              <w:right w:val="single" w:sz="4" w:color="D9D9D9"/>
+            </w:tcBorders>
+            <w:shd w:fill="E7E6E6"/>
+            <w:tcMar>
+              <w:top w:w="75" w:type="dxa"/>
+              <w:left w:w="75" w:type="dxa"/>
+              <w:bottom w:w="75" w:type="dxa"/>
+              <w:right w:w="75" w:type="dxa"/>
+            </w:tcMar>
+          </w:tcPr>
+          <w:p>
+            <w:pPr>
+              <w:spacing w:after="20" w:line="240" w:lineRule="auto"/>
+            </w:pPr>
+            <w:r>
+              <w:rPr>
+                <w:b/>
+                <w:color w:val="000000"/>
+                <w:sz w:val="18"/>
+              </w:rPr>
+              <w:t>Decrypt cycles</w:t>
+            </w:r>
+          </w:p>
+        </w:tc>
+        <w:tc>
+          <w:tcPr>
+            <w:tcW w:type="dxa" w:w="2592"/>
+            <w:vAlign w:val="center"/>
+            <w:tcBorders>
+              <w:top w:val="single" w:sz="4" w:color="D9D9D9"/>
+              <w:left w:val="single" w:sz="4" w:color="D9D9D9"/>
+              <w:bottom w:val="single" w:sz="4" w:color="D9D9D9"/>
+              <w:right w:val="single" w:sz="4" w:color="D9D9D9"/>
+            </w:tcBorders>
+            <w:shd w:fill="E7E6E6"/>
+            <w:tcMar>
+              <w:top w:w="75" w:type="dxa"/>
+              <w:left w:w="75" w:type="dxa"/>
+              <w:bottom w:w="75" w:type="dxa"/>
+              <w:right w:w="75" w:type="dxa"/>
+            </w:tcMar>
+          </w:tcPr>
+          <w:p>
+            <w:pPr>
+              <w:spacing w:after="20" w:line="240" w:lineRule="auto"/>
+            </w:pPr>
+            <w:r>
+              <w:rPr>
+                <w:b/>
+                <w:color w:val="000000"/>
+                <w:sz w:val="18"/>
+              </w:rPr>
+              <w:t>Encrypt MB/s</w:t>
+            </w:r>
+          </w:p>
+        </w:tc>
+        <w:tc>
+          <w:tcPr>
+            <w:tcW w:type="dxa" w:w="2074"/>
+            <w:vAlign w:val="center"/>
+            <w:tcBorders>
+              <w:top w:val="single" w:sz="4" w:color="D9D9D9"/>
+              <w:left w:val="single" w:sz="4" w:color="D9D9D9"/>
+              <w:bottom w:val="single" w:sz="4" w:color="D9D9D9"/>
+              <w:right w:val="single" w:sz="4" w:color="D9D9D9"/>
+            </w:tcBorders>
+            <w:shd w:fill="E7E6E6"/>
+            <w:tcMar>
+              <w:top w:w="75" w:type="dxa"/>
+              <w:left w:w="75" w:type="dxa"/>
+              <w:bottom w:w="75" w:type="dxa"/>
+              <w:right w:w="75" w:type="dxa"/>
+            </w:tcMar>
+          </w:tcPr>
+          <w:p>
+            <w:pPr>
+              <w:spacing w:after="20" w:line="240" w:lineRule="auto"/>
+            </w:pPr>
+            <w:r>
+              <w:rPr>
+                <w:b/>
+                <w:color w:val="000000"/>
+                <w:sz w:val="18"/>
+              </w:rPr>
+              <w:t>Speedup</w:t>
+            </w:r>
+          </w:p>
+        </w:tc>
+      </w:tr>
+      <w:tr>
+        <w:tc>
+          <w:tcPr>
+            <w:tcW w:type="dxa" w:w="864"/>
+            <w:vAlign w:val="center"/>
+            <w:tcBorders>
+              <w:top w:val="single" w:sz="4" w:color="D9D9D9"/>
+              <w:left w:val="single" w:sz="4" w:color="D9D9D9"/>
+              <w:bottom w:val="single" w:sz="4" w:color="D9D9D9"/>
+              <w:right w:val="single" w:sz="4" w:color="D9D9D9"/>
+            </w:tcBorders>
+            <w:shd w:fill="FFFFFF"/>
+            <w:tcMar>
+              <w:top w:w="75" w:type="dxa"/>
+              <w:left w:w="75" w:type="dxa"/>
+              <w:bottom w:w="75" w:type="dxa"/>
+              <w:right w:w="75" w:type="dxa"/>
+            </w:tcMar>
+          </w:tcPr>
+          <w:p>
+            <w:pPr>
+              <w:spacing w:after="20" w:line="240" w:lineRule="auto"/>
+            </w:pPr>
+            <w:r>
+              <w:rPr>
+                <w:b w:val="0"/>
+                <w:color w:val="000000"/>
+                <w:sz w:val="18"/>
+              </w:rPr>
+              <w:t>1</w:t>
+            </w:r>
+          </w:p>
+        </w:tc>
+        <w:tc>
+          <w:tcPr>
+            <w:tcW w:type="dxa" w:w="2376"/>
+            <w:vAlign w:val="center"/>
+            <w:tcBorders>
+              <w:top w:val="single" w:sz="4" w:color="D9D9D9"/>
+              <w:left w:val="single" w:sz="4" w:color="D9D9D9"/>
+              <w:bottom w:val="single" w:sz="4" w:color="D9D9D9"/>
+              <w:right w:val="single" w:sz="4" w:color="D9D9D9"/>
+            </w:tcBorders>
+            <w:shd w:fill="FFFFFF"/>
+            <w:tcMar>
+              <w:top w:w="75" w:type="dxa"/>
+              <w:left w:w="75" w:type="dxa"/>
+              <w:bottom w:w="75" w:type="dxa"/>
+              <w:right w:w="75" w:type="dxa"/>
+            </w:tcMar>
+          </w:tcPr>
+          <w:p>
+            <w:pPr>
+              <w:spacing w:after="20" w:line="240" w:lineRule="auto"/>
+            </w:pPr>
+            <w:r>
+              <w:rPr>
+                <w:b w:val="0"/>
+                <w:color w:val="000000"/>
+                <w:sz w:val="18"/>
+              </w:rPr>
+              <w:t>450,013</w:t>
+            </w:r>
+          </w:p>
+        </w:tc>
+        <w:tc>
+          <w:tcPr>
+            <w:tcW w:type="dxa" w:w="2376"/>
+            <w:vAlign w:val="center"/>
+            <w:tcBorders>
+              <w:top w:val="single" w:sz="4" w:color="D9D9D9"/>
+              <w:left w:val="single" w:sz="4" w:color="D9D9D9"/>
+              <w:bottom w:val="single" w:sz="4" w:color="D9D9D9"/>
+              <w:right w:val="single" w:sz="4" w:color="D9D9D9"/>
+            </w:tcBorders>
+            <w:shd w:fill="FFFFFF"/>
+            <w:tcMar>
+              <w:top w:w="75" w:type="dxa"/>
+              <w:left w:w="75" w:type="dxa"/>
+              <w:bottom w:w="75" w:type="dxa"/>
+              <w:right w:w="75" w:type="dxa"/>
+            </w:tcMar>
+          </w:tcPr>
+          <w:p>
+            <w:pPr>
+              <w:spacing w:after="20" w:line="240" w:lineRule="auto"/>
+            </w:pPr>
+            <w:r>
+              <w:rPr>
+                <w:b w:val="0"/>
+                <w:color w:val="000000"/>
+                <w:sz w:val="18"/>
+              </w:rPr>
+              <w:t>450,001</w:t>
+            </w:r>
+          </w:p>
+        </w:tc>
+        <w:tc>
+          <w:tcPr>
+            <w:tcW w:type="dxa" w:w="2592"/>
+            <w:vAlign w:val="center"/>
+            <w:tcBorders>
+              <w:top w:val="single" w:sz="4" w:color="D9D9D9"/>
+              <w:left w:val="single" w:sz="4" w:color="D9D9D9"/>
+              <w:bottom w:val="single" w:sz="4" w:color="D9D9D9"/>
+              <w:right w:val="single" w:sz="4" w:color="D9D9D9"/>
+            </w:tcBorders>
+            <w:shd w:fill="FFFFFF"/>
+            <w:tcMar>
+              <w:top w:w="75" w:type="dxa"/>
+              <w:left w:w="75" w:type="dxa"/>
+              <w:bottom w:w="75" w:type="dxa"/>
+              <w:right w:w="75" w:type="dxa"/>
+            </w:tcMar>
+          </w:tcPr>
+          <w:p>
+            <w:pPr>
+              <w:spacing w:after="20" w:line="240" w:lineRule="auto"/>
+            </w:pPr>
+            <w:r>
+              <w:rPr>
+                <w:b w:val="0"/>
+                <w:color w:val="000000"/>
+                <w:sz w:val="18"/>
+              </w:rPr>
+              <w:t>532.806</w:t>
+            </w:r>
+          </w:p>
+        </w:tc>
+        <w:tc>
+          <w:tcPr>
+            <w:tcW w:type="dxa" w:w="2074"/>
+            <w:vAlign w:val="center"/>
+            <w:tcBorders>
+              <w:top w:val="single" w:sz="4" w:color="D9D9D9"/>
+              <w:left w:val="single" w:sz="4" w:color="D9D9D9"/>
+              <w:bottom w:val="single" w:sz="4" w:color="D9D9D9"/>
+              <w:right w:val="single" w:sz="4" w:color="D9D9D9"/>
+            </w:tcBorders>
+            <w:shd w:fill="FFFFFF"/>
+            <w:tcMar>
+              <w:top w:w="75" w:type="dxa"/>
+              <w:left w:w="75" w:type="dxa"/>
+              <w:bottom w:w="75" w:type="dxa"/>
+              <w:right w:w="75" w:type="dxa"/>
+            </w:tcMar>
+          </w:tcPr>
+          <w:p>
+            <w:pPr>
+              <w:spacing w:after="20" w:line="240" w:lineRule="auto"/>
+            </w:pPr>
+            <w:r>
+              <w:rPr>
+                <w:b w:val="0"/>
+                <w:color w:val="000000"/>
+                <w:sz w:val="18"/>
+              </w:rPr>
+              <w:t>1.000</w:t>
+            </w:r>
+          </w:p>
+        </w:tc>
+      </w:tr>
+      <w:tr>
+        <w:tc>
+          <w:tcPr>
+            <w:tcW w:type="dxa" w:w="864"/>
+            <w:vAlign w:val="center"/>
+            <w:tcBorders>
+              <w:top w:val="single" w:sz="4" w:color="D9D9D9"/>
+              <w:left w:val="single" w:sz="4" w:color="D9D9D9"/>
+              <w:bottom w:val="single" w:sz="4" w:color="D9D9D9"/>
+              <w:right w:val="single" w:sz="4" w:color="D9D9D9"/>
+            </w:tcBorders>
+            <w:shd w:fill="F5F5F5"/>
+            <w:tcMar>
+              <w:top w:w="75" w:type="dxa"/>
+              <w:left w:w="75" w:type="dxa"/>
+              <w:bottom w:w="75" w:type="dxa"/>
+              <w:right w:w="75" w:type="dxa"/>
+            </w:tcMar>
+          </w:tcPr>
+          <w:p>
+            <w:pPr>
+              <w:spacing w:after="20" w:line="240" w:lineRule="auto"/>
+            </w:pPr>
+            <w:r>
+              <w:rPr>
+                <w:b w:val="0"/>
+                <w:color w:val="000000"/>
+                <w:sz w:val="18"/>
+              </w:rPr>
+              <w:t>2</w:t>
+            </w:r>
+          </w:p>
+        </w:tc>
+        <w:tc>
+          <w:tcPr>
+            <w:tcW w:type="dxa" w:w="2376"/>
+            <w:vAlign w:val="center"/>
+            <w:tcBorders>
+              <w:top w:val="single" w:sz="4" w:color="D9D9D9"/>
+              <w:left w:val="single" w:sz="4" w:color="D9D9D9"/>
+              <w:bottom w:val="single" w:sz="4" w:color="D9D9D9"/>
+              <w:right w:val="single" w:sz="4" w:color="D9D9D9"/>
+            </w:tcBorders>
+            <w:shd w:fill="F5F5F5"/>
+            <w:tcMar>
+              <w:top w:w="75" w:type="dxa"/>
+              <w:left w:w="75" w:type="dxa"/>
+              <w:bottom w:w="75" w:type="dxa"/>
+              <w:right w:w="75" w:type="dxa"/>
+            </w:tcMar>
+          </w:tcPr>
+          <w:p>
+            <w:pPr>
+              <w:spacing w:after="20" w:line="240" w:lineRule="auto"/>
+            </w:pPr>
+            <w:r>
+              <w:rPr>
+                <w:b w:val="0"/>
+                <w:color w:val="000000"/>
+                <w:sz w:val="18"/>
+              </w:rPr>
+              <w:t>225,008</w:t>
+            </w:r>
+          </w:p>
+        </w:tc>
+        <w:tc>
+          <w:tcPr>
+            <w:tcW w:type="dxa" w:w="2376"/>
+            <w:vAlign w:val="center"/>
+            <w:tcBorders>
+              <w:top w:val="single" w:sz="4" w:color="D9D9D9"/>
+              <w:left w:val="single" w:sz="4" w:color="D9D9D9"/>
+              <w:bottom w:val="single" w:sz="4" w:color="D9D9D9"/>
+              <w:right w:val="single" w:sz="4" w:color="D9D9D9"/>
+            </w:tcBorders>
+            <w:shd w:fill="F5F5F5"/>
+            <w:tcMar>
+              <w:top w:w="75" w:type="dxa"/>
+              <w:left w:w="75" w:type="dxa"/>
+              <w:bottom w:w="75" w:type="dxa"/>
+              <w:right w:w="75" w:type="dxa"/>
+            </w:tcMar>
+          </w:tcPr>
+          <w:p>
+            <w:pPr>
+              <w:spacing w:after="20" w:line="240" w:lineRule="auto"/>
+            </w:pPr>
+            <w:r>
+              <w:rPr>
+                <w:b w:val="0"/>
+                <w:color w:val="000000"/>
+                <w:sz w:val="18"/>
+              </w:rPr>
+              <w:t>225,002</w:t>
+            </w:r>
+          </w:p>
+        </w:tc>
+        <w:tc>
+          <w:tcPr>
+            <w:tcW w:type="dxa" w:w="2592"/>
+            <w:vAlign w:val="center"/>
+            <w:tcBorders>
+              <w:top w:val="single" w:sz="4" w:color="D9D9D9"/>
+              <w:left w:val="single" w:sz="4" w:color="D9D9D9"/>
+              <w:bottom w:val="single" w:sz="4" w:color="D9D9D9"/>
+              <w:right w:val="single" w:sz="4" w:color="D9D9D9"/>
+            </w:tcBorders>
+            <w:shd w:fill="F5F5F5"/>
+            <w:tcMar>
+              <w:top w:w="75" w:type="dxa"/>
+              <w:left w:w="75" w:type="dxa"/>
+              <w:bottom w:w="75" w:type="dxa"/>
+              <w:right w:w="75" w:type="dxa"/>
+            </w:tcMar>
+          </w:tcPr>
+          <w:p>
+            <w:pPr>
+              <w:spacing w:after="20" w:line="240" w:lineRule="auto"/>
+            </w:pPr>
+            <w:r>
+              <w:rPr>
+                <w:b w:val="0"/>
+                <w:color w:val="000000"/>
+                <w:sz w:val="18"/>
+              </w:rPr>
+              <w:t>1,065.605</w:t>
+            </w:r>
+          </w:p>
+        </w:tc>
+        <w:tc>
+          <w:tcPr>
+            <w:tcW w:type="dxa" w:w="2074"/>
+            <w:vAlign w:val="center"/>
+            <w:tcBorders>
+              <w:top w:val="single" w:sz="4" w:color="D9D9D9"/>
+              <w:left w:val="single" w:sz="4" w:color="D9D9D9"/>
+              <w:bottom w:val="single" w:sz="4" w:color="D9D9D9"/>
+              <w:right w:val="single" w:sz="4" w:color="D9D9D9"/>
+            </w:tcBorders>
+            <w:shd w:fill="F5F5F5"/>
+            <w:tcMar>
+              <w:top w:w="75" w:type="dxa"/>
+              <w:left w:w="75" w:type="dxa"/>
+              <w:bottom w:w="75" w:type="dxa"/>
+              <w:right w:w="75" w:type="dxa"/>
+            </w:tcMar>
+          </w:tcPr>
+          <w:p>
+            <w:pPr>
+              <w:spacing w:after="20" w:line="240" w:lineRule="auto"/>
+            </w:pPr>
+            <w:r>
+              <w:rPr>
+                <w:b w:val="0"/>
+                <w:color w:val="000000"/>
+                <w:sz w:val="18"/>
+              </w:rPr>
+              <w:t>2.000</w:t>
+            </w:r>
+          </w:p>
+        </w:tc>
+      </w:tr>
+      <w:tr>
+        <w:tc>
+          <w:tcPr>
+            <w:tcW w:type="dxa" w:w="864"/>
+            <w:vAlign w:val="center"/>
+            <w:tcBorders>
+              <w:top w:val="single" w:sz="4" w:color="D9D9D9"/>
+              <w:left w:val="single" w:sz="4" w:color="D9D9D9"/>
+              <w:bottom w:val="single" w:sz="4" w:color="D9D9D9"/>
+              <w:right w:val="single" w:sz="4" w:color="D9D9D9"/>
+            </w:tcBorders>
+            <w:shd w:fill="FFFFFF"/>
+            <w:tcMar>
+              <w:top w:w="75" w:type="dxa"/>
+              <w:left w:w="75" w:type="dxa"/>
+              <w:bottom w:w="75" w:type="dxa"/>
+              <w:right w:w="75" w:type="dxa"/>
+            </w:tcMar>
+          </w:tcPr>
+          <w:p>
+            <w:pPr>
+              <w:spacing w:after="20" w:line="240" w:lineRule="auto"/>
+            </w:pPr>
+            <w:r>
+              <w:rPr>
+                <w:b w:val="0"/>
+                <w:color w:val="000000"/>
+                <w:sz w:val="18"/>
+              </w:rPr>
+              <w:t>4</w:t>
+            </w:r>
+          </w:p>
+        </w:tc>
+        <w:tc>
+          <w:tcPr>
+            <w:tcW w:type="dxa" w:w="2376"/>
+            <w:vAlign w:val="center"/>
+            <w:tcBorders>
+              <w:top w:val="single" w:sz="4" w:color="D9D9D9"/>
+              <w:left w:val="single" w:sz="4" w:color="D9D9D9"/>
+              <w:bottom w:val="single" w:sz="4" w:color="D9D9D9"/>
+              <w:right w:val="single" w:sz="4" w:color="D9D9D9"/>
+            </w:tcBorders>
+            <w:shd w:fill="FFFFFF"/>
+            <w:tcMar>
+              <w:top w:w="75" w:type="dxa"/>
+              <w:left w:w="75" w:type="dxa"/>
+              <w:bottom w:w="75" w:type="dxa"/>
+              <w:right w:w="75" w:type="dxa"/>
+            </w:tcMar>
+          </w:tcPr>
+          <w:p>
+            <w:pPr>
+              <w:spacing w:after="20" w:line="240" w:lineRule="auto"/>
+            </w:pPr>
+            <w:r>
+              <w:rPr>
+                <w:b w:val="0"/>
+                <w:color w:val="000000"/>
+                <w:sz w:val="18"/>
+              </w:rPr>
+              <w:t>149,968</w:t>
+            </w:r>
+          </w:p>
+        </w:tc>
+        <w:tc>
+          <w:tcPr>
+            <w:tcW w:type="dxa" w:w="2376"/>
+            <w:vAlign w:val="center"/>
+            <w:tcBorders>
+              <w:top w:val="single" w:sz="4" w:color="D9D9D9"/>
+              <w:left w:val="single" w:sz="4" w:color="D9D9D9"/>
+              <w:bottom w:val="single" w:sz="4" w:color="D9D9D9"/>
+              <w:right w:val="single" w:sz="4" w:color="D9D9D9"/>
+            </w:tcBorders>
+            <w:shd w:fill="FFFFFF"/>
+            <w:tcMar>
+              <w:top w:w="75" w:type="dxa"/>
+              <w:left w:w="75" w:type="dxa"/>
+              <w:bottom w:w="75" w:type="dxa"/>
+              <w:right w:w="75" w:type="dxa"/>
+            </w:tcMar>
+          </w:tcPr>
+          <w:p>
+            <w:pPr>
+              <w:spacing w:after="20" w:line="240" w:lineRule="auto"/>
+            </w:pPr>
+            <w:r>
+              <w:rPr>
+                <w:b w:val="0"/>
+                <w:color w:val="000000"/>
+                <w:sz w:val="18"/>
+              </w:rPr>
+              <w:t>149,965</w:t>
+            </w:r>
+          </w:p>
+        </w:tc>
+        <w:tc>
+          <w:tcPr>
+            <w:tcW w:type="dxa" w:w="2592"/>
+            <w:vAlign w:val="center"/>
+            <w:tcBorders>
+              <w:top w:val="single" w:sz="4" w:color="D9D9D9"/>
+              <w:left w:val="single" w:sz="4" w:color="D9D9D9"/>
+              <w:bottom w:val="single" w:sz="4" w:color="D9D9D9"/>
+              <w:right w:val="single" w:sz="4" w:color="D9D9D9"/>
+            </w:tcBorders>
+            <w:shd w:fill="FFFFFF"/>
+            <w:tcMar>
+              <w:top w:w="75" w:type="dxa"/>
+              <w:left w:w="75" w:type="dxa"/>
+              <w:bottom w:w="75" w:type="dxa"/>
+              <w:right w:w="75" w:type="dxa"/>
+            </w:tcMar>
+          </w:tcPr>
+          <w:p>
+            <w:pPr>
+              <w:spacing w:after="20" w:line="240" w:lineRule="auto"/>
+            </w:pPr>
+            <w:r>
+              <w:rPr>
+                <w:b w:val="0"/>
+                <w:color w:val="000000"/>
+                <w:sz w:val="18"/>
+              </w:rPr>
+              <w:t>1,598.805</w:t>
+            </w:r>
+          </w:p>
+        </w:tc>
+        <w:tc>
+          <w:tcPr>
+            <w:tcW w:type="dxa" w:w="2074"/>
+            <w:vAlign w:val="center"/>
+            <w:tcBorders>
+              <w:top w:val="single" w:sz="4" w:color="D9D9D9"/>
+              <w:left w:val="single" w:sz="4" w:color="D9D9D9"/>
+              <w:bottom w:val="single" w:sz="4" w:color="D9D9D9"/>
+              <w:right w:val="single" w:sz="4" w:color="D9D9D9"/>
+            </w:tcBorders>
+            <w:shd w:fill="FFFFFF"/>
+            <w:tcMar>
+              <w:top w:w="75" w:type="dxa"/>
+              <w:left w:w="75" w:type="dxa"/>
+              <w:bottom w:w="75" w:type="dxa"/>
+              <w:right w:w="75" w:type="dxa"/>
+            </w:tcMar>
+          </w:tcPr>
+          <w:p>
+            <w:pPr>
+              <w:spacing w:after="20" w:line="240" w:lineRule="auto"/>
+            </w:pPr>
+            <w:r>
+              <w:rPr>
+                <w:b w:val="0"/>
+                <w:color w:val="000000"/>
+                <w:sz w:val="18"/>
+              </w:rPr>
+              <w:t>3.001</w:t>
+            </w:r>
+          </w:p>
+        </w:tc>
+      </w:tr>
+    </w:tbl>
+    <w:p>
+      <w:pPr>
+        <w:spacing w:after="0"/>
+      </w:pPr>
+    </w:p>
+    <w:p>
+      <w:pPr>
+        <w:keepNext w:val="0"/>
+        <w:spacing w:before="40" w:after="80"/>
+        <w:jc w:val="center"/>
+      </w:pPr>
+      <w:r>
+        <w:rPr>
+          <w:sz w:val="17"/>
+        </w:rPr>
+        <w:t>Table XIV. Full-adapter always-ready simulation at a nominal 100 MHz, with boundary queues bypassed. Decimal payload MB/s excludes metadata. These are simulated kernel results [20].</w:t>
+      </w:r>
+    </w:p>
+    <w:p>
+      <w:pPr>
+        <w:keepNext/>
+        <w:spacing w:before="100" w:after="40"/>
+      </w:pPr>
+      <w:r>
+        <w:rPr>
+          <w:b/>
+          <w:sz w:val="21"/>
+        </w:rPr>
+        <w:t>A. Bus service and routed integration timing</w:t>
+      </w:r>
+    </w:p>
+    <w:p>
+      <w:pPr>
+        <w:spacing w:after="60" w:line="245" w:lineRule="auto"/>
+        <w:ind w:firstLine="317"/>
+        <w:jc w:val="both"/>
+      </w:pPr>
+      <w:r>
+        <w:t>All reported full-adapter encryptions match every reference ciphertext beat and tag. Decryption reconstructs the file and checkpoint exactly. Registered-ready boundaries preserve similar ideal throughput: 450,013, 225,007 and 149,971 encryption clocks for one, two and four cores. Two folded cores request about 1,066.7 MB/s of payload; four would request about 2,133.3 MB/s without bus contention. Four therefore approach the separate buses' 1,600 MB/s ceiling at 100 MHz. Four-core cycle speedup is about 3.001 times one chunked core, 5.996 times buffered u3 and 11.991 times original u1; those denominators describe different architectures.</w:t>
+      </w:r>
+    </w:p>
+    <w:p>
+      <w:pPr>
+        <w:spacing w:after="60" w:line="245" w:lineRule="auto"/>
+        <w:ind w:firstLine="317"/>
+        <w:jc w:val="both"/>
+      </w:pPr>
+      <w:r>
+        <w:t>The memory model charges reads and writes, including AD and tags, against an assumed shared budget. At 1 GB/s aggregate service, two and four cores both take about 4.797 ms to encrypt; at 1.3 GB/s they take about 3.749 ms. A payload read plus write already costs 4,795,392 bytes, so ideal lower bounds are 4.795392 and 3.688763 ms. A later release copy is excluded. These are modeled service limits, with no physical DDR2 controller or measured memory bandwidth.</w:t>
+      </w:r>
+    </w:p>
+    <w:tbl>
+      <w:tblPr>
+        <w:tblW w:type="auto" w:w="0"/>
+        <w:jc w:val="center"/>
+        <w:tblLayout w:type="fixed"/>
+        <w:tblLook w:firstColumn="1" w:firstRow="1" w:lastColumn="0" w:lastRow="0" w:noHBand="0" w:noVBand="1" w:val="04A0"/>
+      </w:tblPr>
+      <w:tblGrid>
+        <w:gridCol w:w="3024"/>
+        <w:gridCol w:w="792"/>
+        <w:gridCol w:w="2160"/>
+        <w:gridCol w:w="2376"/>
+        <w:gridCol w:w="1930"/>
+      </w:tblGrid>
+      <w:tr>
+        <w:trPr>
+          <w:tblHeader/>
+        </w:trPr>
+        <w:tc>
+          <w:tcPr>
+            <w:tcW w:type="dxa" w:w="3024"/>
+            <w:vAlign w:val="center"/>
+            <w:tcBorders>
+              <w:top w:val="single" w:sz="4" w:color="D9D9D9"/>
+              <w:left w:val="single" w:sz="4" w:color="D9D9D9"/>
+              <w:bottom w:val="single" w:sz="4" w:color="D9D9D9"/>
+              <w:right w:val="single" w:sz="4" w:color="D9D9D9"/>
+            </w:tcBorders>
+            <w:shd w:fill="E7E6E6"/>
+            <w:tcMar>
+              <w:top w:w="75" w:type="dxa"/>
+              <w:left w:w="75" w:type="dxa"/>
+              <w:bottom w:w="75" w:type="dxa"/>
+              <w:right w:w="75" w:type="dxa"/>
+            </w:tcMar>
+          </w:tcPr>
+          <w:p>
+            <w:pPr>
+              <w:spacing w:after="20" w:line="240" w:lineRule="auto"/>
+            </w:pPr>
+            <w:r>
+              <w:rPr>
+                <w:b/>
+                <w:color w:val="000000"/>
+                <w:sz w:val="18"/>
+              </w:rPr>
+              <w:t>Integration harness</w:t>
+            </w:r>
+          </w:p>
+        </w:tc>
+        <w:tc>
+          <w:tcPr>
+            <w:tcW w:type="dxa" w:w="792"/>
+            <w:vAlign w:val="center"/>
+            <w:tcBorders>
+              <w:top w:val="single" w:sz="4" w:color="D9D9D9"/>
+              <w:left w:val="single" w:sz="4" w:color="D9D9D9"/>
+              <w:bottom w:val="single" w:sz="4" w:color="D9D9D9"/>
+              <w:right w:val="single" w:sz="4" w:color="D9D9D9"/>
+            </w:tcBorders>
+            <w:shd w:fill="E7E6E6"/>
+            <w:tcMar>
+              <w:top w:w="75" w:type="dxa"/>
+              <w:left w:w="75" w:type="dxa"/>
+              <w:bottom w:w="75" w:type="dxa"/>
+              <w:right w:w="75" w:type="dxa"/>
+            </w:tcMar>
+          </w:tcPr>
+          <w:p>
+            <w:pPr>
+              <w:spacing w:after="20" w:line="240" w:lineRule="auto"/>
+            </w:pPr>
+            <w:r>
+              <w:rPr>
+                <w:b/>
+                <w:color w:val="000000"/>
+                <w:sz w:val="18"/>
+              </w:rPr>
+              <w:t>MHz</w:t>
+            </w:r>
+          </w:p>
+        </w:tc>
+        <w:tc>
+          <w:tcPr>
+            <w:tcW w:type="dxa" w:w="2160"/>
+            <w:vAlign w:val="center"/>
+            <w:tcBorders>
+              <w:top w:val="single" w:sz="4" w:color="D9D9D9"/>
+              <w:left w:val="single" w:sz="4" w:color="D9D9D9"/>
+              <w:bottom w:val="single" w:sz="4" w:color="D9D9D9"/>
+              <w:right w:val="single" w:sz="4" w:color="D9D9D9"/>
+            </w:tcBorders>
+            <w:shd w:fill="E7E6E6"/>
+            <w:tcMar>
+              <w:top w:w="75" w:type="dxa"/>
+              <w:left w:w="75" w:type="dxa"/>
+              <w:bottom w:w="75" w:type="dxa"/>
+              <w:right w:w="75" w:type="dxa"/>
+            </w:tcMar>
+          </w:tcPr>
+          <w:p>
+            <w:pPr>
+              <w:spacing w:after="20" w:line="240" w:lineRule="auto"/>
+            </w:pPr>
+            <w:r>
+              <w:rPr>
+                <w:b/>
+                <w:color w:val="000000"/>
+                <w:sz w:val="18"/>
+              </w:rPr>
+              <w:t>Setup / hold ns</w:t>
+            </w:r>
+          </w:p>
+        </w:tc>
+        <w:tc>
+          <w:tcPr>
+            <w:tcW w:type="dxa" w:w="2376"/>
+            <w:vAlign w:val="center"/>
+            <w:tcBorders>
+              <w:top w:val="single" w:sz="4" w:color="D9D9D9"/>
+              <w:left w:val="single" w:sz="4" w:color="D9D9D9"/>
+              <w:bottom w:val="single" w:sz="4" w:color="D9D9D9"/>
+              <w:right w:val="single" w:sz="4" w:color="D9D9D9"/>
+            </w:tcBorders>
+            <w:shd w:fill="E7E6E6"/>
+            <w:tcMar>
+              <w:top w:w="75" w:type="dxa"/>
+              <w:left w:w="75" w:type="dxa"/>
+              <w:bottom w:w="75" w:type="dxa"/>
+              <w:right w:w="75" w:type="dxa"/>
+            </w:tcMar>
+          </w:tcPr>
+          <w:p>
+            <w:pPr>
+              <w:spacing w:after="20" w:line="240" w:lineRule="auto"/>
+            </w:pPr>
+            <w:r>
+              <w:rPr>
+                <w:b/>
+                <w:color w:val="000000"/>
+                <w:sz w:val="18"/>
+              </w:rPr>
+              <w:t>LUT / registers</w:t>
+            </w:r>
+          </w:p>
+        </w:tc>
+        <w:tc>
+          <w:tcPr>
+            <w:tcW w:type="dxa" w:w="1930"/>
+            <w:vAlign w:val="center"/>
+            <w:tcBorders>
+              <w:top w:val="single" w:sz="4" w:color="D9D9D9"/>
+              <w:left w:val="single" w:sz="4" w:color="D9D9D9"/>
+              <w:bottom w:val="single" w:sz="4" w:color="D9D9D9"/>
+              <w:right w:val="single" w:sz="4" w:color="D9D9D9"/>
+            </w:tcBorders>
+            <w:shd w:fill="E7E6E6"/>
+            <w:tcMar>
+              <w:top w:w="75" w:type="dxa"/>
+              <w:left w:w="75" w:type="dxa"/>
+              <w:bottom w:w="75" w:type="dxa"/>
+              <w:right w:w="75" w:type="dxa"/>
+            </w:tcMar>
+          </w:tcPr>
+          <w:p>
+            <w:pPr>
+              <w:spacing w:after="20" w:line="240" w:lineRule="auto"/>
+            </w:pPr>
+            <w:r>
+              <w:rPr>
+                <w:b/>
+                <w:color w:val="000000"/>
+                <w:sz w:val="18"/>
+              </w:rPr>
+              <w:t>Derived encrypt ms</w:t>
+            </w:r>
+          </w:p>
+        </w:tc>
+      </w:tr>
+      <w:tr>
+        <w:tc>
+          <w:tcPr>
+            <w:tcW w:type="dxa" w:w="3024"/>
+            <w:vAlign w:val="center"/>
+            <w:tcBorders>
+              <w:top w:val="single" w:sz="4" w:color="D9D9D9"/>
+              <w:left w:val="single" w:sz="4" w:color="D9D9D9"/>
+              <w:bottom w:val="single" w:sz="4" w:color="D9D9D9"/>
+              <w:right w:val="single" w:sz="4" w:color="D9D9D9"/>
+            </w:tcBorders>
+            <w:shd w:fill="FFFFFF"/>
+            <w:tcMar>
+              <w:top w:w="75" w:type="dxa"/>
+              <w:left w:w="75" w:type="dxa"/>
+              <w:bottom w:w="75" w:type="dxa"/>
+              <w:right w:w="75" w:type="dxa"/>
+            </w:tcMar>
+          </w:tcPr>
+          <w:p>
+            <w:pPr>
+              <w:spacing w:after="20" w:line="240" w:lineRule="auto"/>
+            </w:pPr>
+            <w:r>
+              <w:rPr>
+                <w:b w:val="0"/>
+                <w:color w:val="000000"/>
+                <w:sz w:val="18"/>
+              </w:rPr>
+              <w:t>1 core, boundaries</w:t>
+            </w:r>
+          </w:p>
+        </w:tc>
+        <w:tc>
+          <w:tcPr>
+            <w:tcW w:type="dxa" w:w="792"/>
+            <w:vAlign w:val="center"/>
+            <w:tcBorders>
+              <w:top w:val="single" w:sz="4" w:color="D9D9D9"/>
+              <w:left w:val="single" w:sz="4" w:color="D9D9D9"/>
+              <w:bottom w:val="single" w:sz="4" w:color="D9D9D9"/>
+              <w:right w:val="single" w:sz="4" w:color="D9D9D9"/>
+            </w:tcBorders>
+            <w:shd w:fill="FFFFFF"/>
+            <w:tcMar>
+              <w:top w:w="75" w:type="dxa"/>
+              <w:left w:w="75" w:type="dxa"/>
+              <w:bottom w:w="75" w:type="dxa"/>
+              <w:right w:w="75" w:type="dxa"/>
+            </w:tcMar>
+          </w:tcPr>
+          <w:p>
+            <w:pPr>
+              <w:spacing w:after="20" w:line="240" w:lineRule="auto"/>
+            </w:pPr>
+            <w:r>
+              <w:rPr>
+                <w:b w:val="0"/>
+                <w:color w:val="000000"/>
+                <w:sz w:val="18"/>
+              </w:rPr>
+              <w:t>100</w:t>
+            </w:r>
+          </w:p>
+        </w:tc>
+        <w:tc>
+          <w:tcPr>
+            <w:tcW w:type="dxa" w:w="2160"/>
+            <w:vAlign w:val="center"/>
+            <w:tcBorders>
+              <w:top w:val="single" w:sz="4" w:color="D9D9D9"/>
+              <w:left w:val="single" w:sz="4" w:color="D9D9D9"/>
+              <w:bottom w:val="single" w:sz="4" w:color="D9D9D9"/>
+              <w:right w:val="single" w:sz="4" w:color="D9D9D9"/>
+            </w:tcBorders>
+            <w:shd w:fill="FFFFFF"/>
+            <w:tcMar>
+              <w:top w:w="75" w:type="dxa"/>
+              <w:left w:w="75" w:type="dxa"/>
+              <w:bottom w:w="75" w:type="dxa"/>
+              <w:right w:w="75" w:type="dxa"/>
+            </w:tcMar>
+          </w:tcPr>
+          <w:p>
+            <w:pPr>
+              <w:spacing w:after="20" w:line="240" w:lineRule="auto"/>
+            </w:pPr>
+            <w:r>
+              <w:rPr>
+                <w:b w:val="0"/>
+                <w:color w:val="000000"/>
+                <w:sz w:val="18"/>
+              </w:rPr>
+              <w:t>+0.004 / +0.098</w:t>
+            </w:r>
+          </w:p>
+        </w:tc>
+        <w:tc>
+          <w:tcPr>
+            <w:tcW w:type="dxa" w:w="2376"/>
+            <w:vAlign w:val="center"/>
+            <w:tcBorders>
+              <w:top w:val="single" w:sz="4" w:color="D9D9D9"/>
+              <w:left w:val="single" w:sz="4" w:color="D9D9D9"/>
+              <w:bottom w:val="single" w:sz="4" w:color="D9D9D9"/>
+              <w:right w:val="single" w:sz="4" w:color="D9D9D9"/>
+            </w:tcBorders>
+            <w:shd w:fill="FFFFFF"/>
+            <w:tcMar>
+              <w:top w:w="75" w:type="dxa"/>
+              <w:left w:w="75" w:type="dxa"/>
+              <w:bottom w:w="75" w:type="dxa"/>
+              <w:right w:w="75" w:type="dxa"/>
+            </w:tcMar>
+          </w:tcPr>
+          <w:p>
+            <w:pPr>
+              <w:spacing w:after="20" w:line="240" w:lineRule="auto"/>
+            </w:pPr>
+            <w:r>
+              <w:rPr>
+                <w:b w:val="0"/>
+                <w:color w:val="000000"/>
+                <w:sz w:val="18"/>
+              </w:rPr>
+              <w:t>6,980 / 3,873</w:t>
+            </w:r>
+          </w:p>
+        </w:tc>
+        <w:tc>
+          <w:tcPr>
+            <w:tcW w:type="dxa" w:w="1930"/>
+            <w:vAlign w:val="center"/>
+            <w:tcBorders>
+              <w:top w:val="single" w:sz="4" w:color="D9D9D9"/>
+              <w:left w:val="single" w:sz="4" w:color="D9D9D9"/>
+              <w:bottom w:val="single" w:sz="4" w:color="D9D9D9"/>
+              <w:right w:val="single" w:sz="4" w:color="D9D9D9"/>
+            </w:tcBorders>
+            <w:shd w:fill="FFFFFF"/>
+            <w:tcMar>
+              <w:top w:w="75" w:type="dxa"/>
+              <w:left w:w="75" w:type="dxa"/>
+              <w:bottom w:w="75" w:type="dxa"/>
+              <w:right w:w="75" w:type="dxa"/>
+            </w:tcMar>
+          </w:tcPr>
+          <w:p>
+            <w:pPr>
+              <w:spacing w:after="20" w:line="240" w:lineRule="auto"/>
+            </w:pPr>
+            <w:r>
+              <w:rPr>
+                <w:b w:val="0"/>
+                <w:color w:val="000000"/>
+                <w:sz w:val="18"/>
+              </w:rPr>
+              <w:t>4.50013</w:t>
+            </w:r>
+          </w:p>
+        </w:tc>
+      </w:tr>
+      <w:tr>
+        <w:tc>
+          <w:tcPr>
+            <w:tcW w:type="dxa" w:w="3024"/>
+            <w:vAlign w:val="center"/>
+            <w:tcBorders>
+              <w:top w:val="single" w:sz="4" w:color="D9D9D9"/>
+              <w:left w:val="single" w:sz="4" w:color="D9D9D9"/>
+              <w:bottom w:val="single" w:sz="4" w:color="D9D9D9"/>
+              <w:right w:val="single" w:sz="4" w:color="D9D9D9"/>
+            </w:tcBorders>
+            <w:shd w:fill="F5F5F5"/>
+            <w:tcMar>
+              <w:top w:w="75" w:type="dxa"/>
+              <w:left w:w="75" w:type="dxa"/>
+              <w:bottom w:w="75" w:type="dxa"/>
+              <w:right w:w="75" w:type="dxa"/>
+            </w:tcMar>
+          </w:tcPr>
+          <w:p>
+            <w:pPr>
+              <w:spacing w:after="20" w:line="240" w:lineRule="auto"/>
+            </w:pPr>
+            <w:r>
+              <w:rPr>
+                <w:b w:val="0"/>
+                <w:color w:val="000000"/>
+                <w:sz w:val="18"/>
+              </w:rPr>
+              <w:t>2 cores, boundaries</w:t>
+            </w:r>
+          </w:p>
+        </w:tc>
+        <w:tc>
+          <w:tcPr>
+            <w:tcW w:type="dxa" w:w="792"/>
+            <w:vAlign w:val="center"/>
+            <w:tcBorders>
+              <w:top w:val="single" w:sz="4" w:color="D9D9D9"/>
+              <w:left w:val="single" w:sz="4" w:color="D9D9D9"/>
+              <w:bottom w:val="single" w:sz="4" w:color="D9D9D9"/>
+              <w:right w:val="single" w:sz="4" w:color="D9D9D9"/>
+            </w:tcBorders>
+            <w:shd w:fill="F5F5F5"/>
+            <w:tcMar>
+              <w:top w:w="75" w:type="dxa"/>
+              <w:left w:w="75" w:type="dxa"/>
+              <w:bottom w:w="75" w:type="dxa"/>
+              <w:right w:w="75" w:type="dxa"/>
+            </w:tcMar>
+          </w:tcPr>
+          <w:p>
+            <w:pPr>
+              <w:spacing w:after="20" w:line="240" w:lineRule="auto"/>
+            </w:pPr>
+            <w:r>
+              <w:rPr>
+                <w:b w:val="0"/>
+                <w:color w:val="000000"/>
+                <w:sz w:val="18"/>
+              </w:rPr>
+              <w:t>100</w:t>
+            </w:r>
+          </w:p>
+        </w:tc>
+        <w:tc>
+          <w:tcPr>
+            <w:tcW w:type="dxa" w:w="2160"/>
+            <w:vAlign w:val="center"/>
+            <w:tcBorders>
+              <w:top w:val="single" w:sz="4" w:color="D9D9D9"/>
+              <w:left w:val="single" w:sz="4" w:color="D9D9D9"/>
+              <w:bottom w:val="single" w:sz="4" w:color="D9D9D9"/>
+              <w:right w:val="single" w:sz="4" w:color="D9D9D9"/>
+            </w:tcBorders>
+            <w:shd w:fill="F5F5F5"/>
+            <w:tcMar>
+              <w:top w:w="75" w:type="dxa"/>
+              <w:left w:w="75" w:type="dxa"/>
+              <w:bottom w:w="75" w:type="dxa"/>
+              <w:right w:w="75" w:type="dxa"/>
+            </w:tcMar>
+          </w:tcPr>
+          <w:p>
+            <w:pPr>
+              <w:spacing w:after="20" w:line="240" w:lineRule="auto"/>
+            </w:pPr>
+            <w:r>
+              <w:rPr>
+                <w:b w:val="0"/>
+                <w:color w:val="000000"/>
+                <w:sz w:val="18"/>
+              </w:rPr>
+              <w:t>+0.012 / +0.098</w:t>
+            </w:r>
+          </w:p>
+        </w:tc>
+        <w:tc>
+          <w:tcPr>
+            <w:tcW w:type="dxa" w:w="2376"/>
+            <w:vAlign w:val="center"/>
+            <w:tcBorders>
+              <w:top w:val="single" w:sz="4" w:color="D9D9D9"/>
+              <w:left w:val="single" w:sz="4" w:color="D9D9D9"/>
+              <w:bottom w:val="single" w:sz="4" w:color="D9D9D9"/>
+              <w:right w:val="single" w:sz="4" w:color="D9D9D9"/>
+            </w:tcBorders>
+            <w:shd w:fill="F5F5F5"/>
+            <w:tcMar>
+              <w:top w:w="75" w:type="dxa"/>
+              <w:left w:w="75" w:type="dxa"/>
+              <w:bottom w:w="75" w:type="dxa"/>
+              <w:right w:w="75" w:type="dxa"/>
+            </w:tcMar>
+          </w:tcPr>
+          <w:p>
+            <w:pPr>
+              <w:spacing w:after="20" w:line="240" w:lineRule="auto"/>
+            </w:pPr>
+            <w:r>
+              <w:rPr>
+                <w:b w:val="0"/>
+                <w:color w:val="000000"/>
+                <w:sz w:val="18"/>
+              </w:rPr>
+              <w:t>12,776 / 5,908</w:t>
+            </w:r>
+          </w:p>
+        </w:tc>
+        <w:tc>
+          <w:tcPr>
+            <w:tcW w:type="dxa" w:w="1930"/>
+            <w:vAlign w:val="center"/>
+            <w:tcBorders>
+              <w:top w:val="single" w:sz="4" w:color="D9D9D9"/>
+              <w:left w:val="single" w:sz="4" w:color="D9D9D9"/>
+              <w:bottom w:val="single" w:sz="4" w:color="D9D9D9"/>
+              <w:right w:val="single" w:sz="4" w:color="D9D9D9"/>
+            </w:tcBorders>
+            <w:shd w:fill="F5F5F5"/>
+            <w:tcMar>
+              <w:top w:w="75" w:type="dxa"/>
+              <w:left w:w="75" w:type="dxa"/>
+              <w:bottom w:w="75" w:type="dxa"/>
+              <w:right w:w="75" w:type="dxa"/>
+            </w:tcMar>
+          </w:tcPr>
+          <w:p>
+            <w:pPr>
+              <w:spacing w:after="20" w:line="240" w:lineRule="auto"/>
+            </w:pPr>
+            <w:r>
+              <w:rPr>
+                <w:b w:val="0"/>
+                <w:color w:val="000000"/>
+                <w:sz w:val="18"/>
+              </w:rPr>
+              <w:t>2.25007</w:t>
+            </w:r>
+          </w:p>
+        </w:tc>
+      </w:tr>
+      <w:tr>
+        <w:tc>
+          <w:tcPr>
+            <w:tcW w:type="dxa" w:w="3024"/>
+            <w:vAlign w:val="center"/>
+            <w:tcBorders>
+              <w:top w:val="single" w:sz="4" w:color="D9D9D9"/>
+              <w:left w:val="single" w:sz="4" w:color="D9D9D9"/>
+              <w:bottom w:val="single" w:sz="4" w:color="D9D9D9"/>
+              <w:right w:val="single" w:sz="4" w:color="D9D9D9"/>
+            </w:tcBorders>
+            <w:shd w:fill="FFFFFF"/>
+            <w:tcMar>
+              <w:top w:w="75" w:type="dxa"/>
+              <w:left w:w="75" w:type="dxa"/>
+              <w:bottom w:w="75" w:type="dxa"/>
+              <w:right w:w="75" w:type="dxa"/>
+            </w:tcMar>
+          </w:tcPr>
+          <w:p>
+            <w:pPr>
+              <w:spacing w:after="20" w:line="240" w:lineRule="auto"/>
+            </w:pPr>
+            <w:r>
+              <w:rPr>
+                <w:b w:val="0"/>
+                <w:color w:val="000000"/>
+                <w:sz w:val="18"/>
+              </w:rPr>
+              <w:t>4 cores, local control</w:t>
+            </w:r>
+          </w:p>
+        </w:tc>
+        <w:tc>
+          <w:tcPr>
+            <w:tcW w:type="dxa" w:w="792"/>
+            <w:vAlign w:val="center"/>
+            <w:tcBorders>
+              <w:top w:val="single" w:sz="4" w:color="D9D9D9"/>
+              <w:left w:val="single" w:sz="4" w:color="D9D9D9"/>
+              <w:bottom w:val="single" w:sz="4" w:color="D9D9D9"/>
+              <w:right w:val="single" w:sz="4" w:color="D9D9D9"/>
+            </w:tcBorders>
+            <w:shd w:fill="FFFFFF"/>
+            <w:tcMar>
+              <w:top w:w="75" w:type="dxa"/>
+              <w:left w:w="75" w:type="dxa"/>
+              <w:bottom w:w="75" w:type="dxa"/>
+              <w:right w:w="75" w:type="dxa"/>
+            </w:tcMar>
+          </w:tcPr>
+          <w:p>
+            <w:pPr>
+              <w:spacing w:after="20" w:line="240" w:lineRule="auto"/>
+            </w:pPr>
+            <w:r>
+              <w:rPr>
+                <w:b w:val="0"/>
+                <w:color w:val="000000"/>
+                <w:sz w:val="18"/>
+              </w:rPr>
+              <w:t>90</w:t>
+            </w:r>
+          </w:p>
+        </w:tc>
+        <w:tc>
+          <w:tcPr>
+            <w:tcW w:type="dxa" w:w="2160"/>
+            <w:vAlign w:val="center"/>
+            <w:tcBorders>
+              <w:top w:val="single" w:sz="4" w:color="D9D9D9"/>
+              <w:left w:val="single" w:sz="4" w:color="D9D9D9"/>
+              <w:bottom w:val="single" w:sz="4" w:color="D9D9D9"/>
+              <w:right w:val="single" w:sz="4" w:color="D9D9D9"/>
+            </w:tcBorders>
+            <w:shd w:fill="FFFFFF"/>
+            <w:tcMar>
+              <w:top w:w="75" w:type="dxa"/>
+              <w:left w:w="75" w:type="dxa"/>
+              <w:bottom w:w="75" w:type="dxa"/>
+              <w:right w:w="75" w:type="dxa"/>
+            </w:tcMar>
+          </w:tcPr>
+          <w:p>
+            <w:pPr>
+              <w:spacing w:after="20" w:line="240" w:lineRule="auto"/>
+            </w:pPr>
+            <w:r>
+              <w:rPr>
+                <w:b w:val="0"/>
+                <w:color w:val="000000"/>
+                <w:sz w:val="18"/>
+              </w:rPr>
+              <w:t>+0.060 / +0.098</w:t>
+            </w:r>
+          </w:p>
+        </w:tc>
+        <w:tc>
+          <w:tcPr>
+            <w:tcW w:type="dxa" w:w="2376"/>
+            <w:vAlign w:val="center"/>
+            <w:tcBorders>
+              <w:top w:val="single" w:sz="4" w:color="D9D9D9"/>
+              <w:left w:val="single" w:sz="4" w:color="D9D9D9"/>
+              <w:bottom w:val="single" w:sz="4" w:color="D9D9D9"/>
+              <w:right w:val="single" w:sz="4" w:color="D9D9D9"/>
+            </w:tcBorders>
+            <w:shd w:fill="FFFFFF"/>
+            <w:tcMar>
+              <w:top w:w="75" w:type="dxa"/>
+              <w:left w:w="75" w:type="dxa"/>
+              <w:bottom w:w="75" w:type="dxa"/>
+              <w:right w:w="75" w:type="dxa"/>
+            </w:tcMar>
+          </w:tcPr>
+          <w:p>
+            <w:pPr>
+              <w:spacing w:after="20" w:line="240" w:lineRule="auto"/>
+            </w:pPr>
+            <w:r>
+              <w:rPr>
+                <w:b w:val="0"/>
+                <w:color w:val="000000"/>
+                <w:sz w:val="18"/>
+              </w:rPr>
+              <w:t>25,916 / 10,966</w:t>
+            </w:r>
+          </w:p>
+        </w:tc>
+        <w:tc>
+          <w:tcPr>
+            <w:tcW w:type="dxa" w:w="1930"/>
+            <w:vAlign w:val="center"/>
+            <w:tcBorders>
+              <w:top w:val="single" w:sz="4" w:color="D9D9D9"/>
+              <w:left w:val="single" w:sz="4" w:color="D9D9D9"/>
+              <w:bottom w:val="single" w:sz="4" w:color="D9D9D9"/>
+              <w:right w:val="single" w:sz="4" w:color="D9D9D9"/>
+            </w:tcBorders>
+            <w:shd w:fill="FFFFFF"/>
+            <w:tcMar>
+              <w:top w:w="75" w:type="dxa"/>
+              <w:left w:w="75" w:type="dxa"/>
+              <w:bottom w:w="75" w:type="dxa"/>
+              <w:right w:w="75" w:type="dxa"/>
+            </w:tcMar>
+          </w:tcPr>
+          <w:p>
+            <w:pPr>
+              <w:spacing w:after="20" w:line="240" w:lineRule="auto"/>
+            </w:pPr>
+            <w:r>
+              <w:rPr>
+                <w:b w:val="0"/>
+                <w:color w:val="000000"/>
+                <w:sz w:val="18"/>
+              </w:rPr>
+              <w:t>1.66634</w:t>
+            </w:r>
+          </w:p>
+        </w:tc>
+      </w:tr>
+    </w:tbl>
+    <w:p>
+      <w:pPr>
+        <w:spacing w:after="0"/>
+      </w:pPr>
+    </w:p>
+    <w:p>
+      <w:pPr>
+        <w:keepNext w:val="0"/>
+        <w:spacing w:before="40" w:after="80"/>
+        <w:jc w:val="center"/>
+      </w:pPr>
+      <w:r>
+        <w:rPr>
+          <w:sz w:val="17"/>
+        </w:rPr>
+        <w:t>Table XV. Selected routed integration harnesses on xc7a100tcsg324-1, Vivado 2023.2. Time is simulated registered-boundary cycles divided by routed clock. This is not physical file latency [20].</w:t>
+      </w:r>
+    </w:p>
+    <w:p>
+      <w:pPr>
+        <w:spacing w:after="60" w:line="245" w:lineRule="auto"/>
+        <w:ind w:firstLine="317"/>
+        <w:jc w:val="both"/>
+      </w:pPr>
+      <w:r>
+        <w:t>Unregistered base routes fail 100 MHz for all three counts. Boundary registers close one and two cores; four fail at 100 MHz even with local control and Pblocks, then pass at 90 MHz. The one- and two-core critical paths are seven-level folded state feedback; four cores are limited by twelve-level framing/control into the core input boundary. These are individual routes with margins as small as 0.004 ns. Internal register timing is assessed separately from nominal unconstrained physical I/O placement in the out-of-context harness.</w:t>
+      </w:r>
+    </w:p>
+    <w:p>
+      <w:pPr>
+        <w:keepNext/>
+        <w:spacing w:before="100" w:after="40"/>
+      </w:pPr>
+      <w:r>
+        <w:rPr>
+          <w:b/>
+          <w:sz w:val="21"/>
+        </w:rPr>
+        <w:t>B. Physical FPGA fixture and negative cases</w:t>
+      </w:r>
+    </w:p>
+    <w:p>
+      <w:pPr>
+        <w:spacing w:after="60" w:line="245" w:lineRule="auto"/>
+        <w:ind w:firstLine="317"/>
+        <w:jc w:val="both"/>
+      </w:pPr>
+      <w:r>
+        <w:t>The October 27 board fixture contains 3,072 bytes from the trained adapter, 256 bytes per layer: the first 64 bytes of each down_w, down_b, up_w and up_b slice. An on-FPGA checker compares every encryption beat/tag and valid decryption beat against an independent Python oracle. Each core count was programmed and captured twice through JTAG ILA, passing all ten cases in both runs with exact agreement with simulated case cycle counts. The complete 2,397,696-byte adapter was not transferred through the FPGA in this test [20].</w:t>
+      </w:r>
+    </w:p>
+    <w:tbl>
+      <w:tblPr>
+        <w:tblW w:type="auto" w:w="0"/>
+        <w:jc w:val="center"/>
+        <w:tblLayout w:type="fixed"/>
+        <w:tblLook w:firstColumn="1" w:firstRow="1" w:lastColumn="0" w:lastRow="0" w:noHBand="0" w:noVBand="1" w:val="04A0"/>
+      </w:tblPr>
+      <w:tblGrid>
+        <w:gridCol w:w="792"/>
+        <w:gridCol w:w="1296"/>
+        <w:gridCol w:w="2376"/>
+        <w:gridCol w:w="2909"/>
+        <w:gridCol w:w="2909"/>
+      </w:tblGrid>
+      <w:tr>
+        <w:trPr>
+          <w:tblHeader/>
+        </w:trPr>
+        <w:tc>
+          <w:tcPr>
+            <w:tcW w:type="dxa" w:w="792"/>
+            <w:vAlign w:val="center"/>
+            <w:tcBorders>
+              <w:top w:val="single" w:sz="4" w:color="D9D9D9"/>
+              <w:left w:val="single" w:sz="4" w:color="D9D9D9"/>
+              <w:bottom w:val="single" w:sz="4" w:color="D9D9D9"/>
+              <w:right w:val="single" w:sz="4" w:color="D9D9D9"/>
+            </w:tcBorders>
+            <w:shd w:fill="E7E6E6"/>
+            <w:tcMar>
+              <w:top w:w="75" w:type="dxa"/>
+              <w:left w:w="75" w:type="dxa"/>
+              <w:bottom w:w="75" w:type="dxa"/>
+              <w:right w:w="75" w:type="dxa"/>
+            </w:tcMar>
+          </w:tcPr>
+          <w:p>
+            <w:pPr>
+              <w:spacing w:after="20" w:line="240" w:lineRule="auto"/>
+            </w:pPr>
+            <w:r>
+              <w:rPr>
+                <w:b/>
+                <w:color w:val="000000"/>
+                <w:sz w:val="18"/>
+              </w:rPr>
+              <w:t>Cores</w:t>
+            </w:r>
+          </w:p>
+        </w:tc>
+        <w:tc>
+          <w:tcPr>
+            <w:tcW w:type="dxa" w:w="1296"/>
+            <w:vAlign w:val="center"/>
+            <w:tcBorders>
+              <w:top w:val="single" w:sz="4" w:color="D9D9D9"/>
+              <w:left w:val="single" w:sz="4" w:color="D9D9D9"/>
+              <w:bottom w:val="single" w:sz="4" w:color="D9D9D9"/>
+              <w:right w:val="single" w:sz="4" w:color="D9D9D9"/>
+            </w:tcBorders>
+            <w:shd w:fill="E7E6E6"/>
+            <w:tcMar>
+              <w:top w:w="75" w:type="dxa"/>
+              <w:left w:w="75" w:type="dxa"/>
+              <w:bottom w:w="75" w:type="dxa"/>
+              <w:right w:w="75" w:type="dxa"/>
+            </w:tcMar>
+          </w:tcPr>
+          <w:p>
+            <w:pPr>
+              <w:spacing w:after="20" w:line="240" w:lineRule="auto"/>
+            </w:pPr>
+            <w:r>
+              <w:rPr>
+                <w:b/>
+                <w:color w:val="000000"/>
+                <w:sz w:val="18"/>
+              </w:rPr>
+              <w:t>Board MHz</w:t>
+            </w:r>
+          </w:p>
+        </w:tc>
+        <w:tc>
+          <w:tcPr>
+            <w:tcW w:type="dxa" w:w="2376"/>
+            <w:vAlign w:val="center"/>
+            <w:tcBorders>
+              <w:top w:val="single" w:sz="4" w:color="D9D9D9"/>
+              <w:left w:val="single" w:sz="4" w:color="D9D9D9"/>
+              <w:bottom w:val="single" w:sz="4" w:color="D9D9D9"/>
+              <w:right w:val="single" w:sz="4" w:color="D9D9D9"/>
+            </w:tcBorders>
+            <w:shd w:fill="E7E6E6"/>
+            <w:tcMar>
+              <w:top w:w="75" w:type="dxa"/>
+              <w:left w:w="75" w:type="dxa"/>
+              <w:bottom w:w="75" w:type="dxa"/>
+              <w:right w:w="75" w:type="dxa"/>
+            </w:tcMar>
+          </w:tcPr>
+          <w:p>
+            <w:pPr>
+              <w:spacing w:after="20" w:line="240" w:lineRule="auto"/>
+            </w:pPr>
+            <w:r>
+              <w:rPr>
+                <w:b/>
+                <w:color w:val="000000"/>
+                <w:sz w:val="18"/>
+              </w:rPr>
+              <w:t>Setup / hold ns</w:t>
+            </w:r>
+          </w:p>
+        </w:tc>
+        <w:tc>
+          <w:tcPr>
+            <w:tcW w:type="dxa" w:w="2909"/>
+            <w:vAlign w:val="center"/>
+            <w:tcBorders>
+              <w:top w:val="single" w:sz="4" w:color="D9D9D9"/>
+              <w:left w:val="single" w:sz="4" w:color="D9D9D9"/>
+              <w:bottom w:val="single" w:sz="4" w:color="D9D9D9"/>
+              <w:right w:val="single" w:sz="4" w:color="D9D9D9"/>
+            </w:tcBorders>
+            <w:shd w:fill="E7E6E6"/>
+            <w:tcMar>
+              <w:top w:w="75" w:type="dxa"/>
+              <w:left w:w="75" w:type="dxa"/>
+              <w:bottom w:w="75" w:type="dxa"/>
+              <w:right w:w="75" w:type="dxa"/>
+            </w:tcMar>
+          </w:tcPr>
+          <w:p>
+            <w:pPr>
+              <w:spacing w:after="20" w:line="240" w:lineRule="auto"/>
+            </w:pPr>
+            <w:r>
+              <w:rPr>
+                <w:b/>
+                <w:color w:val="000000"/>
+                <w:sz w:val="18"/>
+              </w:rPr>
+              <w:t>Encrypt cycles / us</w:t>
+            </w:r>
+          </w:p>
+        </w:tc>
+        <w:tc>
+          <w:tcPr>
+            <w:tcW w:type="dxa" w:w="2909"/>
+            <w:vAlign w:val="center"/>
+            <w:tcBorders>
+              <w:top w:val="single" w:sz="4" w:color="D9D9D9"/>
+              <w:left w:val="single" w:sz="4" w:color="D9D9D9"/>
+              <w:bottom w:val="single" w:sz="4" w:color="D9D9D9"/>
+              <w:right w:val="single" w:sz="4" w:color="D9D9D9"/>
+            </w:tcBorders>
+            <w:shd w:fill="E7E6E6"/>
+            <w:tcMar>
+              <w:top w:w="75" w:type="dxa"/>
+              <w:left w:w="75" w:type="dxa"/>
+              <w:bottom w:w="75" w:type="dxa"/>
+              <w:right w:w="75" w:type="dxa"/>
+            </w:tcMar>
+          </w:tcPr>
+          <w:p>
+            <w:pPr>
+              <w:spacing w:after="20" w:line="240" w:lineRule="auto"/>
+            </w:pPr>
+            <w:r>
+              <w:rPr>
+                <w:b/>
+                <w:color w:val="000000"/>
+                <w:sz w:val="18"/>
+              </w:rPr>
+              <w:t>Decrypt cycles / us</w:t>
+            </w:r>
+          </w:p>
+        </w:tc>
+      </w:tr>
+      <w:tr>
+        <w:tc>
+          <w:tcPr>
+            <w:tcW w:type="dxa" w:w="792"/>
+            <w:vAlign w:val="center"/>
+            <w:tcBorders>
+              <w:top w:val="single" w:sz="4" w:color="D9D9D9"/>
+              <w:left w:val="single" w:sz="4" w:color="D9D9D9"/>
+              <w:bottom w:val="single" w:sz="4" w:color="D9D9D9"/>
+              <w:right w:val="single" w:sz="4" w:color="D9D9D9"/>
+            </w:tcBorders>
+            <w:shd w:fill="FFFFFF"/>
+            <w:tcMar>
+              <w:top w:w="75" w:type="dxa"/>
+              <w:left w:w="75" w:type="dxa"/>
+              <w:bottom w:w="75" w:type="dxa"/>
+              <w:right w:w="75" w:type="dxa"/>
+            </w:tcMar>
+          </w:tcPr>
+          <w:p>
+            <w:pPr>
+              <w:spacing w:after="20" w:line="240" w:lineRule="auto"/>
+            </w:pPr>
+            <w:r>
+              <w:rPr>
+                <w:b w:val="0"/>
+                <w:color w:val="000000"/>
+                <w:sz w:val="18"/>
+              </w:rPr>
+              <w:t>1</w:t>
+            </w:r>
+          </w:p>
+        </w:tc>
+        <w:tc>
+          <w:tcPr>
+            <w:tcW w:type="dxa" w:w="1296"/>
+            <w:vAlign w:val="center"/>
+            <w:tcBorders>
+              <w:top w:val="single" w:sz="4" w:color="D9D9D9"/>
+              <w:left w:val="single" w:sz="4" w:color="D9D9D9"/>
+              <w:bottom w:val="single" w:sz="4" w:color="D9D9D9"/>
+              <w:right w:val="single" w:sz="4" w:color="D9D9D9"/>
+            </w:tcBorders>
+            <w:shd w:fill="FFFFFF"/>
+            <w:tcMar>
+              <w:top w:w="75" w:type="dxa"/>
+              <w:left w:w="75" w:type="dxa"/>
+              <w:bottom w:w="75" w:type="dxa"/>
+              <w:right w:w="75" w:type="dxa"/>
+            </w:tcMar>
+          </w:tcPr>
+          <w:p>
+            <w:pPr>
+              <w:spacing w:after="20" w:line="240" w:lineRule="auto"/>
+            </w:pPr>
+            <w:r>
+              <w:rPr>
+                <w:b w:val="0"/>
+                <w:color w:val="000000"/>
+                <w:sz w:val="18"/>
+              </w:rPr>
+              <w:t>90</w:t>
+            </w:r>
+          </w:p>
+        </w:tc>
+        <w:tc>
+          <w:tcPr>
+            <w:tcW w:type="dxa" w:w="2376"/>
+            <w:vAlign w:val="center"/>
+            <w:tcBorders>
+              <w:top w:val="single" w:sz="4" w:color="D9D9D9"/>
+              <w:left w:val="single" w:sz="4" w:color="D9D9D9"/>
+              <w:bottom w:val="single" w:sz="4" w:color="D9D9D9"/>
+              <w:right w:val="single" w:sz="4" w:color="D9D9D9"/>
+            </w:tcBorders>
+            <w:shd w:fill="FFFFFF"/>
+            <w:tcMar>
+              <w:top w:w="75" w:type="dxa"/>
+              <w:left w:w="75" w:type="dxa"/>
+              <w:bottom w:w="75" w:type="dxa"/>
+              <w:right w:w="75" w:type="dxa"/>
+            </w:tcMar>
+          </w:tcPr>
+          <w:p>
+            <w:pPr>
+              <w:spacing w:after="20" w:line="240" w:lineRule="auto"/>
+            </w:pPr>
+            <w:r>
+              <w:rPr>
+                <w:b w:val="0"/>
+                <w:color w:val="000000"/>
+                <w:sz w:val="18"/>
+              </w:rPr>
+              <w:t>+0.963 / +0.038</w:t>
+            </w:r>
+          </w:p>
+        </w:tc>
+        <w:tc>
+          <w:tcPr>
+            <w:tcW w:type="dxa" w:w="2909"/>
+            <w:vAlign w:val="center"/>
+            <w:tcBorders>
+              <w:top w:val="single" w:sz="4" w:color="D9D9D9"/>
+              <w:left w:val="single" w:sz="4" w:color="D9D9D9"/>
+              <w:bottom w:val="single" w:sz="4" w:color="D9D9D9"/>
+              <w:right w:val="single" w:sz="4" w:color="D9D9D9"/>
+            </w:tcBorders>
+            <w:shd w:fill="FFFFFF"/>
+            <w:tcMar>
+              <w:top w:w="75" w:type="dxa"/>
+              <w:left w:w="75" w:type="dxa"/>
+              <w:bottom w:w="75" w:type="dxa"/>
+              <w:right w:w="75" w:type="dxa"/>
+            </w:tcMar>
+          </w:tcPr>
+          <w:p>
+            <w:pPr>
+              <w:spacing w:after="20" w:line="240" w:lineRule="auto"/>
+            </w:pPr>
+            <w:r>
+              <w:rPr>
+                <w:b w:val="0"/>
+                <w:color w:val="000000"/>
+                <w:sz w:val="18"/>
+              </w:rPr>
+              <w:t>1,021 / 11.344</w:t>
+            </w:r>
+          </w:p>
+        </w:tc>
+        <w:tc>
+          <w:tcPr>
+            <w:tcW w:type="dxa" w:w="2909"/>
+            <w:vAlign w:val="center"/>
+            <w:tcBorders>
+              <w:top w:val="single" w:sz="4" w:color="D9D9D9"/>
+              <w:left w:val="single" w:sz="4" w:color="D9D9D9"/>
+              <w:bottom w:val="single" w:sz="4" w:color="D9D9D9"/>
+              <w:right w:val="single" w:sz="4" w:color="D9D9D9"/>
+            </w:tcBorders>
+            <w:shd w:fill="FFFFFF"/>
+            <w:tcMar>
+              <w:top w:w="75" w:type="dxa"/>
+              <w:left w:w="75" w:type="dxa"/>
+              <w:bottom w:w="75" w:type="dxa"/>
+              <w:right w:w="75" w:type="dxa"/>
+            </w:tcMar>
+          </w:tcPr>
+          <w:p>
+            <w:pPr>
+              <w:spacing w:after="20" w:line="240" w:lineRule="auto"/>
+            </w:pPr>
+            <w:r>
+              <w:rPr>
+                <w:b w:val="0"/>
+                <w:color w:val="000000"/>
+                <w:sz w:val="18"/>
+              </w:rPr>
+              <w:t>1,009 / 11.211</w:t>
+            </w:r>
+          </w:p>
+        </w:tc>
+      </w:tr>
+      <w:tr>
+        <w:tc>
+          <w:tcPr>
+            <w:tcW w:type="dxa" w:w="792"/>
+            <w:vAlign w:val="center"/>
+            <w:tcBorders>
+              <w:top w:val="single" w:sz="4" w:color="D9D9D9"/>
+              <w:left w:val="single" w:sz="4" w:color="D9D9D9"/>
+              <w:bottom w:val="single" w:sz="4" w:color="D9D9D9"/>
+              <w:right w:val="single" w:sz="4" w:color="D9D9D9"/>
+            </w:tcBorders>
+            <w:shd w:fill="F5F5F5"/>
+            <w:tcMar>
+              <w:top w:w="75" w:type="dxa"/>
+              <w:left w:w="75" w:type="dxa"/>
+              <w:bottom w:w="75" w:type="dxa"/>
+              <w:right w:w="75" w:type="dxa"/>
+            </w:tcMar>
+          </w:tcPr>
+          <w:p>
+            <w:pPr>
+              <w:spacing w:after="20" w:line="240" w:lineRule="auto"/>
+            </w:pPr>
+            <w:r>
+              <w:rPr>
+                <w:b w:val="0"/>
+                <w:color w:val="000000"/>
+                <w:sz w:val="18"/>
+              </w:rPr>
+              <w:t>2</w:t>
+            </w:r>
+          </w:p>
+        </w:tc>
+        <w:tc>
+          <w:tcPr>
+            <w:tcW w:type="dxa" w:w="1296"/>
+            <w:vAlign w:val="center"/>
+            <w:tcBorders>
+              <w:top w:val="single" w:sz="4" w:color="D9D9D9"/>
+              <w:left w:val="single" w:sz="4" w:color="D9D9D9"/>
+              <w:bottom w:val="single" w:sz="4" w:color="D9D9D9"/>
+              <w:right w:val="single" w:sz="4" w:color="D9D9D9"/>
+            </w:tcBorders>
+            <w:shd w:fill="F5F5F5"/>
+            <w:tcMar>
+              <w:top w:w="75" w:type="dxa"/>
+              <w:left w:w="75" w:type="dxa"/>
+              <w:bottom w:w="75" w:type="dxa"/>
+              <w:right w:w="75" w:type="dxa"/>
+            </w:tcMar>
+          </w:tcPr>
+          <w:p>
+            <w:pPr>
+              <w:spacing w:after="20" w:line="240" w:lineRule="auto"/>
+            </w:pPr>
+            <w:r>
+              <w:rPr>
+                <w:b w:val="0"/>
+                <w:color w:val="000000"/>
+                <w:sz w:val="18"/>
+              </w:rPr>
+              <w:t>90</w:t>
+            </w:r>
+          </w:p>
+        </w:tc>
+        <w:tc>
+          <w:tcPr>
+            <w:tcW w:type="dxa" w:w="2376"/>
+            <w:vAlign w:val="center"/>
+            <w:tcBorders>
+              <w:top w:val="single" w:sz="4" w:color="D9D9D9"/>
+              <w:left w:val="single" w:sz="4" w:color="D9D9D9"/>
+              <w:bottom w:val="single" w:sz="4" w:color="D9D9D9"/>
+              <w:right w:val="single" w:sz="4" w:color="D9D9D9"/>
+            </w:tcBorders>
+            <w:shd w:fill="F5F5F5"/>
+            <w:tcMar>
+              <w:top w:w="75" w:type="dxa"/>
+              <w:left w:w="75" w:type="dxa"/>
+              <w:bottom w:w="75" w:type="dxa"/>
+              <w:right w:w="75" w:type="dxa"/>
+            </w:tcMar>
+          </w:tcPr>
+          <w:p>
+            <w:pPr>
+              <w:spacing w:after="20" w:line="240" w:lineRule="auto"/>
+            </w:pPr>
+            <w:r>
+              <w:rPr>
+                <w:b w:val="0"/>
+                <w:color w:val="000000"/>
+                <w:sz w:val="18"/>
+              </w:rPr>
+              <w:t>+0.776 / +0.032</w:t>
+            </w:r>
+          </w:p>
+        </w:tc>
+        <w:tc>
+          <w:tcPr>
+            <w:tcW w:type="dxa" w:w="2909"/>
+            <w:vAlign w:val="center"/>
+            <w:tcBorders>
+              <w:top w:val="single" w:sz="4" w:color="D9D9D9"/>
+              <w:left w:val="single" w:sz="4" w:color="D9D9D9"/>
+              <w:bottom w:val="single" w:sz="4" w:color="D9D9D9"/>
+              <w:right w:val="single" w:sz="4" w:color="D9D9D9"/>
+            </w:tcBorders>
+            <w:shd w:fill="F5F5F5"/>
+            <w:tcMar>
+              <w:top w:w="75" w:type="dxa"/>
+              <w:left w:w="75" w:type="dxa"/>
+              <w:bottom w:w="75" w:type="dxa"/>
+              <w:right w:w="75" w:type="dxa"/>
+            </w:tcMar>
+          </w:tcPr>
+          <w:p>
+            <w:pPr>
+              <w:spacing w:after="20" w:line="240" w:lineRule="auto"/>
+            </w:pPr>
+            <w:r>
+              <w:rPr>
+                <w:b w:val="0"/>
+                <w:color w:val="000000"/>
+                <w:sz w:val="18"/>
+              </w:rPr>
+              <w:t>511 / 5.678</w:t>
+            </w:r>
+          </w:p>
+        </w:tc>
+        <w:tc>
+          <w:tcPr>
+            <w:tcW w:type="dxa" w:w="2909"/>
+            <w:vAlign w:val="center"/>
+            <w:tcBorders>
+              <w:top w:val="single" w:sz="4" w:color="D9D9D9"/>
+              <w:left w:val="single" w:sz="4" w:color="D9D9D9"/>
+              <w:bottom w:val="single" w:sz="4" w:color="D9D9D9"/>
+              <w:right w:val="single" w:sz="4" w:color="D9D9D9"/>
+            </w:tcBorders>
+            <w:shd w:fill="F5F5F5"/>
+            <w:tcMar>
+              <w:top w:w="75" w:type="dxa"/>
+              <w:left w:w="75" w:type="dxa"/>
+              <w:bottom w:w="75" w:type="dxa"/>
+              <w:right w:w="75" w:type="dxa"/>
+            </w:tcMar>
+          </w:tcPr>
+          <w:p>
+            <w:pPr>
+              <w:spacing w:after="20" w:line="240" w:lineRule="auto"/>
+            </w:pPr>
+            <w:r>
+              <w:rPr>
+                <w:b w:val="0"/>
+                <w:color w:val="000000"/>
+                <w:sz w:val="18"/>
+              </w:rPr>
+              <w:t>505 / 5.611</w:t>
+            </w:r>
+          </w:p>
+        </w:tc>
+      </w:tr>
+      <w:tr>
+        <w:tc>
+          <w:tcPr>
+            <w:tcW w:type="dxa" w:w="792"/>
+            <w:vAlign w:val="center"/>
+            <w:tcBorders>
+              <w:top w:val="single" w:sz="4" w:color="D9D9D9"/>
+              <w:left w:val="single" w:sz="4" w:color="D9D9D9"/>
+              <w:bottom w:val="single" w:sz="4" w:color="D9D9D9"/>
+              <w:right w:val="single" w:sz="4" w:color="D9D9D9"/>
+            </w:tcBorders>
+            <w:shd w:fill="FFFFFF"/>
+            <w:tcMar>
+              <w:top w:w="75" w:type="dxa"/>
+              <w:left w:w="75" w:type="dxa"/>
+              <w:bottom w:w="75" w:type="dxa"/>
+              <w:right w:w="75" w:type="dxa"/>
+            </w:tcMar>
+          </w:tcPr>
+          <w:p>
+            <w:pPr>
+              <w:spacing w:after="20" w:line="240" w:lineRule="auto"/>
+            </w:pPr>
+            <w:r>
+              <w:rPr>
+                <w:b w:val="0"/>
+                <w:color w:val="000000"/>
+                <w:sz w:val="18"/>
+              </w:rPr>
+              <w:t>4</w:t>
+            </w:r>
+          </w:p>
+        </w:tc>
+        <w:tc>
+          <w:tcPr>
+            <w:tcW w:type="dxa" w:w="1296"/>
+            <w:vAlign w:val="center"/>
+            <w:tcBorders>
+              <w:top w:val="single" w:sz="4" w:color="D9D9D9"/>
+              <w:left w:val="single" w:sz="4" w:color="D9D9D9"/>
+              <w:bottom w:val="single" w:sz="4" w:color="D9D9D9"/>
+              <w:right w:val="single" w:sz="4" w:color="D9D9D9"/>
+            </w:tcBorders>
+            <w:shd w:fill="FFFFFF"/>
+            <w:tcMar>
+              <w:top w:w="75" w:type="dxa"/>
+              <w:left w:w="75" w:type="dxa"/>
+              <w:bottom w:w="75" w:type="dxa"/>
+              <w:right w:w="75" w:type="dxa"/>
+            </w:tcMar>
+          </w:tcPr>
+          <w:p>
+            <w:pPr>
+              <w:spacing w:after="20" w:line="240" w:lineRule="auto"/>
+            </w:pPr>
+            <w:r>
+              <w:rPr>
+                <w:b w:val="0"/>
+                <w:color w:val="000000"/>
+                <w:sz w:val="18"/>
+              </w:rPr>
+              <w:t>75</w:t>
+            </w:r>
+          </w:p>
+        </w:tc>
+        <w:tc>
+          <w:tcPr>
+            <w:tcW w:type="dxa" w:w="2376"/>
+            <w:vAlign w:val="center"/>
+            <w:tcBorders>
+              <w:top w:val="single" w:sz="4" w:color="D9D9D9"/>
+              <w:left w:val="single" w:sz="4" w:color="D9D9D9"/>
+              <w:bottom w:val="single" w:sz="4" w:color="D9D9D9"/>
+              <w:right w:val="single" w:sz="4" w:color="D9D9D9"/>
+            </w:tcBorders>
+            <w:shd w:fill="FFFFFF"/>
+            <w:tcMar>
+              <w:top w:w="75" w:type="dxa"/>
+              <w:left w:w="75" w:type="dxa"/>
+              <w:bottom w:w="75" w:type="dxa"/>
+              <w:right w:w="75" w:type="dxa"/>
+            </w:tcMar>
+          </w:tcPr>
+          <w:p>
+            <w:pPr>
+              <w:spacing w:after="20" w:line="240" w:lineRule="auto"/>
+            </w:pPr>
+            <w:r>
+              <w:rPr>
+                <w:b w:val="0"/>
+                <w:color w:val="000000"/>
+                <w:sz w:val="18"/>
+              </w:rPr>
+              <w:t>+0.306 / +0.028</w:t>
+            </w:r>
+          </w:p>
+        </w:tc>
+        <w:tc>
+          <w:tcPr>
+            <w:tcW w:type="dxa" w:w="2909"/>
+            <w:vAlign w:val="center"/>
+            <w:tcBorders>
+              <w:top w:val="single" w:sz="4" w:color="D9D9D9"/>
+              <w:left w:val="single" w:sz="4" w:color="D9D9D9"/>
+              <w:bottom w:val="single" w:sz="4" w:color="D9D9D9"/>
+              <w:right w:val="single" w:sz="4" w:color="D9D9D9"/>
+            </w:tcBorders>
+            <w:shd w:fill="FFFFFF"/>
+            <w:tcMar>
+              <w:top w:w="75" w:type="dxa"/>
+              <w:left w:w="75" w:type="dxa"/>
+              <w:bottom w:w="75" w:type="dxa"/>
+              <w:right w:w="75" w:type="dxa"/>
+            </w:tcMar>
+          </w:tcPr>
+          <w:p>
+            <w:pPr>
+              <w:spacing w:after="20" w:line="240" w:lineRule="auto"/>
+            </w:pPr>
+            <w:r>
+              <w:rPr>
+                <w:b w:val="0"/>
+                <w:color w:val="000000"/>
+                <w:sz w:val="18"/>
+              </w:rPr>
+              <w:t>307 / 4.093</w:t>
+            </w:r>
+          </w:p>
+        </w:tc>
+        <w:tc>
+          <w:tcPr>
+            <w:tcW w:type="dxa" w:w="2909"/>
+            <w:vAlign w:val="center"/>
+            <w:tcBorders>
+              <w:top w:val="single" w:sz="4" w:color="D9D9D9"/>
+              <w:left w:val="single" w:sz="4" w:color="D9D9D9"/>
+              <w:bottom w:val="single" w:sz="4" w:color="D9D9D9"/>
+              <w:right w:val="single" w:sz="4" w:color="D9D9D9"/>
+            </w:tcBorders>
+            <w:shd w:fill="FFFFFF"/>
+            <w:tcMar>
+              <w:top w:w="75" w:type="dxa"/>
+              <w:left w:w="75" w:type="dxa"/>
+              <w:bottom w:w="75" w:type="dxa"/>
+              <w:right w:w="75" w:type="dxa"/>
+            </w:tcMar>
+          </w:tcPr>
+          <w:p>
+            <w:pPr>
+              <w:spacing w:after="20" w:line="240" w:lineRule="auto"/>
+            </w:pPr>
+            <w:r>
+              <w:rPr>
+                <w:b w:val="0"/>
+                <w:color w:val="000000"/>
+                <w:sz w:val="18"/>
+              </w:rPr>
+              <w:t>304 / 4.053</w:t>
+            </w:r>
+          </w:p>
+        </w:tc>
+      </w:tr>
+    </w:tbl>
+    <w:p>
+      <w:pPr>
+        <w:spacing w:after="0"/>
+      </w:pPr>
+    </w:p>
+    <w:p>
+      <w:pPr>
+        <w:keepNext w:val="0"/>
+        <w:spacing w:before="40" w:after="80"/>
+        <w:jc w:val="center"/>
+      </w:pPr>
+      <w:r>
+        <w:rPr>
+          <w:sz w:val="17"/>
+        </w:rPr>
+        <w:t>Table XVI. Measured board cycle counters for the 3,072-byte fixture. Times use nominal MMCM frequencies without external calibration. Every configuration passes 10/10 cases twice [20].</w:t>
+      </w:r>
+    </w:p>
+    <w:p>
+      <w:pPr>
+        <w:spacing w:after="60" w:line="245" w:lineRule="auto"/>
+        <w:ind w:firstLine="317"/>
+        <w:jc w:val="both"/>
+      </w:pPr>
+      <w:r>
+        <w:t>The ten cases cover ideal encryption/decryption, input gaps and output stalls in each direction, corrupted final-layer tag, ciphertext tampering, incorrect chunk identity, abort, reset during traffic, and successful decryption after reset. Injected comparator faults were detected in simulation before bitstream generation. Provisional plaintext terminates at the trusted internal checker; only test status is externally visible. Fixture nonces are public repeat-test values, not production encryption nonces.</w:t>
+      </w:r>
+    </w:p>
+    <w:p>
+      <w:pPr>
+        <w:spacing w:after="60" w:line="245" w:lineRule="auto"/>
+        <w:ind w:firstLine="317"/>
+        <w:jc w:val="both"/>
+      </w:pPr>
+      <w:r>
+        <w:t>The final board harness fails 100 MHz for one and two cores and fails 90 MHz for four; it passes at 90, 90 and 75 MHz respectively. Its fixture ROM, checker and debug IP introduce different paths from the integration harness, so the two clock tables must remain separate. Saved physical attempts have zero routing errors, missing clocks, unconstrained internal endpoints, multiple-clock pins and combinational loops. The selected routes pass debug-IP bus-skew constraints. Button and visual LED paths are excluded from external I/O timing; raw warnings are retained. No flash programming, physical full-file transfer, DDR2 measurement or authenticated compute integration is established by these tests.</w:t>
+      </w:r>
+    </w:p>
+    <w:p>
+      <w:pPr>
+        <w:keepNext/>
+        <w:pageBreakBefore/>
+        <w:spacing w:before="100" w:after="40"/>
+      </w:pPr>
+      <w:r>
+        <w:rPr>
+          <w:b/>
+          <w:sz w:val="21"/>
+        </w:rPr>
+        <w:t>XVII. Limitations and next work</w:t>
+      </w:r>
+    </w:p>
+    <w:p>
+      <w:pPr>
+        <w:spacing w:after="60" w:line="245" w:lineRule="auto"/>
+        <w:ind w:firstLine="317"/>
+        <w:jc w:val="both"/>
+      </w:pPr>
+      <w:r>
+        <w:t>This version is an unprotected cryptographic core. It does not prevent power or electromagnetic side-channel analysis, and it does not detect injected faults. Kandi et al. describe threshold and redundancy-based hardware options that could be studied in subsequent work [3]. Sections XIII and XIV measure the implemented unrolling and buffering tradeoff, including folded absorption. End-to-end benefits from memory transport and lossless compression require additional system measurements. Independent lanes are evaluated in Section XVI; the pipeline control experiment is in Section XV. The external quarantine buffer is also a required part of safe decryption, not an optional application feature.</w:t>
+      </w:r>
+    </w:p>
+    <w:p>
+      <w:pPr>
+        <w:keepNext/>
+        <w:spacing w:before="100" w:after="40"/>
+      </w:pPr>
+      <w:r>
+        <w:rPr>
+          <w:b/>
+          <w:sz w:val="21"/>
+        </w:rPr>
+        <w:t>XVIII. Findings</w:t>
       </w:r>
     </w:p>
     <w:p>
@@ -10007,6 +13846,16 @@
       </w:pPr>
       <w:r>
         <w:t>For this adapter, eliminating controller handoffs halves the buffered three-round core's cycle count without removing rounds. The folded core requires 449,581 cycles per direction, matches the reference ciphertext and tag, and reconstructs the complete checkpoint exactly. Its three-clock full-block interval is supported by simulation; its 100 MHz closure is a routed implementation result. Physical full-file transfer, memory bandwidth and authenticated compute integration remain unmeasured. Both the AD empty-terminator defect and legacy decryption tag exposure are fixed in this branch, with focused regressions and negative controls.</w:t>
+      </w:r>
+    </w:p>
+    <w:p>
+      <w:pPr>
+        <w:spacing w:after="60" w:line="245" w:lineRule="auto"/>
+        <w:ind w:firstLine="317"/>
+        <w:jc w:val="both"/>
+      </w:pPr>
+      <w:r>
+        <w:t>The dependent p8 experiment identifies a different bottleneck: controller fixes reduce routed-period-derived block latency from 70.8 to 49.8 ns at the same 12 clocks, while round splitting adds latency. Multicore simulation achieves approximately 2.000 and 3.001 times one-core throughput for two and four cores under ideal service. The later physical tests validate only the 3,072-byte fixture, with board clocks and cycle counts reported separately from full-file simulation and modeled memory bandwidth.</w:t>
       </w:r>
     </w:p>
     <w:p>
@@ -10254,6 +14103,32 @@
           <w:sz w:val="16"/>
         </w:rPr>
         <w:t>[18] W. Hua, M. Umar, Z. Zhang and G. E. Suh, GuardNN Secure Accelerator Architecture for Privacy-Preserving Deep Learning, DAC 2022, doi: 10.1145/3489517.3530439. https://arxiv.org/html/2008.11632v2.</w:t>
+      </w:r>
+    </w:p>
+    <w:p>
+      <w:pPr>
+        <w:spacing w:after="30"/>
+        <w:ind w:left="317" w:hanging="317"/>
+        <w:jc w:val="left"/>
+      </w:pPr>
+      <w:r>
+        <w:rPr>
+          <w:sz w:val="16"/>
+        </w:rPr>
+        <w:t>[19] K. Jones, Dependent p8 pipelining experiment, October 27, 2026. experiments/p8_pipeline/README.md, results/provenance.json, results/sweeps/ and results/sim/. https://github.com/kroix-ovo/ascon-aead128-vhdl/tree/ascon-p8-pipeline/experiments/p8_pipeline</w:t>
+      </w:r>
+    </w:p>
+    <w:p>
+      <w:pPr>
+        <w:spacing w:after="30"/>
+        <w:ind w:left="317" w:hanging="317"/>
+        <w:jc w:val="left"/>
+      </w:pPr>
+      <w:r>
+        <w:rPr>
+          <w:sz w:val="16"/>
+        </w:rPr>
+        <w:t>[20] K. Jones, Folded Ascon multicore study and physical fixture, October 2026. docs/multicore_study.md; docs/evidence/multicore_20261022/; docs/evidence/multicore_board_20261027/. https://github.com/kroix-ovo/ascon-aead128-vhdl/tree/ascon-fold-multicore</w:t>
       </w:r>
     </w:p>
     <w:p>

</xml_diff>